<commit_message>
feat: add user search and retrieval functionality & few fixes
- Implemented user search and retrieval in the backend with new UserService and user.controller.
- Created user routes for searching users and getting user details by ID.
- Added document prefiller and preprocessor for supervision requests.
- Developed autocomplete component for user selection in the frontend.
- Integrated hooks for searching professors and students with debouncing.
- Added delete request functionality with appropriate notifications.
</commit_message>
<xml_diff>
--- a/backend/public/templates/template_tmp.docx
+++ b/backend/public/templates/template_tmp.docx
@@ -1,6 +1,6 @@
 
 <file path=word/document.xml><?xml version="1.0" encoding="utf-8"?>
-<w:document xmlns:wpc="http://schemas.microsoft.com/office/word/2010/wordprocessingCanvas" xmlns:cx="http://schemas.microsoft.com/office/drawing/2014/chartex" xmlns:cx1="http://schemas.microsoft.com/office/drawing/2015/9/8/chartex" xmlns:cx2="http://schemas.microsoft.com/office/drawing/2015/10/21/chartex" xmlns:cx3="http://schemas.microsoft.com/office/drawing/2016/5/9/chartex" xmlns:cx4="http://schemas.microsoft.com/office/drawing/2016/5/10/chartex" xmlns:cx5="http://schemas.microsoft.com/office/drawing/2016/5/11/chartex" xmlns:cx6="http://schemas.microsoft.com/office/drawing/2016/5/12/chartex" xmlns:cx7="http://schemas.microsoft.com/office/drawing/2016/5/13/chartex" xmlns:cx8="http://schemas.microsoft.com/office/drawing/2016/5/14/chartex" xmlns:mc="http://schemas.openxmlformats.org/markup-compatibility/2006" xmlns:aink="http://schemas.microsoft.com/office/drawing/2016/ink" xmlns:am3d="http://schemas.microsoft.com/office/drawing/2017/model3d" xmlns:o="urn:schemas-microsoft-com:office:office" xmlns:oel="http://schemas.microsoft.com/office/2019/extlst" xmlns:r="http://schemas.openxmlformats.org/officeDocument/2006/relationships" xmlns:m="http://schemas.openxmlformats.org/officeDocument/2006/math" xmlns:v="urn:schemas-microsoft-com:vml" xmlns:wp14="http://schemas.microsoft.com/office/word/2010/wordprocessingDrawing" xmlns:wp="http://schemas.openxmlformats.org/drawingml/2006/wordprocessingDrawing" xmlns:w10="urn:schemas-microsoft-com:office:word" xmlns:w="http://schemas.openxmlformats.org/wordprocessingml/2006/main" xmlns:w14="http://schemas.microsoft.com/office/word/2010/wordml" xmlns:w15="http://schemas.microsoft.com/office/word/2012/wordml" xmlns:w16cex="http://schemas.microsoft.com/office/word/2018/wordml/cex" xmlns:w16cid="http://schemas.microsoft.com/office/word/2016/wordml/cid" xmlns:w16="http://schemas.microsoft.com/office/word/2018/wordml" xmlns:w16du="http://schemas.microsoft.com/office/word/2023/wordml/word16du" xmlns:w16sdtdh="http://schemas.microsoft.com/office/word/2020/wordml/sdtdatahash" xmlns:w16sdtfl="http://schemas.microsoft.com/office/word/2024/wordml/sdtformatlock" xmlns:w16se="http://schemas.microsoft.com/office/word/2015/wordml/symex" xmlns:wpg="http://schemas.microsoft.com/office/word/2010/wordprocessingGroup" xmlns:wpi="http://schemas.microsoft.com/office/word/2010/wordprocessingInk" xmlns:wne="http://schemas.microsoft.com/office/word/2006/wordml" xmlns:wps="http://schemas.microsoft.com/office/word/2010/wordprocessingShape" mc:Ignorable="w14 w15 w16se w16cid w16 w16cex w16sdtdh w16sdtfl w16du wp14">
+<w:document xmlns:wpc="http://schemas.microsoft.com/office/word/2010/wordprocessingCanvas" xmlns:cx="http://schemas.microsoft.com/office/drawing/2014/chartex" xmlns:cx1="http://schemas.microsoft.com/office/drawing/2015/9/8/chartex" xmlns:cx2="http://schemas.microsoft.com/office/drawing/2015/10/21/chartex" xmlns:cx3="http://schemas.microsoft.com/office/drawing/2016/5/9/chartex" xmlns:cx4="http://schemas.microsoft.com/office/drawing/2016/5/10/chartex" xmlns:cx5="http://schemas.microsoft.com/office/drawing/2016/5/11/chartex" xmlns:cx6="http://schemas.microsoft.com/office/drawing/2016/5/12/chartex" xmlns:cx7="http://schemas.microsoft.com/office/drawing/2016/5/13/chartex" xmlns:cx8="http://schemas.microsoft.com/office/drawing/2016/5/14/chartex" xmlns:mc="http://schemas.openxmlformats.org/markup-compatibility/2006" xmlns:aink="http://schemas.microsoft.com/office/drawing/2016/ink" xmlns:am3d="http://schemas.microsoft.com/office/drawing/2017/model3d" xmlns:o="urn:schemas-microsoft-com:office:office" xmlns:oel="http://schemas.microsoft.com/office/2019/extlst" xmlns:r="http://schemas.openxmlformats.org/officeDocument/2006/relationships" xmlns:m="http://schemas.openxmlformats.org/officeDocument/2006/math" xmlns:v="urn:schemas-microsoft-com:vml" xmlns:wp14="http://schemas.microsoft.com/office/word/2010/wordprocessingDrawing" xmlns:wp="http://schemas.openxmlformats.org/drawingml/2006/wordprocessingDrawing" xmlns:w10="urn:schemas-microsoft-com:office:word" xmlns:w="http://schemas.openxmlformats.org/wordprocessingml/2006/main" xmlns:w14="http://schemas.microsoft.com/office/word/2010/wordml" xmlns:w15="http://schemas.microsoft.com/office/word/2012/wordml" xmlns:w16cei="http://schemas.microsoft.com/office/word/2026/wordml/cei" xmlns:w16cex="http://schemas.microsoft.com/office/word/2018/wordml/cex" xmlns:w16cid="http://schemas.microsoft.com/office/word/2016/wordml/cid" xmlns:w16="http://schemas.microsoft.com/office/word/2018/wordml" xmlns:w16du="http://schemas.microsoft.com/office/word/2023/wordml/word16du" xmlns:w16sdtdh="http://schemas.microsoft.com/office/word/2020/wordml/sdtdatahash" xmlns:w16sdtfl="http://schemas.microsoft.com/office/word/2024/wordml/sdtformatlock" xmlns:w16se="http://schemas.microsoft.com/office/word/2015/wordml/symex" xmlns:wpg="http://schemas.microsoft.com/office/word/2010/wordprocessingGroup" xmlns:wpi="http://schemas.microsoft.com/office/word/2010/wordprocessingInk" xmlns:wne="http://schemas.microsoft.com/office/word/2006/wordml" xmlns:wps="http://schemas.microsoft.com/office/word/2010/wordprocessingShape" mc:Ignorable="w14 w15 w16se w16cid w16 w16cex w16sdtdh w16sdtfl w16du wp14">
   <w:body>
     <w:p>
       <w:pPr>
@@ -23,7 +23,7 @@
           <w:szCs w:val="28"/>
           <w:rtl/>
         </w:rPr>
-        <w:t>طلب تحديد الإشراف على رسالة الماجستير/ الدكتوراه</w:t>
+        <w:t>طلب تحديد الإشراف على رسالة الماجستير</w:t>
       </w:r>
     </w:p>
     <w:p>
@@ -68,16 +68,7 @@
           <w:szCs w:val="28"/>
           <w:rtl/>
         </w:rPr>
-        <w:t xml:space="preserve">                                        </w:t>
-      </w:r>
-      <w:r>
-        <w:rPr>
-          <w:b/>
-          <w:bCs/>
-          <w:sz w:val="28"/>
-          <w:szCs w:val="28"/>
-        </w:rPr>
-        <w:t xml:space="preserve">  </w:t>
+        <w:t xml:space="preserve"> </w:t>
       </w:r>
     </w:p>
     <w:p>
@@ -95,6 +86,227 @@
         </w:rPr>
       </w:pPr>
     </w:p>
+    <w:tbl>
+      <w:tblPr>
+        <w:bidiVisual/>
+        <w:tblW w:w="0" w:type="auto"/>
+        <w:tblInd w:w="-597" w:type="dxa"/>
+        <w:tblBorders>
+          <w:top w:val="single" w:sz="4" w:space="0" w:color="auto"/>
+          <w:left w:val="single" w:sz="4" w:space="0" w:color="auto"/>
+          <w:bottom w:val="single" w:sz="4" w:space="0" w:color="auto"/>
+          <w:right w:val="single" w:sz="4" w:space="0" w:color="auto"/>
+          <w:insideH w:val="single" w:sz="4" w:space="0" w:color="auto"/>
+          <w:insideV w:val="single" w:sz="4" w:space="0" w:color="auto"/>
+        </w:tblBorders>
+        <w:tblLook w:val="04A0" w:firstRow="1" w:lastRow="0" w:firstColumn="1" w:lastColumn="0" w:noHBand="0" w:noVBand="1"/>
+      </w:tblPr>
+      <w:tblGrid>
+        <w:gridCol w:w="1958"/>
+        <w:gridCol w:w="709"/>
+        <w:gridCol w:w="5728"/>
+        <w:gridCol w:w="720"/>
+      </w:tblGrid>
+      <w:tr>
+        <w:trPr>
+          <w:trHeight w:val="20"/>
+        </w:trPr>
+        <w:tc>
+          <w:tcPr>
+            <w:tcW w:w="1958" w:type="dxa"/>
+            <w:tcBorders>
+              <w:top w:val="nil"/>
+              <w:left w:val="nil"/>
+              <w:bottom w:val="nil"/>
+              <w:right w:val="single" w:sz="4" w:space="0" w:color="auto"/>
+            </w:tcBorders>
+          </w:tcPr>
+          <w:p>
+            <w:pPr>
+              <w:bidi/>
+              <w:ind w:right="-709"/>
+              <w:rPr>
+                <w:rFonts w:ascii="Simplified Arabic" w:hAnsi="Simplified Arabic" w:cs="Simplified Arabic"/>
+                <w:b/>
+                <w:bCs/>
+                <w:sz w:val="26"/>
+                <w:szCs w:val="26"/>
+                <w:rtl/>
+                <w:lang w:bidi="ar-EG"/>
+              </w:rPr>
+            </w:pPr>
+            <w:r>
+              <w:rPr>
+                <w:rFonts w:ascii="Simplified Arabic" w:hAnsi="Simplified Arabic" w:cs="Simplified Arabic"/>
+                <w:b/>
+                <w:bCs/>
+                <w:sz w:val="26"/>
+                <w:szCs w:val="26"/>
+                <w:rtl/>
+                <w:lang w:bidi="ar-EG"/>
+              </w:rPr>
+              <w:t>طلب إشراف جديد</w:t>
+            </w:r>
+            <w:r>
+              <w:rPr>
+                <w:rFonts w:ascii="Simplified Arabic" w:hAnsi="Simplified Arabic" w:cs="Simplified Arabic"/>
+                <w:b/>
+                <w:bCs/>
+                <w:sz w:val="26"/>
+                <w:szCs w:val="26"/>
+                <w:rtl/>
+                <w:lang w:bidi="ar-EG"/>
+              </w:rPr>
+              <w:t>:</w:t>
+            </w:r>
+          </w:p>
+        </w:tc>
+        <w:tc>
+          <w:tcPr>
+            <w:tcW w:w="709" w:type="dxa"/>
+            <w:tcBorders>
+              <w:left w:val="single" w:sz="4" w:space="0" w:color="auto"/>
+              <w:right w:val="single" w:sz="4" w:space="0" w:color="auto"/>
+            </w:tcBorders>
+          </w:tcPr>
+          <w:p>
+            <w:pPr>
+              <w:bidi/>
+              <w:ind w:right="-709"/>
+              <w:rPr>
+                <w:rFonts w:ascii="Simplified Arabic" w:hAnsi="Simplified Arabic" w:cs="Simplified Arabic"/>
+                <w:b/>
+                <w:bCs/>
+                <w:sz w:val="32"/>
+                <w:szCs w:val="32"/>
+                <w:lang w:bidi="ar-EG"/>
+              </w:rPr>
+            </w:pPr>
+          </w:p>
+        </w:tc>
+        <w:tc>
+          <w:tcPr>
+            <w:tcW w:w="5728" w:type="dxa"/>
+            <w:tcBorders>
+              <w:top w:val="nil"/>
+              <w:left w:val="single" w:sz="4" w:space="0" w:color="auto"/>
+              <w:bottom w:val="nil"/>
+              <w:right w:val="single" w:sz="4" w:space="0" w:color="auto"/>
+            </w:tcBorders>
+          </w:tcPr>
+          <w:p>
+            <w:pPr>
+              <w:bidi/>
+              <w:ind w:right="-709"/>
+              <w:rPr>
+                <w:rFonts w:ascii="Simplified Arabic" w:hAnsi="Simplified Arabic" w:cs="Simplified Arabic"/>
+                <w:b/>
+                <w:bCs/>
+                <w:sz w:val="26"/>
+                <w:szCs w:val="26"/>
+                <w:rtl/>
+                <w:lang w:bidi="ar-EG"/>
+              </w:rPr>
+            </w:pPr>
+            <w:r>
+              <w:rPr>
+                <w:rFonts w:ascii="Simplified Arabic" w:hAnsi="Simplified Arabic" w:cs="Simplified Arabic"/>
+                <w:sz w:val="26"/>
+                <w:szCs w:val="26"/>
+                <w:rtl/>
+                <w:lang w:bidi="ar-EG"/>
+              </w:rPr>
+              <w:t xml:space="preserve">  </w:t>
+            </w:r>
+            <w:r>
+              <w:rPr>
+                <w:rFonts w:ascii="Simplified Arabic" w:hAnsi="Simplified Arabic" w:cs="Simplified Arabic"/>
+                <w:sz w:val="26"/>
+                <w:szCs w:val="26"/>
+                <w:rtl/>
+                <w:lang w:bidi="ar-EG"/>
+              </w:rPr>
+              <w:t xml:space="preserve">                          </w:t>
+            </w:r>
+            <w:r>
+              <w:rPr>
+                <w:rFonts w:ascii="Simplified Arabic" w:hAnsi="Simplified Arabic" w:cs="Simplified Arabic"/>
+                <w:sz w:val="26"/>
+                <w:szCs w:val="26"/>
+                <w:rtl/>
+                <w:lang w:bidi="ar-EG"/>
+              </w:rPr>
+              <w:t xml:space="preserve"> </w:t>
+            </w:r>
+            <w:r>
+              <w:rPr>
+                <w:rFonts w:ascii="Simplified Arabic" w:hAnsi="Simplified Arabic" w:cs="Simplified Arabic"/>
+                <w:sz w:val="26"/>
+                <w:szCs w:val="26"/>
+                <w:rtl/>
+                <w:lang w:bidi="ar-EG"/>
+              </w:rPr>
+              <w:t xml:space="preserve">         </w:t>
+            </w:r>
+            <w:r>
+              <w:rPr>
+                <w:rFonts w:ascii="Simplified Arabic" w:hAnsi="Simplified Arabic" w:cs="Simplified Arabic"/>
+                <w:sz w:val="26"/>
+                <w:szCs w:val="26"/>
+                <w:rtl/>
+                <w:lang w:bidi="ar-EG"/>
+              </w:rPr>
+              <w:t xml:space="preserve">    </w:t>
+            </w:r>
+            <w:r>
+              <w:rPr>
+                <w:rFonts w:ascii="Simplified Arabic" w:hAnsi="Simplified Arabic" w:cs="Simplified Arabic"/>
+                <w:b/>
+                <w:bCs/>
+                <w:sz w:val="26"/>
+                <w:szCs w:val="26"/>
+                <w:rtl/>
+                <w:lang w:bidi="ar-EG"/>
+              </w:rPr>
+              <w:t>طلب تعديل الإشراف</w:t>
+            </w:r>
+            <w:r>
+              <w:rPr>
+                <w:rFonts w:ascii="Simplified Arabic" w:hAnsi="Simplified Arabic" w:cs="Simplified Arabic"/>
+                <w:b/>
+                <w:bCs/>
+                <w:sz w:val="26"/>
+                <w:szCs w:val="26"/>
+                <w:rtl/>
+                <w:lang w:bidi="ar-EG"/>
+              </w:rPr>
+              <w:t>:</w:t>
+            </w:r>
+          </w:p>
+        </w:tc>
+        <w:tc>
+          <w:tcPr>
+            <w:tcW w:w="720" w:type="dxa"/>
+            <w:tcBorders>
+              <w:left w:val="single" w:sz="4" w:space="0" w:color="auto"/>
+            </w:tcBorders>
+          </w:tcPr>
+          <w:p>
+            <w:pPr>
+              <w:bidi/>
+              <w:ind w:right="-709"/>
+              <w:rPr>
+                <w:rFonts w:ascii="Simplified Arabic" w:hAnsi="Simplified Arabic" w:cs="Simplified Arabic"/>
+                <w:sz w:val="26"/>
+                <w:szCs w:val="26"/>
+                <w:rtl/>
+                <w:lang w:bidi="ar-EG"/>
+              </w:rPr>
+            </w:pPr>
+          </w:p>
+        </w:tc>
+      </w:tr>
+    </w:tbl>
     <w:p>
       <w:pPr>
         <w:bidi/>
@@ -138,7 +350,6 @@
               <w:bottom w:val="nil"/>
               <w:right w:val="single" w:sz="4" w:space="0" w:color="auto"/>
             </w:tcBorders>
-            <w:shd w:val="clear" w:color="auto" w:fill="auto"/>
           </w:tcPr>
           <w:p>
             <w:pPr>
@@ -175,7 +386,6 @@
               <w:left w:val="single" w:sz="4" w:space="0" w:color="auto"/>
               <w:right w:val="single" w:sz="4" w:space="0" w:color="auto"/>
             </w:tcBorders>
-            <w:shd w:val="clear" w:color="auto" w:fill="auto"/>
           </w:tcPr>
           <w:p>
             <w:pPr>
@@ -189,53 +399,6 @@
                 <w:lang w:bidi="ar-EG"/>
               </w:rPr>
             </w:pPr>
-            <w:r>
-              <w:rPr>
-                <w:rFonts w:ascii="Simplified Arabic" w:hAnsi="Simplified Arabic" w:cs="Simplified Arabic"/>
-                <w:sz w:val="26"/>
-                <w:szCs w:val="26"/>
-                <w:lang w:bidi="ar-EG"/>
-              </w:rPr>
-              <w:t>{</w:t>
-            </w:r>
-            <w:proofErr w:type="spellStart"/>
-            <w:r>
-              <w:rPr>
-                <w:rFonts w:ascii="Simplified Arabic" w:hAnsi="Simplified Arabic" w:cs="Simplified Arabic"/>
-                <w:sz w:val="26"/>
-                <w:szCs w:val="26"/>
-                <w:lang w:bidi="ar-EG"/>
-              </w:rPr>
-              <w:t>student</w:t>
-            </w:r>
-            <w:r>
-              <w:rPr>
-                <w:rFonts w:ascii="Simplified Arabic" w:hAnsi="Simplified Arabic" w:cs="Simplified Arabic"/>
-                <w:sz w:val="26"/>
-                <w:szCs w:val="26"/>
-                <w:lang w:bidi="ar-EG"/>
-              </w:rPr>
-              <w:t>N</w:t>
-            </w:r>
-            <w:r>
-              <w:rPr>
-                <w:rFonts w:ascii="Simplified Arabic" w:hAnsi="Simplified Arabic" w:cs="Simplified Arabic"/>
-                <w:sz w:val="26"/>
-                <w:szCs w:val="26"/>
-                <w:lang w:bidi="ar-EG"/>
-              </w:rPr>
-              <w:t>ame</w:t>
-            </w:r>
-            <w:proofErr w:type="spellEnd"/>
-            <w:r>
-              <w:rPr>
-                <w:rFonts w:ascii="Simplified Arabic" w:hAnsi="Simplified Arabic" w:cs="Simplified Arabic"/>
-                <w:sz w:val="26"/>
-                <w:szCs w:val="26"/>
-                <w:lang w:bidi="ar-EG"/>
-              </w:rPr>
-              <w:t>}</w:t>
-            </w:r>
           </w:p>
         </w:tc>
       </w:tr>
@@ -268,12 +431,12 @@
         <w:tblLook w:val="04A0" w:firstRow="1" w:lastRow="0" w:firstColumn="1" w:lastColumn="0" w:noHBand="0" w:noVBand="1"/>
       </w:tblPr>
       <w:tblGrid>
-        <w:gridCol w:w="1278"/>
-        <w:gridCol w:w="1726"/>
-        <w:gridCol w:w="2379"/>
-        <w:gridCol w:w="1002"/>
-        <w:gridCol w:w="2087"/>
-        <w:gridCol w:w="1425"/>
+        <w:gridCol w:w="1345"/>
+        <w:gridCol w:w="1747"/>
+        <w:gridCol w:w="2513"/>
+        <w:gridCol w:w="630"/>
+        <w:gridCol w:w="2160"/>
+        <w:gridCol w:w="1502"/>
       </w:tblGrid>
       <w:tr>
         <w:trPr>
@@ -288,7 +451,6 @@
               <w:bottom w:val="nil"/>
               <w:right w:val="single" w:sz="4" w:space="0" w:color="auto"/>
             </w:tcBorders>
-            <w:shd w:val="clear" w:color="auto" w:fill="auto"/>
           </w:tcPr>
           <w:p>
             <w:pPr>
@@ -325,7 +487,6 @@
               <w:left w:val="single" w:sz="4" w:space="0" w:color="auto"/>
               <w:right w:val="single" w:sz="4" w:space="0" w:color="auto"/>
             </w:tcBorders>
-            <w:shd w:val="clear" w:color="auto" w:fill="auto"/>
           </w:tcPr>
           <w:p>
             <w:pPr>
@@ -337,59 +498,10 @@
                 <w:bCs/>
                 <w:sz w:val="26"/>
                 <w:szCs w:val="26"/>
+                <w:rtl/>
                 <w:lang w:bidi="ar-EG"/>
               </w:rPr>
             </w:pPr>
-            <w:r>
-              <w:rPr>
-                <w:rFonts w:ascii="Simplified Arabic" w:hAnsi="Simplified Arabic" w:cs="Simplified Arabic"/>
-                <w:b/>
-                <w:bCs/>
-                <w:sz w:val="26"/>
-                <w:szCs w:val="26"/>
-                <w:lang w:bidi="ar-EG"/>
-              </w:rPr>
-              <w:t>{</w:t>
-            </w:r>
-            <w:proofErr w:type="spellStart"/>
-            <w:r>
-              <w:rPr>
-                <w:rFonts w:ascii="Simplified Arabic" w:hAnsi="Simplified Arabic" w:cs="Simplified Arabic"/>
-                <w:b/>
-                <w:bCs/>
-                <w:sz w:val="26"/>
-                <w:szCs w:val="26"/>
-                <w:lang w:bidi="ar-EG"/>
-              </w:rPr>
-              <w:t>registrationDate</w:t>
-            </w:r>
-            <w:proofErr w:type="spellEnd"/>
-          </w:p>
-          <w:p>
-            <w:pPr>
-              <w:bidi/>
-              <w:ind w:right="-709"/>
-              <w:rPr>
-                <w:rFonts w:ascii="Simplified Arabic" w:hAnsi="Simplified Arabic" w:cs="Simplified Arabic"/>
-                <w:b/>
-                <w:bCs/>
-                <w:sz w:val="26"/>
-                <w:szCs w:val="26"/>
-                <w:rtl/>
-                <w:lang w:bidi="ar-EG"/>
-              </w:rPr>
-            </w:pPr>
-            <w:r>
-              <w:rPr>
-                <w:rFonts w:ascii="Simplified Arabic" w:hAnsi="Simplified Arabic" w:cs="Simplified Arabic"/>
-                <w:b/>
-                <w:bCs/>
-                <w:sz w:val="26"/>
-                <w:szCs w:val="26"/>
-                <w:lang w:bidi="ar-EG"/>
-              </w:rPr>
-              <w:t>}</w:t>
-            </w:r>
           </w:p>
         </w:tc>
         <w:tc>
@@ -401,7 +513,6 @@
               <w:bottom w:val="nil"/>
               <w:right w:val="single" w:sz="4" w:space="0" w:color="auto"/>
             </w:tcBorders>
-            <w:shd w:val="clear" w:color="auto" w:fill="auto"/>
           </w:tcPr>
           <w:p>
             <w:pPr>
@@ -449,7 +560,6 @@
               <w:left w:val="single" w:sz="4" w:space="0" w:color="auto"/>
               <w:right w:val="single" w:sz="4" w:space="0" w:color="auto"/>
             </w:tcBorders>
-            <w:shd w:val="clear" w:color="auto" w:fill="auto"/>
           </w:tcPr>
           <w:p>
             <w:pPr>
@@ -461,67 +571,9 @@
                 <w:bCs/>
                 <w:sz w:val="26"/>
                 <w:szCs w:val="26"/>
-                <w:rtl/>
                 <w:lang w:bidi="ar-EG"/>
               </w:rPr>
             </w:pPr>
-            <w:r>
-              <w:rPr>
-                <w:rFonts w:ascii="Simplified Arabic" w:hAnsi="Simplified Arabic" w:cs="Simplified Arabic"/>
-                <w:b/>
-                <w:bCs/>
-                <w:sz w:val="26"/>
-                <w:szCs w:val="26"/>
-                <w:lang w:bidi="ar-EG"/>
-              </w:rPr>
-              <w:t>{</w:t>
-            </w:r>
-            <w:proofErr w:type="spellStart"/>
-            <w:r>
-              <w:rPr>
-                <w:rFonts w:ascii="Simplified Arabic" w:hAnsi="Simplified Arabic" w:cs="Simplified Arabic"/>
-                <w:b/>
-                <w:bCs/>
-                <w:sz w:val="26"/>
-                <w:szCs w:val="26"/>
-                <w:lang w:bidi="ar-EG"/>
-              </w:rPr>
-              <w:t>credit</w:t>
-            </w:r>
-            <w:r>
-              <w:rPr>
-                <w:rFonts w:ascii="Simplified Arabic" w:hAnsi="Simplified Arabic" w:cs="Simplified Arabic"/>
-                <w:b/>
-                <w:bCs/>
-                <w:sz w:val="26"/>
-                <w:szCs w:val="26"/>
-                <w:lang w:bidi="ar-EG"/>
-              </w:rPr>
-              <w:t>H</w:t>
-            </w:r>
-            <w:r>
-              <w:rPr>
-                <w:rFonts w:ascii="Simplified Arabic" w:hAnsi="Simplified Arabic" w:cs="Simplified Arabic"/>
-                <w:b/>
-                <w:bCs/>
-                <w:sz w:val="26"/>
-                <w:szCs w:val="26"/>
-                <w:lang w:bidi="ar-EG"/>
-              </w:rPr>
-              <w:t>ours</w:t>
-            </w:r>
-            <w:proofErr w:type="spellEnd"/>
-            <w:r>
-              <w:rPr>
-                <w:rFonts w:ascii="Simplified Arabic" w:hAnsi="Simplified Arabic" w:cs="Simplified Arabic"/>
-                <w:b/>
-                <w:bCs/>
-                <w:sz w:val="26"/>
-                <w:szCs w:val="26"/>
-                <w:lang w:bidi="ar-EG"/>
-              </w:rPr>
-              <w:t>}</w:t>
-            </w:r>
           </w:p>
         </w:tc>
         <w:tc>
@@ -533,7 +585,6 @@
               <w:bottom w:val="nil"/>
               <w:right w:val="single" w:sz="4" w:space="0" w:color="auto"/>
             </w:tcBorders>
-            <w:shd w:val="clear" w:color="auto" w:fill="auto"/>
           </w:tcPr>
           <w:p>
             <w:pPr>
@@ -640,7 +691,6 @@
             <w:tcBorders>
               <w:left w:val="single" w:sz="4" w:space="0" w:color="auto"/>
             </w:tcBorders>
-            <w:shd w:val="clear" w:color="auto" w:fill="auto"/>
           </w:tcPr>
           <w:p>
             <w:pPr>
@@ -656,41 +706,6 @@
                 <w:lang w:bidi="ar-EG"/>
               </w:rPr>
             </w:pPr>
-            <w:r>
-              <w:rPr>
-                <w:rFonts w:ascii="Simplified Arabic" w:hAnsi="Simplified Arabic" w:cs="Simplified Arabic"/>
-                <w:b/>
-                <w:bCs/>
-                <w:sz w:val="26"/>
-                <w:szCs w:val="26"/>
-                <w:lang w:bidi="ar-EG"/>
-              </w:rPr>
-              <w:t>{</w:t>
-            </w:r>
-            <w:proofErr w:type="spellStart"/>
-            <w:r>
-              <w:rPr>
-                <w:rFonts w:ascii="Simplified Arabic" w:hAnsi="Simplified Arabic" w:cs="Simplified Arabic"/>
-                <w:b/>
-                <w:bCs/>
-                <w:sz w:val="26"/>
-                <w:szCs w:val="26"/>
-                <w:lang w:bidi="ar-EG"/>
-              </w:rPr>
-              <w:t>gpa</w:t>
-            </w:r>
-            <w:proofErr w:type="spellEnd"/>
-            <w:r>
-              <w:rPr>
-                <w:rFonts w:ascii="Simplified Arabic" w:hAnsi="Simplified Arabic" w:cs="Simplified Arabic"/>
-                <w:b/>
-                <w:bCs/>
-                <w:sz w:val="26"/>
-                <w:szCs w:val="26"/>
-                <w:lang w:bidi="ar-EG"/>
-              </w:rPr>
-              <w:t>}</w:t>
-            </w:r>
           </w:p>
         </w:tc>
       </w:tr>
@@ -701,14 +716,2917 @@
         <w:ind w:left="-590"/>
         <w:rPr>
           <w:rFonts w:ascii="Simplified Arabic" w:hAnsi="Simplified Arabic" w:cs="Simplified Arabic"/>
+          <w:rtl/>
           <w:lang w:bidi="ar-EG"/>
         </w:rPr>
       </w:pPr>
+      <w:r>
+        <w:rPr>
+          <w:rFonts w:ascii="Simplified Arabic" w:hAnsi="Simplified Arabic" w:cs="Simplified Arabic" w:hint="cs"/>
+          <w:rtl/>
+          <w:lang w:bidi="ar-EG"/>
+        </w:rPr>
+        <w:t>*</w:t>
+      </w:r>
+      <w:r>
+        <w:rPr>
+          <w:rFonts w:ascii="Simplified Arabic" w:hAnsi="Simplified Arabic" w:cs="Simplified Arabic" w:hint="cs"/>
+          <w:rtl/>
+          <w:lang w:bidi="ar-EG"/>
+        </w:rPr>
+        <w:t xml:space="preserve"> يرفق كشف درجات الطالب من موقع الدراسات العليا</w:t>
+      </w:r>
+    </w:p>
+    <w:tbl>
+      <w:tblPr>
+        <w:bidiVisual/>
+        <w:tblW w:w="9908" w:type="dxa"/>
+        <w:tblInd w:w="-597" w:type="dxa"/>
+        <w:tblLook w:val="04A0" w:firstRow="1" w:lastRow="0" w:firstColumn="1" w:lastColumn="0" w:noHBand="0" w:noVBand="1"/>
+      </w:tblPr>
+      <w:tblGrid>
+        <w:gridCol w:w="115"/>
+        <w:gridCol w:w="1559"/>
+        <w:gridCol w:w="3197"/>
+        <w:gridCol w:w="347"/>
+        <w:gridCol w:w="2054"/>
+        <w:gridCol w:w="2625"/>
+        <w:gridCol w:w="11"/>
+      </w:tblGrid>
+      <w:tr>
+        <w:trPr>
+          <w:trHeight w:val="57"/>
+        </w:trPr>
+        <w:tc>
+          <w:tcPr>
+            <w:tcW w:w="1674" w:type="dxa"/>
+            <w:gridSpan w:val="2"/>
+          </w:tcPr>
+          <w:p>
+            <w:pPr>
+              <w:bidi/>
+              <w:ind w:right="-709"/>
+              <w:rPr>
+                <w:rFonts w:ascii="Simplified Arabic" w:hAnsi="Simplified Arabic" w:cs="Simplified Arabic"/>
+                <w:b/>
+                <w:bCs/>
+                <w:sz w:val="26"/>
+                <w:szCs w:val="26"/>
+                <w:rtl/>
+                <w:lang w:bidi="ar-EG"/>
+              </w:rPr>
+            </w:pPr>
+            <w:r>
+              <w:rPr>
+                <w:rFonts w:ascii="Simplified Arabic" w:hAnsi="Simplified Arabic" w:cs="Simplified Arabic"/>
+                <w:b/>
+                <w:bCs/>
+                <w:sz w:val="26"/>
+                <w:szCs w:val="26"/>
+                <w:rtl/>
+                <w:lang w:bidi="ar-EG"/>
+              </w:rPr>
+              <w:t>أسماء المشرفين</w:t>
+            </w:r>
+            <w:r>
+              <w:rPr>
+                <w:rFonts w:ascii="Simplified Arabic" w:hAnsi="Simplified Arabic" w:cs="Simplified Arabic"/>
+                <w:b/>
+                <w:bCs/>
+                <w:sz w:val="26"/>
+                <w:szCs w:val="26"/>
+                <w:rtl/>
+                <w:lang w:bidi="ar-EG"/>
+              </w:rPr>
+              <w:t>:</w:t>
+            </w:r>
+          </w:p>
+        </w:tc>
+        <w:tc>
+          <w:tcPr>
+            <w:tcW w:w="3197" w:type="dxa"/>
+          </w:tcPr>
+          <w:p>
+            <w:pPr>
+              <w:bidi/>
+              <w:ind w:right="-709"/>
+              <w:rPr>
+                <w:rFonts w:ascii="Simplified Arabic" w:hAnsi="Simplified Arabic" w:cs="Simplified Arabic"/>
+                <w:sz w:val="26"/>
+                <w:szCs w:val="26"/>
+                <w:rtl/>
+                <w:lang w:bidi="ar-EG"/>
+              </w:rPr>
+            </w:pPr>
+          </w:p>
+        </w:tc>
+        <w:tc>
+          <w:tcPr>
+            <w:tcW w:w="2401" w:type="dxa"/>
+            <w:gridSpan w:val="2"/>
+          </w:tcPr>
+          <w:p>
+            <w:pPr>
+              <w:bidi/>
+              <w:ind w:right="-709"/>
+              <w:rPr>
+                <w:rFonts w:ascii="Simplified Arabic" w:hAnsi="Simplified Arabic" w:cs="Simplified Arabic"/>
+                <w:sz w:val="26"/>
+                <w:szCs w:val="26"/>
+                <w:rtl/>
+                <w:lang w:bidi="ar-EG"/>
+              </w:rPr>
+            </w:pPr>
+            <w:r>
+              <w:rPr>
+                <w:rFonts w:ascii="Simplified Arabic" w:hAnsi="Simplified Arabic" w:cs="Simplified Arabic"/>
+                <w:sz w:val="26"/>
+                <w:szCs w:val="26"/>
+                <w:rtl/>
+                <w:lang w:bidi="ar-EG"/>
+              </w:rPr>
+              <w:t xml:space="preserve">            </w:t>
+            </w:r>
+          </w:p>
+        </w:tc>
+        <w:tc>
+          <w:tcPr>
+            <w:tcW w:w="2636" w:type="dxa"/>
+            <w:gridSpan w:val="2"/>
+          </w:tcPr>
+          <w:p>
+            <w:pPr>
+              <w:bidi/>
+              <w:ind w:right="-709"/>
+              <w:rPr>
+                <w:rFonts w:ascii="Simplified Arabic" w:hAnsi="Simplified Arabic" w:cs="Simplified Arabic"/>
+                <w:sz w:val="26"/>
+                <w:szCs w:val="26"/>
+                <w:rtl/>
+                <w:lang w:bidi="ar-EG"/>
+              </w:rPr>
+            </w:pPr>
+          </w:p>
+        </w:tc>
+      </w:tr>
+      <w:tr>
+        <w:tblPrEx>
+          <w:tblBorders>
+            <w:top w:val="single" w:sz="4" w:space="0" w:color="auto"/>
+            <w:left w:val="single" w:sz="4" w:space="0" w:color="auto"/>
+            <w:bottom w:val="single" w:sz="4" w:space="0" w:color="auto"/>
+            <w:right w:val="single" w:sz="4" w:space="0" w:color="auto"/>
+            <w:insideH w:val="single" w:sz="4" w:space="0" w:color="auto"/>
+            <w:insideV w:val="single" w:sz="4" w:space="0" w:color="auto"/>
+          </w:tblBorders>
+        </w:tblPrEx>
+        <w:trPr>
+          <w:gridBefore w:val="1"/>
+          <w:gridAfter w:val="1"/>
+          <w:wBefore w:w="115" w:type="dxa"/>
+          <w:wAfter w:w="11" w:type="dxa"/>
+          <w:trHeight w:val="57"/>
+        </w:trPr>
+        <w:tc>
+          <w:tcPr>
+            <w:tcW w:w="5103" w:type="dxa"/>
+            <w:gridSpan w:val="3"/>
+            <w:shd w:val="clear" w:color="auto" w:fill="F2F2F2"/>
+          </w:tcPr>
+          <w:p>
+            <w:pPr>
+              <w:bidi/>
+              <w:ind w:right="-709"/>
+              <w:jc w:val="center"/>
+              <w:rPr>
+                <w:rFonts w:ascii="Simplified Arabic" w:hAnsi="Simplified Arabic" w:cs="Simplified Arabic"/>
+                <w:b/>
+                <w:bCs/>
+                <w:sz w:val="26"/>
+                <w:szCs w:val="26"/>
+                <w:rtl/>
+                <w:lang w:bidi="ar-EG"/>
+              </w:rPr>
+            </w:pPr>
+            <w:r>
+              <w:rPr>
+                <w:rFonts w:ascii="Simplified Arabic" w:hAnsi="Simplified Arabic" w:cs="Simplified Arabic"/>
+                <w:b/>
+                <w:bCs/>
+                <w:sz w:val="26"/>
+                <w:szCs w:val="26"/>
+                <w:rtl/>
+                <w:lang w:bidi="ar-EG"/>
+              </w:rPr>
+              <w:t>ال</w:t>
+            </w:r>
+            <w:r>
+              <w:rPr>
+                <w:rFonts w:ascii="Simplified Arabic" w:hAnsi="Simplified Arabic" w:cs="Simplified Arabic" w:hint="cs"/>
+                <w:b/>
+                <w:bCs/>
+                <w:sz w:val="26"/>
+                <w:szCs w:val="26"/>
+                <w:rtl/>
+                <w:lang w:bidi="ar-EG"/>
+              </w:rPr>
+              <w:t>ا</w:t>
+            </w:r>
+            <w:r>
+              <w:rPr>
+                <w:rFonts w:ascii="Simplified Arabic" w:hAnsi="Simplified Arabic" w:cs="Simplified Arabic"/>
+                <w:b/>
+                <w:bCs/>
+                <w:sz w:val="26"/>
+                <w:szCs w:val="26"/>
+                <w:rtl/>
+                <w:lang w:bidi="ar-EG"/>
+              </w:rPr>
+              <w:t>ســـــــــــــــم</w:t>
+            </w:r>
+          </w:p>
+        </w:tc>
+        <w:tc>
+          <w:tcPr>
+            <w:tcW w:w="4679" w:type="dxa"/>
+            <w:gridSpan w:val="2"/>
+            <w:shd w:val="clear" w:color="auto" w:fill="F2F2F2"/>
+          </w:tcPr>
+          <w:p>
+            <w:pPr>
+              <w:bidi/>
+              <w:ind w:right="-709"/>
+              <w:jc w:val="center"/>
+              <w:rPr>
+                <w:rFonts w:ascii="Simplified Arabic" w:hAnsi="Simplified Arabic" w:cs="Simplified Arabic"/>
+                <w:b/>
+                <w:bCs/>
+                <w:sz w:val="26"/>
+                <w:szCs w:val="26"/>
+                <w:rtl/>
+                <w:lang w:bidi="ar-EG"/>
+              </w:rPr>
+            </w:pPr>
+            <w:r>
+              <w:rPr>
+                <w:rFonts w:ascii="Simplified Arabic" w:hAnsi="Simplified Arabic" w:cs="Simplified Arabic" w:hint="cs"/>
+                <w:b/>
+                <w:bCs/>
+                <w:sz w:val="26"/>
+                <w:szCs w:val="26"/>
+                <w:rtl/>
+                <w:lang w:bidi="ar-EG"/>
+              </w:rPr>
+              <w:t xml:space="preserve">الدرجة - </w:t>
+            </w:r>
+            <w:r>
+              <w:rPr>
+                <w:rFonts w:ascii="Simplified Arabic" w:hAnsi="Simplified Arabic" w:cs="Simplified Arabic"/>
+                <w:b/>
+                <w:bCs/>
+                <w:sz w:val="26"/>
+                <w:szCs w:val="26"/>
+                <w:rtl/>
+                <w:lang w:bidi="ar-EG"/>
+              </w:rPr>
+              <w:t>الجهــ</w:t>
+            </w:r>
+            <w:r>
+              <w:rPr>
+                <w:rFonts w:ascii="Simplified Arabic" w:hAnsi="Simplified Arabic" w:cs="Simplified Arabic"/>
+                <w:b/>
+                <w:bCs/>
+                <w:sz w:val="26"/>
+                <w:szCs w:val="26"/>
+                <w:rtl/>
+                <w:lang w:bidi="ar-EG"/>
+              </w:rPr>
+              <w:t>ـــــة</w:t>
+            </w:r>
+          </w:p>
+        </w:tc>
+      </w:tr>
+      <w:tr>
+        <w:tblPrEx>
+          <w:tblBorders>
+            <w:top w:val="single" w:sz="4" w:space="0" w:color="auto"/>
+            <w:left w:val="single" w:sz="4" w:space="0" w:color="auto"/>
+            <w:bottom w:val="single" w:sz="4" w:space="0" w:color="auto"/>
+            <w:right w:val="single" w:sz="4" w:space="0" w:color="auto"/>
+            <w:insideH w:val="single" w:sz="4" w:space="0" w:color="auto"/>
+            <w:insideV w:val="single" w:sz="4" w:space="0" w:color="auto"/>
+          </w:tblBorders>
+        </w:tblPrEx>
+        <w:trPr>
+          <w:gridBefore w:val="1"/>
+          <w:gridAfter w:val="1"/>
+          <w:wBefore w:w="115" w:type="dxa"/>
+          <w:wAfter w:w="11" w:type="dxa"/>
+          <w:cantSplit/>
+          <w:trHeight w:val="340"/>
+        </w:trPr>
+        <w:tc>
+          <w:tcPr>
+            <w:tcW w:w="5103" w:type="dxa"/>
+            <w:gridSpan w:val="3"/>
+          </w:tcPr>
+          <w:p>
+            <w:pPr>
+              <w:bidi/>
+              <w:spacing w:line="120" w:lineRule="auto"/>
+              <w:ind w:right="-709"/>
+              <w:rPr>
+                <w:rFonts w:ascii="Simplified Arabic" w:hAnsi="Simplified Arabic" w:cs="Simplified Arabic"/>
+                <w:sz w:val="26"/>
+                <w:szCs w:val="26"/>
+                <w:rtl/>
+                <w:lang w:bidi="ar-EG"/>
+              </w:rPr>
+            </w:pPr>
+          </w:p>
+        </w:tc>
+        <w:tc>
+          <w:tcPr>
+            <w:tcW w:w="4679" w:type="dxa"/>
+            <w:gridSpan w:val="2"/>
+          </w:tcPr>
+          <w:p>
+            <w:pPr>
+              <w:bidi/>
+              <w:spacing w:line="120" w:lineRule="auto"/>
+              <w:ind w:right="-709"/>
+              <w:rPr>
+                <w:rFonts w:ascii="Simplified Arabic" w:hAnsi="Simplified Arabic" w:cs="Simplified Arabic"/>
+                <w:sz w:val="26"/>
+                <w:szCs w:val="26"/>
+                <w:rtl/>
+                <w:lang w:bidi="ar-EG"/>
+              </w:rPr>
+            </w:pPr>
+          </w:p>
+        </w:tc>
+      </w:tr>
+      <w:tr>
+        <w:tblPrEx>
+          <w:tblBorders>
+            <w:top w:val="single" w:sz="4" w:space="0" w:color="auto"/>
+            <w:left w:val="single" w:sz="4" w:space="0" w:color="auto"/>
+            <w:bottom w:val="single" w:sz="4" w:space="0" w:color="auto"/>
+            <w:right w:val="single" w:sz="4" w:space="0" w:color="auto"/>
+            <w:insideH w:val="single" w:sz="4" w:space="0" w:color="auto"/>
+            <w:insideV w:val="single" w:sz="4" w:space="0" w:color="auto"/>
+          </w:tblBorders>
+        </w:tblPrEx>
+        <w:trPr>
+          <w:gridBefore w:val="1"/>
+          <w:gridAfter w:val="1"/>
+          <w:wBefore w:w="115" w:type="dxa"/>
+          <w:wAfter w:w="11" w:type="dxa"/>
+          <w:cantSplit/>
+          <w:trHeight w:val="340"/>
+        </w:trPr>
+        <w:tc>
+          <w:tcPr>
+            <w:tcW w:w="5103" w:type="dxa"/>
+            <w:gridSpan w:val="3"/>
+          </w:tcPr>
+          <w:p>
+            <w:pPr>
+              <w:bidi/>
+              <w:spacing w:line="120" w:lineRule="auto"/>
+              <w:ind w:right="-709"/>
+              <w:rPr>
+                <w:rFonts w:ascii="Simplified Arabic" w:hAnsi="Simplified Arabic" w:cs="Simplified Arabic"/>
+                <w:sz w:val="26"/>
+                <w:szCs w:val="26"/>
+                <w:rtl/>
+                <w:lang w:bidi="ar-EG"/>
+              </w:rPr>
+            </w:pPr>
+          </w:p>
+        </w:tc>
+        <w:tc>
+          <w:tcPr>
+            <w:tcW w:w="4679" w:type="dxa"/>
+            <w:gridSpan w:val="2"/>
+          </w:tcPr>
+          <w:p>
+            <w:pPr>
+              <w:bidi/>
+              <w:spacing w:line="120" w:lineRule="auto"/>
+              <w:ind w:right="-709"/>
+              <w:rPr>
+                <w:rFonts w:ascii="Simplified Arabic" w:hAnsi="Simplified Arabic" w:cs="Simplified Arabic"/>
+                <w:sz w:val="26"/>
+                <w:szCs w:val="26"/>
+                <w:rtl/>
+                <w:lang w:bidi="ar-EG"/>
+              </w:rPr>
+            </w:pPr>
+          </w:p>
+        </w:tc>
+      </w:tr>
+      <w:tr>
+        <w:tblPrEx>
+          <w:tblBorders>
+            <w:top w:val="single" w:sz="4" w:space="0" w:color="auto"/>
+            <w:left w:val="single" w:sz="4" w:space="0" w:color="auto"/>
+            <w:bottom w:val="single" w:sz="4" w:space="0" w:color="auto"/>
+            <w:right w:val="single" w:sz="4" w:space="0" w:color="auto"/>
+            <w:insideH w:val="single" w:sz="4" w:space="0" w:color="auto"/>
+            <w:insideV w:val="single" w:sz="4" w:space="0" w:color="auto"/>
+          </w:tblBorders>
+        </w:tblPrEx>
+        <w:trPr>
+          <w:gridBefore w:val="1"/>
+          <w:gridAfter w:val="1"/>
+          <w:wBefore w:w="115" w:type="dxa"/>
+          <w:wAfter w:w="11" w:type="dxa"/>
+          <w:cantSplit/>
+          <w:trHeight w:val="340"/>
+        </w:trPr>
+        <w:tc>
+          <w:tcPr>
+            <w:tcW w:w="5103" w:type="dxa"/>
+            <w:gridSpan w:val="3"/>
+          </w:tcPr>
+          <w:p>
+            <w:pPr>
+              <w:bidi/>
+              <w:spacing w:line="120" w:lineRule="auto"/>
+              <w:ind w:right="-709"/>
+              <w:rPr>
+                <w:rFonts w:ascii="Simplified Arabic" w:hAnsi="Simplified Arabic" w:cs="Simplified Arabic"/>
+                <w:sz w:val="26"/>
+                <w:szCs w:val="26"/>
+                <w:rtl/>
+                <w:lang w:bidi="ar-EG"/>
+              </w:rPr>
+            </w:pPr>
+          </w:p>
+        </w:tc>
+        <w:tc>
+          <w:tcPr>
+            <w:tcW w:w="4679" w:type="dxa"/>
+            <w:gridSpan w:val="2"/>
+          </w:tcPr>
+          <w:p>
+            <w:pPr>
+              <w:bidi/>
+              <w:spacing w:line="120" w:lineRule="auto"/>
+              <w:ind w:right="-709"/>
+              <w:rPr>
+                <w:rFonts w:ascii="Simplified Arabic" w:hAnsi="Simplified Arabic" w:cs="Simplified Arabic"/>
+                <w:sz w:val="26"/>
+                <w:szCs w:val="26"/>
+                <w:rtl/>
+                <w:lang w:bidi="ar-EG"/>
+              </w:rPr>
+            </w:pPr>
+          </w:p>
+        </w:tc>
+      </w:tr>
+      <w:tr>
+        <w:tblPrEx>
+          <w:tblBorders>
+            <w:top w:val="single" w:sz="4" w:space="0" w:color="auto"/>
+            <w:left w:val="single" w:sz="4" w:space="0" w:color="auto"/>
+            <w:bottom w:val="single" w:sz="4" w:space="0" w:color="auto"/>
+            <w:right w:val="single" w:sz="4" w:space="0" w:color="auto"/>
+            <w:insideH w:val="single" w:sz="4" w:space="0" w:color="auto"/>
+            <w:insideV w:val="single" w:sz="4" w:space="0" w:color="auto"/>
+          </w:tblBorders>
+        </w:tblPrEx>
+        <w:trPr>
+          <w:gridBefore w:val="1"/>
+          <w:gridAfter w:val="1"/>
+          <w:wBefore w:w="115" w:type="dxa"/>
+          <w:wAfter w:w="11" w:type="dxa"/>
+          <w:cantSplit/>
+          <w:trHeight w:val="340"/>
+        </w:trPr>
+        <w:tc>
+          <w:tcPr>
+            <w:tcW w:w="5103" w:type="dxa"/>
+            <w:gridSpan w:val="3"/>
+          </w:tcPr>
+          <w:p>
+            <w:pPr>
+              <w:bidi/>
+              <w:spacing w:line="120" w:lineRule="auto"/>
+              <w:ind w:right="-709"/>
+              <w:rPr>
+                <w:rFonts w:ascii="Simplified Arabic" w:hAnsi="Simplified Arabic" w:cs="Simplified Arabic"/>
+                <w:sz w:val="26"/>
+                <w:szCs w:val="26"/>
+                <w:rtl/>
+                <w:lang w:bidi="ar-EG"/>
+              </w:rPr>
+            </w:pPr>
+          </w:p>
+        </w:tc>
+        <w:tc>
+          <w:tcPr>
+            <w:tcW w:w="4679" w:type="dxa"/>
+            <w:gridSpan w:val="2"/>
+          </w:tcPr>
+          <w:p>
+            <w:pPr>
+              <w:bidi/>
+              <w:spacing w:line="120" w:lineRule="auto"/>
+              <w:ind w:right="-709"/>
+              <w:rPr>
+                <w:rFonts w:ascii="Simplified Arabic" w:hAnsi="Simplified Arabic" w:cs="Simplified Arabic"/>
+                <w:sz w:val="26"/>
+                <w:szCs w:val="26"/>
+                <w:rtl/>
+                <w:lang w:bidi="ar-EG"/>
+              </w:rPr>
+            </w:pPr>
+          </w:p>
+        </w:tc>
+      </w:tr>
+    </w:tbl>
+    <w:p>
+      <w:pPr>
+        <w:bidi/>
+        <w:rPr>
+          <w:rFonts w:ascii="Simplified Arabic" w:hAnsi="Simplified Arabic" w:cs="Simplified Arabic"/>
+          <w:sz w:val="12"/>
+          <w:szCs w:val="12"/>
+          <w:rtl/>
+          <w:lang w:bidi="ar-EG"/>
+        </w:rPr>
+      </w:pPr>
+    </w:p>
+    <w:tbl>
+      <w:tblPr>
+        <w:bidiVisual/>
+        <w:tblW w:w="9897" w:type="dxa"/>
+        <w:tblInd w:w="-597" w:type="dxa"/>
+        <w:tblBorders>
+          <w:top w:val="single" w:sz="4" w:space="0" w:color="auto"/>
+          <w:left w:val="single" w:sz="4" w:space="0" w:color="auto"/>
+          <w:bottom w:val="single" w:sz="4" w:space="0" w:color="auto"/>
+          <w:right w:val="single" w:sz="4" w:space="0" w:color="auto"/>
+          <w:insideH w:val="single" w:sz="4" w:space="0" w:color="auto"/>
+          <w:insideV w:val="single" w:sz="4" w:space="0" w:color="auto"/>
+        </w:tblBorders>
+        <w:tblLook w:val="04A0" w:firstRow="1" w:lastRow="0" w:firstColumn="1" w:lastColumn="0" w:noHBand="0" w:noVBand="1"/>
+      </w:tblPr>
+      <w:tblGrid>
+        <w:gridCol w:w="1610"/>
+        <w:gridCol w:w="8287"/>
+      </w:tblGrid>
+      <w:tr>
+        <w:trPr>
+          <w:trHeight w:val="1048"/>
+        </w:trPr>
+        <w:tc>
+          <w:tcPr>
+            <w:tcW w:w="1610" w:type="dxa"/>
+            <w:tcBorders>
+              <w:top w:val="nil"/>
+              <w:left w:val="nil"/>
+              <w:bottom w:val="nil"/>
+              <w:right w:val="single" w:sz="4" w:space="0" w:color="auto"/>
+            </w:tcBorders>
+          </w:tcPr>
+          <w:p>
+            <w:pPr>
+              <w:bidi/>
+              <w:ind w:right="-709"/>
+              <w:rPr>
+                <w:rFonts w:ascii="Simplified Arabic" w:hAnsi="Simplified Arabic" w:cs="Simplified Arabic"/>
+                <w:b/>
+                <w:bCs/>
+                <w:sz w:val="26"/>
+                <w:szCs w:val="26"/>
+                <w:rtl/>
+                <w:lang w:bidi="ar-EG"/>
+              </w:rPr>
+            </w:pPr>
+            <w:r>
+              <w:rPr>
+                <w:rFonts w:ascii="Simplified Arabic" w:hAnsi="Simplified Arabic" w:cs="Simplified Arabic"/>
+                <w:sz w:val="26"/>
+                <w:szCs w:val="26"/>
+                <w:rtl/>
+                <w:lang w:bidi="ar-EG"/>
+              </w:rPr>
+              <w:t xml:space="preserve">  </w:t>
+            </w:r>
+            <w:r>
+              <w:rPr>
+                <w:rFonts w:ascii="Simplified Arabic" w:hAnsi="Simplified Arabic" w:cs="Simplified Arabic"/>
+                <w:b/>
+                <w:bCs/>
+                <w:sz w:val="26"/>
+                <w:szCs w:val="26"/>
+                <w:rtl/>
+                <w:lang w:bidi="ar-EG"/>
+              </w:rPr>
+              <w:t>موضوع البحث</w:t>
+            </w:r>
+          </w:p>
+          <w:p>
+            <w:pPr>
+              <w:bidi/>
+              <w:ind w:right="-709"/>
+              <w:rPr>
+                <w:rFonts w:ascii="Simplified Arabic" w:hAnsi="Simplified Arabic" w:cs="Simplified Arabic"/>
+                <w:sz w:val="26"/>
+                <w:szCs w:val="26"/>
+                <w:rtl/>
+                <w:lang w:bidi="ar-EG"/>
+              </w:rPr>
+            </w:pPr>
+            <w:r>
+              <w:rPr>
+                <w:rFonts w:ascii="Simplified Arabic" w:hAnsi="Simplified Arabic" w:cs="Simplified Arabic" w:hint="cs"/>
+                <w:b/>
+                <w:bCs/>
+                <w:sz w:val="26"/>
+                <w:szCs w:val="26"/>
+                <w:rtl/>
+                <w:lang w:bidi="ar-EG"/>
+              </w:rPr>
+              <w:t xml:space="preserve">  </w:t>
+            </w:r>
+            <w:r>
+              <w:rPr>
+                <w:rFonts w:ascii="Simplified Arabic" w:hAnsi="Simplified Arabic" w:cs="Simplified Arabic"/>
+                <w:b/>
+                <w:bCs/>
+                <w:sz w:val="26"/>
+                <w:szCs w:val="26"/>
+                <w:rtl/>
+                <w:lang w:bidi="ar-EG"/>
+              </w:rPr>
+              <w:t>المقت</w:t>
+            </w:r>
+            <w:r>
+              <w:rPr>
+                <w:rFonts w:ascii="Simplified Arabic" w:hAnsi="Simplified Arabic" w:cs="Simplified Arabic" w:hint="cs"/>
+                <w:b/>
+                <w:bCs/>
+                <w:sz w:val="26"/>
+                <w:szCs w:val="26"/>
+                <w:rtl/>
+                <w:lang w:bidi="ar-EG"/>
+              </w:rPr>
+              <w:t>ـــــــــــ</w:t>
+            </w:r>
+            <w:r>
+              <w:rPr>
+                <w:rFonts w:ascii="Simplified Arabic" w:hAnsi="Simplified Arabic" w:cs="Simplified Arabic" w:hint="cs"/>
+                <w:b/>
+                <w:bCs/>
+                <w:sz w:val="26"/>
+                <w:szCs w:val="26"/>
+                <w:rtl/>
+                <w:lang w:bidi="ar-EG"/>
+              </w:rPr>
+              <w:t>ــــ</w:t>
+            </w:r>
+            <w:r>
+              <w:rPr>
+                <w:rFonts w:ascii="Simplified Arabic" w:hAnsi="Simplified Arabic" w:cs="Simplified Arabic"/>
+                <w:b/>
+                <w:bCs/>
+                <w:sz w:val="26"/>
+                <w:szCs w:val="26"/>
+                <w:rtl/>
+                <w:lang w:bidi="ar-EG"/>
+              </w:rPr>
+              <w:t>رح:</w:t>
+            </w:r>
+            <w:r>
+              <w:rPr>
+                <w:rFonts w:ascii="Simplified Arabic" w:hAnsi="Simplified Arabic" w:cs="Simplified Arabic" w:hint="cs"/>
+                <w:sz w:val="26"/>
+                <w:szCs w:val="26"/>
+                <w:rtl/>
+                <w:lang w:bidi="ar-EG"/>
+              </w:rPr>
+              <w:t xml:space="preserve"> </w:t>
+            </w:r>
+          </w:p>
+        </w:tc>
+        <w:tc>
+          <w:tcPr>
+            <w:tcW w:w="8287" w:type="dxa"/>
+            <w:tcBorders>
+              <w:left w:val="single" w:sz="4" w:space="0" w:color="auto"/>
+            </w:tcBorders>
+          </w:tcPr>
+          <w:p>
+            <w:pPr>
+              <w:bidi/>
+              <w:ind w:right="-709"/>
+              <w:rPr>
+                <w:rFonts w:ascii="Simplified Arabic" w:hAnsi="Simplified Arabic" w:cs="Simplified Arabic"/>
+                <w:sz w:val="26"/>
+                <w:szCs w:val="26"/>
+                <w:rtl/>
+                <w:lang w:bidi="ar-EG"/>
+              </w:rPr>
+            </w:pPr>
+          </w:p>
+        </w:tc>
+      </w:tr>
+    </w:tbl>
+    <w:p>
+      <w:pPr>
+        <w:bidi/>
+        <w:rPr>
+          <w:rFonts w:ascii="Simplified Arabic" w:hAnsi="Simplified Arabic" w:cs="Simplified Arabic"/>
+          <w:sz w:val="10"/>
+          <w:szCs w:val="10"/>
+          <w:rtl/>
+          <w:lang w:bidi="ar-EG"/>
+        </w:rPr>
+      </w:pPr>
+    </w:p>
+    <w:tbl>
+      <w:tblPr>
+        <w:bidiVisual/>
+        <w:tblW w:w="9897" w:type="dxa"/>
+        <w:tblInd w:w="-597" w:type="dxa"/>
+        <w:tblBorders>
+          <w:top w:val="single" w:sz="4" w:space="0" w:color="auto"/>
+          <w:left w:val="single" w:sz="4" w:space="0" w:color="auto"/>
+          <w:bottom w:val="single" w:sz="4" w:space="0" w:color="auto"/>
+          <w:right w:val="single" w:sz="4" w:space="0" w:color="auto"/>
+          <w:insideH w:val="single" w:sz="4" w:space="0" w:color="auto"/>
+          <w:insideV w:val="single" w:sz="4" w:space="0" w:color="auto"/>
+        </w:tblBorders>
+        <w:tblLook w:val="04A0" w:firstRow="1" w:lastRow="0" w:firstColumn="1" w:lastColumn="0" w:noHBand="0" w:noVBand="1"/>
+      </w:tblPr>
+      <w:tblGrid>
+        <w:gridCol w:w="1816"/>
+        <w:gridCol w:w="1559"/>
+        <w:gridCol w:w="1777"/>
+        <w:gridCol w:w="1484"/>
+        <w:gridCol w:w="3261"/>
+      </w:tblGrid>
+      <w:tr>
+        <w:trPr>
+          <w:trHeight w:val="255"/>
+        </w:trPr>
+        <w:tc>
+          <w:tcPr>
+            <w:tcW w:w="1816" w:type="dxa"/>
+            <w:vMerge w:val="restart"/>
+            <w:tcBorders>
+              <w:top w:val="nil"/>
+              <w:left w:val="nil"/>
+              <w:right w:val="single" w:sz="4" w:space="0" w:color="auto"/>
+            </w:tcBorders>
+          </w:tcPr>
+          <w:p>
+            <w:pPr>
+              <w:bidi/>
+              <w:ind w:right="-709"/>
+              <w:rPr>
+                <w:rFonts w:ascii="Simplified Arabic" w:hAnsi="Simplified Arabic" w:cs="Simplified Arabic"/>
+                <w:b/>
+                <w:bCs/>
+                <w:sz w:val="26"/>
+                <w:szCs w:val="26"/>
+                <w:rtl/>
+                <w:lang w:bidi="ar-EG"/>
+              </w:rPr>
+            </w:pPr>
+            <w:r>
+              <w:rPr>
+                <w:rFonts w:ascii="Simplified Arabic" w:hAnsi="Simplified Arabic" w:cs="Simplified Arabic" w:hint="cs"/>
+                <w:b/>
+                <w:bCs/>
+                <w:sz w:val="26"/>
+                <w:szCs w:val="26"/>
+                <w:rtl/>
+                <w:lang w:bidi="ar-EG"/>
+              </w:rPr>
+              <w:t>توافق الموضوع مع</w:t>
+            </w:r>
+          </w:p>
+          <w:p>
+            <w:pPr>
+              <w:bidi/>
+              <w:ind w:right="-709"/>
+              <w:rPr>
+                <w:rFonts w:ascii="Simplified Arabic" w:hAnsi="Simplified Arabic" w:cs="Simplified Arabic"/>
+                <w:b/>
+                <w:bCs/>
+                <w:sz w:val="26"/>
+                <w:szCs w:val="26"/>
+                <w:rtl/>
+                <w:lang w:bidi="ar-EG"/>
+              </w:rPr>
+            </w:pPr>
+            <w:r>
+              <w:rPr>
+                <w:rFonts w:ascii="Simplified Arabic" w:hAnsi="Simplified Arabic" w:cs="Simplified Arabic" w:hint="cs"/>
+                <w:b/>
+                <w:bCs/>
+                <w:sz w:val="26"/>
+                <w:szCs w:val="26"/>
+                <w:rtl/>
+                <w:lang w:bidi="ar-EG"/>
+              </w:rPr>
+              <w:t>الخط</w:t>
+            </w:r>
+            <w:r>
+              <w:rPr>
+                <w:rFonts w:ascii="Simplified Arabic" w:hAnsi="Simplified Arabic" w:cs="Simplified Arabic" w:hint="cs"/>
+                <w:b/>
+                <w:bCs/>
+                <w:sz w:val="26"/>
+                <w:szCs w:val="26"/>
+                <w:rtl/>
+                <w:lang w:bidi="ar-EG"/>
+              </w:rPr>
+              <w:t>ــــ</w:t>
+            </w:r>
+            <w:r>
+              <w:rPr>
+                <w:rFonts w:ascii="Simplified Arabic" w:hAnsi="Simplified Arabic" w:cs="Simplified Arabic" w:hint="cs"/>
+                <w:b/>
+                <w:bCs/>
+                <w:sz w:val="26"/>
+                <w:szCs w:val="26"/>
+                <w:rtl/>
+                <w:lang w:bidi="ar-EG"/>
+              </w:rPr>
+              <w:t xml:space="preserve">ة </w:t>
+            </w:r>
+            <w:r>
+              <w:rPr>
+                <w:rFonts w:ascii="Simplified Arabic" w:hAnsi="Simplified Arabic" w:cs="Simplified Arabic" w:hint="cs"/>
+                <w:b/>
+                <w:bCs/>
+                <w:sz w:val="26"/>
+                <w:szCs w:val="26"/>
+                <w:rtl/>
+                <w:lang w:bidi="ar-EG"/>
+              </w:rPr>
+              <w:t>البحثي</w:t>
+            </w:r>
+            <w:r>
+              <w:rPr>
+                <w:rFonts w:ascii="Simplified Arabic" w:hAnsi="Simplified Arabic" w:cs="Simplified Arabic" w:hint="cs"/>
+                <w:b/>
+                <w:bCs/>
+                <w:sz w:val="26"/>
+                <w:szCs w:val="26"/>
+                <w:rtl/>
+                <w:lang w:bidi="ar-EG"/>
+              </w:rPr>
+              <w:t>ــــــــ</w:t>
+            </w:r>
+            <w:r>
+              <w:rPr>
+                <w:rFonts w:ascii="Simplified Arabic" w:hAnsi="Simplified Arabic" w:cs="Simplified Arabic" w:hint="cs"/>
+                <w:b/>
+                <w:bCs/>
+                <w:sz w:val="26"/>
+                <w:szCs w:val="26"/>
+                <w:rtl/>
+                <w:lang w:bidi="ar-EG"/>
+              </w:rPr>
+              <w:t>ة</w:t>
+            </w:r>
+          </w:p>
+          <w:p>
+            <w:pPr>
+              <w:bidi/>
+              <w:ind w:right="-709"/>
+              <w:rPr>
+                <w:rFonts w:ascii="Simplified Arabic" w:hAnsi="Simplified Arabic" w:cs="Simplified Arabic"/>
+                <w:b/>
+                <w:bCs/>
+                <w:sz w:val="26"/>
+                <w:szCs w:val="26"/>
+                <w:rtl/>
+                <w:lang w:bidi="ar-EG"/>
+              </w:rPr>
+            </w:pPr>
+            <w:r>
+              <w:rPr>
+                <w:rFonts w:ascii="Simplified Arabic" w:hAnsi="Simplified Arabic" w:cs="Simplified Arabic" w:hint="cs"/>
+                <w:b/>
+                <w:bCs/>
+                <w:sz w:val="26"/>
+                <w:szCs w:val="26"/>
+                <w:rtl/>
+                <w:lang w:bidi="ar-EG"/>
+              </w:rPr>
+              <w:t xml:space="preserve"> لل</w:t>
+            </w:r>
+            <w:r>
+              <w:rPr>
+                <w:rFonts w:ascii="Simplified Arabic" w:hAnsi="Simplified Arabic" w:cs="Simplified Arabic" w:hint="cs"/>
+                <w:b/>
+                <w:bCs/>
+                <w:sz w:val="26"/>
+                <w:szCs w:val="26"/>
+                <w:rtl/>
+                <w:lang w:bidi="ar-EG"/>
+              </w:rPr>
+              <w:t>ــــــ</w:t>
+            </w:r>
+            <w:r>
+              <w:rPr>
+                <w:rFonts w:ascii="Simplified Arabic" w:hAnsi="Simplified Arabic" w:cs="Simplified Arabic" w:hint="cs"/>
+                <w:b/>
+                <w:bCs/>
+                <w:sz w:val="26"/>
+                <w:szCs w:val="26"/>
+                <w:rtl/>
+                <w:lang w:bidi="ar-EG"/>
+              </w:rPr>
+              <w:t xml:space="preserve">دولة </w:t>
+            </w:r>
+            <w:r>
+              <w:rPr>
+                <w:rFonts w:ascii="Simplified Arabic" w:hAnsi="Simplified Arabic" w:cs="Simplified Arabic" w:hint="cs"/>
+                <w:b/>
+                <w:bCs/>
+                <w:sz w:val="26"/>
+                <w:szCs w:val="26"/>
+                <w:rtl/>
+                <w:lang w:bidi="ar-EG"/>
+              </w:rPr>
+              <w:t>والكلية</w:t>
+            </w:r>
+            <w:r>
+              <w:rPr>
+                <w:rFonts w:ascii="Simplified Arabic" w:hAnsi="Simplified Arabic" w:cs="Simplified Arabic" w:hint="cs"/>
+                <w:b/>
+                <w:bCs/>
+                <w:sz w:val="26"/>
+                <w:szCs w:val="26"/>
+                <w:rtl/>
+                <w:lang w:bidi="ar-EG"/>
+              </w:rPr>
+              <w:t>:</w:t>
+            </w:r>
+          </w:p>
+        </w:tc>
+        <w:tc>
+          <w:tcPr>
+            <w:tcW w:w="3336" w:type="dxa"/>
+            <w:gridSpan w:val="2"/>
+            <w:tcBorders>
+              <w:left w:val="single" w:sz="4" w:space="0" w:color="auto"/>
+            </w:tcBorders>
+            <w:shd w:val="clear" w:color="auto" w:fill="F2F2F2"/>
+          </w:tcPr>
+          <w:p>
+            <w:pPr>
+              <w:bidi/>
+              <w:ind w:right="-706"/>
+              <w:rPr>
+                <w:rFonts w:ascii="Simplified Arabic" w:hAnsi="Simplified Arabic" w:cs="Simplified Arabic"/>
+                <w:b/>
+                <w:bCs/>
+                <w:sz w:val="26"/>
+                <w:szCs w:val="26"/>
+                <w:rtl/>
+                <w:lang w:bidi="ar-EG"/>
+              </w:rPr>
+            </w:pPr>
+            <w:r>
+              <w:rPr>
+                <w:rFonts w:ascii="Simplified Arabic" w:hAnsi="Simplified Arabic" w:cs="Simplified Arabic" w:hint="cs"/>
+                <w:b/>
+                <w:bCs/>
+                <w:sz w:val="26"/>
+                <w:szCs w:val="26"/>
+                <w:rtl/>
+                <w:lang w:bidi="ar-EG"/>
+              </w:rPr>
+              <w:t xml:space="preserve">   </w:t>
+            </w:r>
+            <w:r>
+              <w:rPr>
+                <w:rFonts w:ascii="Simplified Arabic" w:hAnsi="Simplified Arabic" w:cs="Simplified Arabic" w:hint="cs"/>
+                <w:b/>
+                <w:bCs/>
+                <w:sz w:val="26"/>
+                <w:szCs w:val="26"/>
+                <w:rtl/>
+                <w:lang w:bidi="ar-EG"/>
+              </w:rPr>
+              <w:t xml:space="preserve">     </w:t>
+            </w:r>
+            <w:r>
+              <w:rPr>
+                <w:rFonts w:ascii="Simplified Arabic" w:hAnsi="Simplified Arabic" w:cs="Simplified Arabic" w:hint="cs"/>
+                <w:b/>
+                <w:bCs/>
+                <w:sz w:val="26"/>
+                <w:szCs w:val="26"/>
+                <w:rtl/>
+                <w:lang w:bidi="ar-EG"/>
+              </w:rPr>
+              <w:t xml:space="preserve">  </w:t>
+            </w:r>
+            <w:r>
+              <w:rPr>
+                <w:rFonts w:ascii="Simplified Arabic" w:hAnsi="Simplified Arabic" w:cs="Simplified Arabic" w:hint="cs"/>
+                <w:b/>
+                <w:bCs/>
+                <w:sz w:val="26"/>
+                <w:szCs w:val="26"/>
+                <w:rtl/>
+                <w:lang w:bidi="ar-EG"/>
+              </w:rPr>
+              <w:t>خط</w:t>
+            </w:r>
+            <w:r>
+              <w:rPr>
+                <w:rFonts w:ascii="Simplified Arabic" w:hAnsi="Simplified Arabic" w:cs="Simplified Arabic" w:hint="cs"/>
+                <w:b/>
+                <w:bCs/>
+                <w:sz w:val="26"/>
+                <w:szCs w:val="26"/>
+                <w:rtl/>
+                <w:lang w:bidi="ar-EG"/>
+              </w:rPr>
+              <w:t>ــــــ</w:t>
+            </w:r>
+            <w:r>
+              <w:rPr>
+                <w:rFonts w:ascii="Simplified Arabic" w:hAnsi="Simplified Arabic" w:cs="Simplified Arabic" w:hint="cs"/>
+                <w:b/>
+                <w:bCs/>
+                <w:sz w:val="26"/>
+                <w:szCs w:val="26"/>
+                <w:rtl/>
+                <w:lang w:bidi="ar-EG"/>
+              </w:rPr>
+              <w:t>ة الدول</w:t>
+            </w:r>
+            <w:r>
+              <w:rPr>
+                <w:rFonts w:ascii="Simplified Arabic" w:hAnsi="Simplified Arabic" w:cs="Simplified Arabic" w:hint="cs"/>
+                <w:b/>
+                <w:bCs/>
+                <w:sz w:val="26"/>
+                <w:szCs w:val="26"/>
+                <w:rtl/>
+                <w:lang w:bidi="ar-EG"/>
+              </w:rPr>
+              <w:t>ــــــ</w:t>
+            </w:r>
+            <w:r>
+              <w:rPr>
+                <w:rFonts w:ascii="Simplified Arabic" w:hAnsi="Simplified Arabic" w:cs="Simplified Arabic" w:hint="cs"/>
+                <w:b/>
+                <w:bCs/>
+                <w:sz w:val="26"/>
+                <w:szCs w:val="26"/>
+                <w:rtl/>
+                <w:lang w:bidi="ar-EG"/>
+              </w:rPr>
+              <w:t>ة</w:t>
+            </w:r>
+          </w:p>
+        </w:tc>
+        <w:tc>
+          <w:tcPr>
+            <w:tcW w:w="4745" w:type="dxa"/>
+            <w:gridSpan w:val="2"/>
+            <w:tcBorders>
+              <w:left w:val="single" w:sz="4" w:space="0" w:color="auto"/>
+            </w:tcBorders>
+            <w:shd w:val="clear" w:color="auto" w:fill="F2F2F2"/>
+          </w:tcPr>
+          <w:p>
+            <w:pPr>
+              <w:bidi/>
+              <w:ind w:right="-709"/>
+              <w:rPr>
+                <w:rFonts w:ascii="Simplified Arabic" w:hAnsi="Simplified Arabic" w:cs="Simplified Arabic"/>
+                <w:b/>
+                <w:bCs/>
+                <w:sz w:val="26"/>
+                <w:szCs w:val="26"/>
+                <w:rtl/>
+                <w:lang w:bidi="ar-EG"/>
+              </w:rPr>
+            </w:pPr>
+            <w:r>
+              <w:rPr>
+                <w:rFonts w:ascii="Simplified Arabic" w:hAnsi="Simplified Arabic" w:cs="Simplified Arabic" w:hint="cs"/>
+                <w:b/>
+                <w:bCs/>
+                <w:sz w:val="26"/>
+                <w:szCs w:val="26"/>
+                <w:rtl/>
+                <w:lang w:bidi="ar-EG"/>
+              </w:rPr>
+              <w:t xml:space="preserve">                       </w:t>
+            </w:r>
+            <w:r>
+              <w:rPr>
+                <w:rFonts w:ascii="Simplified Arabic" w:hAnsi="Simplified Arabic" w:cs="Simplified Arabic" w:hint="cs"/>
+                <w:b/>
+                <w:bCs/>
+                <w:sz w:val="26"/>
+                <w:szCs w:val="26"/>
+                <w:rtl/>
+                <w:lang w:bidi="ar-EG"/>
+              </w:rPr>
+              <w:t>خط</w:t>
+            </w:r>
+            <w:r>
+              <w:rPr>
+                <w:rFonts w:ascii="Simplified Arabic" w:hAnsi="Simplified Arabic" w:cs="Simplified Arabic" w:hint="cs"/>
+                <w:b/>
+                <w:bCs/>
+                <w:sz w:val="26"/>
+                <w:szCs w:val="26"/>
+                <w:rtl/>
+                <w:lang w:bidi="ar-EG"/>
+              </w:rPr>
+              <w:t>ــــــ</w:t>
+            </w:r>
+            <w:r>
+              <w:rPr>
+                <w:rFonts w:ascii="Simplified Arabic" w:hAnsi="Simplified Arabic" w:cs="Simplified Arabic" w:hint="cs"/>
+                <w:b/>
+                <w:bCs/>
+                <w:sz w:val="26"/>
+                <w:szCs w:val="26"/>
+                <w:rtl/>
+                <w:lang w:bidi="ar-EG"/>
+              </w:rPr>
+              <w:t>ة القس</w:t>
+            </w:r>
+            <w:r>
+              <w:rPr>
+                <w:rFonts w:ascii="Simplified Arabic" w:hAnsi="Simplified Arabic" w:cs="Simplified Arabic" w:hint="cs"/>
+                <w:b/>
+                <w:bCs/>
+                <w:sz w:val="26"/>
+                <w:szCs w:val="26"/>
+                <w:rtl/>
+                <w:lang w:bidi="ar-EG"/>
+              </w:rPr>
+              <w:t>ــــــ</w:t>
+            </w:r>
+            <w:r>
+              <w:rPr>
+                <w:rFonts w:ascii="Simplified Arabic" w:hAnsi="Simplified Arabic" w:cs="Simplified Arabic" w:hint="cs"/>
+                <w:b/>
+                <w:bCs/>
+                <w:sz w:val="26"/>
+                <w:szCs w:val="26"/>
+                <w:rtl/>
+                <w:lang w:bidi="ar-EG"/>
+              </w:rPr>
+              <w:t>م</w:t>
+            </w:r>
+          </w:p>
+        </w:tc>
+      </w:tr>
+      <w:tr>
+        <w:trPr>
+          <w:trHeight w:val="255"/>
+        </w:trPr>
+        <w:tc>
+          <w:tcPr>
+            <w:tcW w:w="1816" w:type="dxa"/>
+            <w:vMerge/>
+            <w:tcBorders>
+              <w:left w:val="nil"/>
+              <w:right w:val="single" w:sz="4" w:space="0" w:color="auto"/>
+            </w:tcBorders>
+          </w:tcPr>
+          <w:p>
+            <w:pPr>
+              <w:bidi/>
+              <w:ind w:right="-709"/>
+              <w:rPr>
+                <w:rFonts w:ascii="Simplified Arabic" w:hAnsi="Simplified Arabic" w:cs="Simplified Arabic"/>
+                <w:sz w:val="26"/>
+                <w:szCs w:val="26"/>
+                <w:rtl/>
+                <w:lang w:bidi="ar-EG"/>
+              </w:rPr>
+            </w:pPr>
+          </w:p>
+        </w:tc>
+        <w:tc>
+          <w:tcPr>
+            <w:tcW w:w="1559" w:type="dxa"/>
+            <w:tcBorders>
+              <w:left w:val="single" w:sz="4" w:space="0" w:color="auto"/>
+            </w:tcBorders>
+            <w:shd w:val="clear" w:color="auto" w:fill="F2F2F2"/>
+          </w:tcPr>
+          <w:p>
+            <w:pPr>
+              <w:bidi/>
+              <w:ind w:right="-706"/>
+              <w:rPr>
+                <w:rFonts w:ascii="Simplified Arabic" w:hAnsi="Simplified Arabic" w:cs="Simplified Arabic"/>
+                <w:b/>
+                <w:bCs/>
+                <w:sz w:val="26"/>
+                <w:szCs w:val="26"/>
+                <w:rtl/>
+                <w:lang w:bidi="ar-EG"/>
+              </w:rPr>
+            </w:pPr>
+            <w:r>
+              <w:rPr>
+                <w:rFonts w:ascii="Simplified Arabic" w:hAnsi="Simplified Arabic" w:cs="Simplified Arabic" w:hint="cs"/>
+                <w:b/>
+                <w:bCs/>
+                <w:sz w:val="26"/>
+                <w:szCs w:val="26"/>
+                <w:rtl/>
+                <w:lang w:bidi="ar-EG"/>
+              </w:rPr>
+              <w:t xml:space="preserve"> </w:t>
+            </w:r>
+            <w:r>
+              <w:rPr>
+                <w:rFonts w:ascii="Simplified Arabic" w:hAnsi="Simplified Arabic" w:cs="Simplified Arabic" w:hint="cs"/>
+                <w:b/>
+                <w:bCs/>
+                <w:sz w:val="26"/>
+                <w:szCs w:val="26"/>
+                <w:rtl/>
+                <w:lang w:bidi="ar-EG"/>
+              </w:rPr>
+              <w:t xml:space="preserve">    </w:t>
+            </w:r>
+            <w:r>
+              <w:rPr>
+                <w:rFonts w:ascii="Simplified Arabic" w:hAnsi="Simplified Arabic" w:cs="Simplified Arabic" w:hint="cs"/>
+                <w:b/>
+                <w:bCs/>
+                <w:sz w:val="26"/>
+                <w:szCs w:val="26"/>
+                <w:rtl/>
+                <w:lang w:bidi="ar-EG"/>
+              </w:rPr>
+              <w:t>المحور</w:t>
+            </w:r>
+          </w:p>
+        </w:tc>
+        <w:tc>
+          <w:tcPr>
+            <w:tcW w:w="1777" w:type="dxa"/>
+            <w:tcBorders>
+              <w:left w:val="single" w:sz="4" w:space="0" w:color="auto"/>
+            </w:tcBorders>
+            <w:shd w:val="clear" w:color="auto" w:fill="F2F2F2"/>
+          </w:tcPr>
+          <w:p>
+            <w:pPr>
+              <w:bidi/>
+              <w:ind w:right="-706"/>
+              <w:rPr>
+                <w:rFonts w:ascii="Simplified Arabic" w:hAnsi="Simplified Arabic" w:cs="Simplified Arabic"/>
+                <w:b/>
+                <w:bCs/>
+                <w:sz w:val="26"/>
+                <w:szCs w:val="26"/>
+                <w:u w:val="single"/>
+                <w:rtl/>
+                <w:lang w:bidi="ar-EG"/>
+              </w:rPr>
+            </w:pPr>
+            <w:r>
+              <w:rPr>
+                <w:rFonts w:ascii="Simplified Arabic" w:hAnsi="Simplified Arabic" w:cs="Simplified Arabic" w:hint="cs"/>
+                <w:b/>
+                <w:bCs/>
+                <w:sz w:val="26"/>
+                <w:szCs w:val="26"/>
+                <w:rtl/>
+                <w:lang w:bidi="ar-EG"/>
+              </w:rPr>
+              <w:t xml:space="preserve">    الهدف</w:t>
+            </w:r>
+          </w:p>
+        </w:tc>
+        <w:tc>
+          <w:tcPr>
+            <w:tcW w:w="1484" w:type="dxa"/>
+            <w:tcBorders>
+              <w:left w:val="single" w:sz="4" w:space="0" w:color="auto"/>
+            </w:tcBorders>
+            <w:shd w:val="clear" w:color="auto" w:fill="F2F2F2"/>
+          </w:tcPr>
+          <w:p>
+            <w:pPr>
+              <w:bidi/>
+              <w:ind w:right="-709"/>
+              <w:rPr>
+                <w:rFonts w:ascii="Simplified Arabic" w:hAnsi="Simplified Arabic" w:cs="Simplified Arabic"/>
+                <w:b/>
+                <w:bCs/>
+                <w:sz w:val="26"/>
+                <w:szCs w:val="26"/>
+                <w:u w:val="single"/>
+                <w:rtl/>
+                <w:lang w:bidi="ar-EG"/>
+              </w:rPr>
+            </w:pPr>
+            <w:r>
+              <w:rPr>
+                <w:rFonts w:ascii="Simplified Arabic" w:hAnsi="Simplified Arabic" w:cs="Simplified Arabic" w:hint="cs"/>
+                <w:b/>
+                <w:bCs/>
+                <w:sz w:val="26"/>
+                <w:szCs w:val="26"/>
+                <w:rtl/>
+                <w:lang w:bidi="ar-EG"/>
+              </w:rPr>
+              <w:t xml:space="preserve">     </w:t>
+            </w:r>
+            <w:r>
+              <w:rPr>
+                <w:rFonts w:ascii="Simplified Arabic" w:hAnsi="Simplified Arabic" w:cs="Simplified Arabic" w:hint="cs"/>
+                <w:b/>
+                <w:bCs/>
+                <w:sz w:val="26"/>
+                <w:szCs w:val="26"/>
+                <w:rtl/>
+                <w:lang w:bidi="ar-EG"/>
+              </w:rPr>
+              <w:t>التخصص</w:t>
+            </w:r>
+          </w:p>
+        </w:tc>
+        <w:tc>
+          <w:tcPr>
+            <w:tcW w:w="3261" w:type="dxa"/>
+            <w:tcBorders>
+              <w:left w:val="single" w:sz="4" w:space="0" w:color="auto"/>
+            </w:tcBorders>
+            <w:shd w:val="clear" w:color="auto" w:fill="F2F2F2"/>
+          </w:tcPr>
+          <w:p>
+            <w:pPr>
+              <w:bidi/>
+              <w:ind w:right="-709"/>
+              <w:rPr>
+                <w:rFonts w:ascii="Simplified Arabic" w:hAnsi="Simplified Arabic" w:cs="Simplified Arabic"/>
+                <w:b/>
+                <w:bCs/>
+                <w:sz w:val="26"/>
+                <w:szCs w:val="26"/>
+                <w:u w:val="single"/>
+                <w:rtl/>
+                <w:lang w:bidi="ar-EG"/>
+              </w:rPr>
+            </w:pPr>
+            <w:r>
+              <w:rPr>
+                <w:rFonts w:ascii="Simplified Arabic" w:hAnsi="Simplified Arabic" w:cs="Simplified Arabic" w:hint="cs"/>
+                <w:b/>
+                <w:bCs/>
+                <w:sz w:val="26"/>
+                <w:szCs w:val="26"/>
+                <w:rtl/>
+                <w:lang w:bidi="ar-EG"/>
+              </w:rPr>
+              <w:t xml:space="preserve">           </w:t>
+            </w:r>
+            <w:r>
+              <w:rPr>
+                <w:rFonts w:ascii="Simplified Arabic" w:hAnsi="Simplified Arabic" w:cs="Simplified Arabic" w:hint="cs"/>
+                <w:b/>
+                <w:bCs/>
+                <w:sz w:val="26"/>
+                <w:szCs w:val="26"/>
+                <w:rtl/>
+                <w:lang w:bidi="ar-EG"/>
+              </w:rPr>
+              <w:t>المجال البحثى</w:t>
+            </w:r>
+          </w:p>
+        </w:tc>
+      </w:tr>
+      <w:tr>
+        <w:trPr>
+          <w:trHeight w:val="791"/>
+        </w:trPr>
+        <w:tc>
+          <w:tcPr>
+            <w:tcW w:w="1816" w:type="dxa"/>
+            <w:vMerge/>
+            <w:tcBorders>
+              <w:left w:val="nil"/>
+              <w:bottom w:val="nil"/>
+              <w:right w:val="single" w:sz="4" w:space="0" w:color="auto"/>
+            </w:tcBorders>
+          </w:tcPr>
+          <w:p>
+            <w:pPr>
+              <w:bidi/>
+              <w:ind w:right="-709"/>
+              <w:rPr>
+                <w:rFonts w:ascii="Simplified Arabic" w:hAnsi="Simplified Arabic" w:cs="Simplified Arabic"/>
+                <w:sz w:val="26"/>
+                <w:szCs w:val="26"/>
+                <w:rtl/>
+                <w:lang w:bidi="ar-EG"/>
+              </w:rPr>
+            </w:pPr>
+          </w:p>
+        </w:tc>
+        <w:tc>
+          <w:tcPr>
+            <w:tcW w:w="1559" w:type="dxa"/>
+            <w:tcBorders>
+              <w:left w:val="single" w:sz="4" w:space="0" w:color="auto"/>
+            </w:tcBorders>
+          </w:tcPr>
+          <w:p>
+            <w:pPr>
+              <w:bidi/>
+              <w:ind w:right="-709"/>
+              <w:rPr>
+                <w:rFonts w:ascii="Simplified Arabic" w:hAnsi="Simplified Arabic" w:cs="Simplified Arabic"/>
+                <w:rtl/>
+                <w:lang w:bidi="ar-EG"/>
+              </w:rPr>
+            </w:pPr>
+          </w:p>
+        </w:tc>
+        <w:tc>
+          <w:tcPr>
+            <w:tcW w:w="1777" w:type="dxa"/>
+            <w:tcBorders>
+              <w:left w:val="single" w:sz="4" w:space="0" w:color="auto"/>
+            </w:tcBorders>
+          </w:tcPr>
+          <w:p>
+            <w:pPr>
+              <w:bidi/>
+              <w:ind w:right="-709"/>
+              <w:rPr>
+                <w:rFonts w:ascii="Simplified Arabic" w:hAnsi="Simplified Arabic" w:cs="Simplified Arabic"/>
+                <w:sz w:val="26"/>
+                <w:szCs w:val="26"/>
+                <w:rtl/>
+                <w:lang w:bidi="ar-EG"/>
+              </w:rPr>
+            </w:pPr>
+          </w:p>
+        </w:tc>
+        <w:tc>
+          <w:tcPr>
+            <w:tcW w:w="1484" w:type="dxa"/>
+            <w:tcBorders>
+              <w:left w:val="single" w:sz="4" w:space="0" w:color="auto"/>
+            </w:tcBorders>
+          </w:tcPr>
+          <w:p>
+            <w:pPr>
+              <w:bidi/>
+              <w:ind w:right="-709"/>
+              <w:rPr>
+                <w:rFonts w:ascii="Simplified Arabic" w:hAnsi="Simplified Arabic" w:cs="Simplified Arabic"/>
+                <w:sz w:val="26"/>
+                <w:szCs w:val="26"/>
+                <w:rtl/>
+                <w:lang w:bidi="ar-EG"/>
+              </w:rPr>
+            </w:pPr>
+          </w:p>
+        </w:tc>
+        <w:tc>
+          <w:tcPr>
+            <w:tcW w:w="3261" w:type="dxa"/>
+            <w:tcBorders>
+              <w:left w:val="single" w:sz="4" w:space="0" w:color="auto"/>
+            </w:tcBorders>
+          </w:tcPr>
+          <w:p>
+            <w:pPr>
+              <w:bidi/>
+              <w:ind w:right="-709"/>
+              <w:rPr>
+                <w:rFonts w:ascii="Simplified Arabic" w:hAnsi="Simplified Arabic" w:cs="Simplified Arabic"/>
+                <w:sz w:val="26"/>
+                <w:szCs w:val="26"/>
+                <w:rtl/>
+                <w:lang w:bidi="ar-EG"/>
+              </w:rPr>
+            </w:pPr>
+          </w:p>
+        </w:tc>
+      </w:tr>
+    </w:tbl>
+    <w:p>
+      <w:pPr>
+        <w:bidi/>
+        <w:ind w:left="-590"/>
+        <w:rPr>
+          <w:b/>
+          <w:bCs/>
+          <w:sz w:val="26"/>
+          <w:szCs w:val="26"/>
+        </w:rPr>
+      </w:pPr>
+      <w:r>
+        <w:rPr>
+          <w:rFonts w:ascii="Simplified Arabic" w:hAnsi="Simplified Arabic" w:cs="Simplified Arabic" w:hint="cs"/>
+          <w:b/>
+          <w:bCs/>
+          <w:sz w:val="26"/>
+          <w:szCs w:val="26"/>
+          <w:rtl/>
+          <w:lang w:bidi="ar-EG"/>
+        </w:rPr>
+        <w:t>ف</w:t>
+      </w:r>
+      <w:r>
+        <w:rPr>
+          <w:rFonts w:ascii="Simplified Arabic" w:hAnsi="Simplified Arabic" w:cs="Simplified Arabic" w:hint="cs"/>
+          <w:b/>
+          <w:bCs/>
+          <w:sz w:val="26"/>
+          <w:szCs w:val="26"/>
+          <w:rtl/>
+          <w:lang w:bidi="ar-EG"/>
+        </w:rPr>
+        <w:t>ى</w:t>
+      </w:r>
+      <w:r>
+        <w:rPr>
+          <w:rFonts w:ascii="Simplified Arabic" w:hAnsi="Simplified Arabic" w:cs="Simplified Arabic" w:hint="cs"/>
+          <w:b/>
+          <w:bCs/>
+          <w:sz w:val="26"/>
+          <w:szCs w:val="26"/>
+          <w:rtl/>
+          <w:lang w:bidi="ar-EG"/>
+        </w:rPr>
+        <w:t xml:space="preserve"> حال</w:t>
+      </w:r>
+      <w:r>
+        <w:rPr>
+          <w:rFonts w:ascii="Simplified Arabic" w:hAnsi="Simplified Arabic" w:cs="Simplified Arabic" w:hint="cs"/>
+          <w:b/>
+          <w:bCs/>
+          <w:sz w:val="26"/>
+          <w:szCs w:val="26"/>
+          <w:rtl/>
+          <w:lang w:bidi="ar-EG"/>
+        </w:rPr>
+        <w:t>ة</w:t>
+      </w:r>
+      <w:r>
+        <w:rPr>
+          <w:rFonts w:ascii="Simplified Arabic" w:hAnsi="Simplified Arabic" w:cs="Simplified Arabic" w:hint="cs"/>
+          <w:b/>
+          <w:bCs/>
+          <w:sz w:val="26"/>
+          <w:szCs w:val="26"/>
+          <w:rtl/>
+          <w:lang w:bidi="ar-EG"/>
+        </w:rPr>
+        <w:t xml:space="preserve"> تعديل الإشراف</w:t>
+      </w:r>
+      <w:r>
+        <w:rPr>
+          <w:rFonts w:ascii="Simplified Arabic" w:hAnsi="Simplified Arabic" w:cs="Simplified Arabic"/>
+          <w:b/>
+          <w:bCs/>
+          <w:sz w:val="26"/>
+          <w:szCs w:val="26"/>
+          <w:rtl/>
+          <w:lang w:bidi="ar-EG"/>
+        </w:rPr>
+        <w:t>:</w:t>
+      </w:r>
+    </w:p>
+    <w:tbl>
+      <w:tblPr>
+        <w:bidiVisual/>
+        <w:tblW w:w="9782" w:type="dxa"/>
+        <w:tblInd w:w="-482" w:type="dxa"/>
+        <w:tblBorders>
+          <w:top w:val="single" w:sz="4" w:space="0" w:color="auto"/>
+          <w:left w:val="single" w:sz="4" w:space="0" w:color="auto"/>
+          <w:bottom w:val="single" w:sz="4" w:space="0" w:color="auto"/>
+          <w:right w:val="single" w:sz="4" w:space="0" w:color="auto"/>
+          <w:insideH w:val="single" w:sz="4" w:space="0" w:color="auto"/>
+          <w:insideV w:val="single" w:sz="4" w:space="0" w:color="auto"/>
+        </w:tblBorders>
+        <w:tblLook w:val="04A0" w:firstRow="1" w:lastRow="0" w:firstColumn="1" w:lastColumn="0" w:noHBand="0" w:noVBand="1"/>
+      </w:tblPr>
+      <w:tblGrid>
+        <w:gridCol w:w="3969"/>
+        <w:gridCol w:w="3119"/>
+        <w:gridCol w:w="2694"/>
+      </w:tblGrid>
+      <w:tr>
+        <w:trPr>
+          <w:trHeight w:val="380"/>
+        </w:trPr>
+        <w:tc>
+          <w:tcPr>
+            <w:tcW w:w="3969" w:type="dxa"/>
+            <w:shd w:val="clear" w:color="auto" w:fill="F2F2F2"/>
+          </w:tcPr>
+          <w:p>
+            <w:pPr>
+              <w:bidi/>
+              <w:ind w:right="-709"/>
+              <w:jc w:val="center"/>
+              <w:rPr>
+                <w:rFonts w:ascii="Simplified Arabic" w:hAnsi="Simplified Arabic" w:cs="Simplified Arabic"/>
+                <w:b/>
+                <w:bCs/>
+                <w:sz w:val="26"/>
+                <w:szCs w:val="26"/>
+                <w:rtl/>
+                <w:lang w:bidi="ar-EG"/>
+              </w:rPr>
+            </w:pPr>
+            <w:r>
+              <w:rPr>
+                <w:rFonts w:ascii="Simplified Arabic" w:hAnsi="Simplified Arabic" w:cs="Simplified Arabic"/>
+                <w:b/>
+                <w:bCs/>
+                <w:sz w:val="26"/>
+                <w:szCs w:val="26"/>
+                <w:rtl/>
+                <w:lang w:bidi="ar-EG"/>
+              </w:rPr>
+              <w:t>ال</w:t>
+            </w:r>
+            <w:r>
+              <w:rPr>
+                <w:rFonts w:ascii="Simplified Arabic" w:hAnsi="Simplified Arabic" w:cs="Simplified Arabic" w:hint="cs"/>
+                <w:b/>
+                <w:bCs/>
+                <w:sz w:val="26"/>
+                <w:szCs w:val="26"/>
+                <w:rtl/>
+                <w:lang w:bidi="ar-EG"/>
+              </w:rPr>
+              <w:t>ا</w:t>
+            </w:r>
+            <w:r>
+              <w:rPr>
+                <w:rFonts w:ascii="Simplified Arabic" w:hAnsi="Simplified Arabic" w:cs="Simplified Arabic"/>
+                <w:b/>
+                <w:bCs/>
+                <w:sz w:val="26"/>
+                <w:szCs w:val="26"/>
+                <w:rtl/>
+                <w:lang w:bidi="ar-EG"/>
+              </w:rPr>
+              <w:t>ســـــــــــــــم</w:t>
+            </w:r>
+          </w:p>
+        </w:tc>
+        <w:tc>
+          <w:tcPr>
+            <w:tcW w:w="3119" w:type="dxa"/>
+            <w:shd w:val="clear" w:color="auto" w:fill="F2F2F2"/>
+          </w:tcPr>
+          <w:p>
+            <w:pPr>
+              <w:bidi/>
+              <w:ind w:left="360" w:right="-709"/>
+              <w:rPr>
+                <w:rFonts w:ascii="Simplified Arabic" w:hAnsi="Simplified Arabic" w:cs="Simplified Arabic"/>
+                <w:b/>
+                <w:bCs/>
+                <w:sz w:val="26"/>
+                <w:szCs w:val="26"/>
+                <w:rtl/>
+                <w:lang w:bidi="ar-EG"/>
+              </w:rPr>
+            </w:pPr>
+            <w:r>
+              <w:rPr>
+                <w:rFonts w:ascii="Simplified Arabic" w:hAnsi="Simplified Arabic" w:cs="Simplified Arabic" w:hint="cs"/>
+                <w:b/>
+                <w:bCs/>
+                <w:sz w:val="26"/>
+                <w:szCs w:val="26"/>
+                <w:rtl/>
+                <w:lang w:bidi="ar-EG"/>
+              </w:rPr>
+              <w:t xml:space="preserve">    </w:t>
+            </w:r>
+            <w:r>
+              <w:rPr>
+                <w:rFonts w:ascii="Simplified Arabic" w:hAnsi="Simplified Arabic" w:cs="Simplified Arabic" w:hint="cs"/>
+                <w:b/>
+                <w:bCs/>
+                <w:sz w:val="26"/>
+                <w:szCs w:val="26"/>
+                <w:rtl/>
+                <w:lang w:bidi="ar-EG"/>
+              </w:rPr>
+              <w:t xml:space="preserve">الدرجة - </w:t>
+            </w:r>
+            <w:r>
+              <w:rPr>
+                <w:rFonts w:ascii="Simplified Arabic" w:hAnsi="Simplified Arabic" w:cs="Simplified Arabic"/>
+                <w:b/>
+                <w:bCs/>
+                <w:sz w:val="26"/>
+                <w:szCs w:val="26"/>
+                <w:rtl/>
+                <w:lang w:bidi="ar-EG"/>
+              </w:rPr>
+              <w:t>الجهــ</w:t>
+            </w:r>
+            <w:r>
+              <w:rPr>
+                <w:rFonts w:ascii="Simplified Arabic" w:hAnsi="Simplified Arabic" w:cs="Simplified Arabic"/>
+                <w:b/>
+                <w:bCs/>
+                <w:sz w:val="26"/>
+                <w:szCs w:val="26"/>
+                <w:rtl/>
+                <w:lang w:bidi="ar-EG"/>
+              </w:rPr>
+              <w:t>ـــــة</w:t>
+            </w:r>
+            <w:r>
+              <w:rPr>
+                <w:rFonts w:ascii="Simplified Arabic" w:hAnsi="Simplified Arabic" w:cs="Simplified Arabic" w:hint="cs"/>
+                <w:b/>
+                <w:bCs/>
+                <w:sz w:val="26"/>
+                <w:szCs w:val="26"/>
+                <w:rtl/>
+                <w:lang w:bidi="ar-EG"/>
+              </w:rPr>
+              <w:t>*</w:t>
+            </w:r>
+            <w:r>
+              <w:rPr>
+                <w:rFonts w:ascii="Simplified Arabic" w:hAnsi="Simplified Arabic" w:cs="Simplified Arabic" w:hint="cs"/>
+                <w:b/>
+                <w:bCs/>
+                <w:sz w:val="26"/>
+                <w:szCs w:val="26"/>
+                <w:rtl/>
+                <w:lang w:bidi="ar-EG"/>
+              </w:rPr>
+              <w:t>*</w:t>
+            </w:r>
+          </w:p>
+        </w:tc>
+        <w:tc>
+          <w:tcPr>
+            <w:tcW w:w="2694" w:type="dxa"/>
+            <w:shd w:val="clear" w:color="auto" w:fill="F2F2F2"/>
+          </w:tcPr>
+          <w:p>
+            <w:pPr>
+              <w:bidi/>
+              <w:ind w:right="-709"/>
+              <w:rPr>
+                <w:rFonts w:ascii="Simplified Arabic" w:hAnsi="Simplified Arabic" w:cs="Simplified Arabic"/>
+                <w:b/>
+                <w:bCs/>
+                <w:sz w:val="26"/>
+                <w:szCs w:val="26"/>
+                <w:rtl/>
+                <w:lang w:bidi="ar-EG"/>
+              </w:rPr>
+            </w:pPr>
+            <w:r>
+              <w:rPr>
+                <w:rFonts w:ascii="Simplified Arabic" w:hAnsi="Simplified Arabic" w:cs="Simplified Arabic" w:hint="cs"/>
+                <w:b/>
+                <w:bCs/>
+                <w:sz w:val="26"/>
+                <w:szCs w:val="26"/>
+                <w:rtl/>
+                <w:lang w:bidi="ar-EG"/>
+              </w:rPr>
+              <w:t xml:space="preserve">         </w:t>
+            </w:r>
+            <w:r>
+              <w:rPr>
+                <w:rFonts w:ascii="Simplified Arabic" w:hAnsi="Simplified Arabic" w:cs="Simplified Arabic" w:hint="cs"/>
+                <w:b/>
+                <w:bCs/>
+                <w:sz w:val="26"/>
+                <w:szCs w:val="26"/>
+                <w:rtl/>
+                <w:lang w:bidi="ar-EG"/>
+              </w:rPr>
+              <w:t>إضاف</w:t>
+            </w:r>
+            <w:r>
+              <w:rPr>
+                <w:rFonts w:ascii="Simplified Arabic" w:hAnsi="Simplified Arabic" w:cs="Simplified Arabic" w:hint="cs"/>
+                <w:b/>
+                <w:bCs/>
+                <w:sz w:val="26"/>
+                <w:szCs w:val="26"/>
+                <w:rtl/>
+                <w:lang w:bidi="ar-EG"/>
+              </w:rPr>
+              <w:t>ــــ</w:t>
+            </w:r>
+            <w:r>
+              <w:rPr>
+                <w:rFonts w:ascii="Simplified Arabic" w:hAnsi="Simplified Arabic" w:cs="Simplified Arabic" w:hint="cs"/>
+                <w:b/>
+                <w:bCs/>
+                <w:sz w:val="26"/>
+                <w:szCs w:val="26"/>
+                <w:rtl/>
+                <w:lang w:bidi="ar-EG"/>
+              </w:rPr>
+              <w:t xml:space="preserve">ة / </w:t>
+            </w:r>
+            <w:r>
+              <w:rPr>
+                <w:rFonts w:ascii="Simplified Arabic" w:hAnsi="Simplified Arabic" w:cs="Simplified Arabic" w:hint="cs"/>
+                <w:b/>
+                <w:bCs/>
+                <w:sz w:val="26"/>
+                <w:szCs w:val="26"/>
+                <w:rtl/>
+                <w:lang w:bidi="ar-EG"/>
+              </w:rPr>
+              <w:t>حذف</w:t>
+            </w:r>
+          </w:p>
+        </w:tc>
+      </w:tr>
+      <w:tr>
+        <w:trPr>
+          <w:trHeight w:val="380"/>
+        </w:trPr>
+        <w:tc>
+          <w:tcPr>
+            <w:tcW w:w="3969" w:type="dxa"/>
+          </w:tcPr>
+          <w:p>
+            <w:pPr>
+              <w:bidi/>
+              <w:ind w:right="-709"/>
+              <w:rPr>
+                <w:rFonts w:ascii="Simplified Arabic" w:hAnsi="Simplified Arabic" w:cs="Simplified Arabic"/>
+                <w:sz w:val="26"/>
+                <w:szCs w:val="26"/>
+                <w:rtl/>
+                <w:lang w:bidi="ar-EG"/>
+              </w:rPr>
+            </w:pPr>
+          </w:p>
+        </w:tc>
+        <w:tc>
+          <w:tcPr>
+            <w:tcW w:w="3119" w:type="dxa"/>
+          </w:tcPr>
+          <w:p>
+            <w:pPr>
+              <w:bidi/>
+              <w:ind w:right="-709"/>
+              <w:rPr>
+                <w:rFonts w:ascii="Simplified Arabic" w:hAnsi="Simplified Arabic" w:cs="Simplified Arabic"/>
+                <w:sz w:val="26"/>
+                <w:szCs w:val="26"/>
+                <w:rtl/>
+                <w:lang w:bidi="ar-EG"/>
+              </w:rPr>
+            </w:pPr>
+            <w:r>
+              <w:rPr>
+                <w:rFonts w:hint="cs"/>
+                <w:b/>
+                <w:bCs/>
+                <w:noProof/>
+                <w:sz w:val="26"/>
+                <w:szCs w:val="26"/>
+                <w:rtl/>
+              </w:rPr>
+              <w:drawing>
+                <wp:anchor distT="0" distB="0" distL="114300" distR="114300" simplePos="0" relativeHeight="251658752" behindDoc="0" locked="0" layoutInCell="1" allowOverlap="1" wp14:anchorId="08FB5B7A" wp14:editId="2DF1112B">
+                  <wp:simplePos x="0" y="0"/>
+                  <wp:positionH relativeFrom="column">
+                    <wp:posOffset>-356235</wp:posOffset>
+                  </wp:positionH>
+                  <wp:positionV relativeFrom="paragraph">
+                    <wp:posOffset>47625</wp:posOffset>
+                  </wp:positionV>
+                  <wp:extent cx="247650" cy="190500"/>
+                  <wp:effectExtent l="19050" t="0" r="0" b="0"/>
+                  <wp:wrapNone/>
+                  <wp:docPr id="24" name="Picture 24"/>
+                  <wp:cNvGraphicFramePr>
+                    <a:graphicFrameLocks xmlns:a="http://schemas.openxmlformats.org/drawingml/2006/main" noChangeAspect="1"/>
+                  </wp:cNvGraphicFramePr>
+                  <a:graphic xmlns:a="http://schemas.openxmlformats.org/drawingml/2006/main">
+                    <a:graphicData uri="http://schemas.openxmlformats.org/drawingml/2006/picture">
+                      <pic:pic xmlns:pic="http://schemas.openxmlformats.org/drawingml/2006/picture">
+                        <pic:nvPicPr>
+                          <pic:cNvPr id="0" name="Picture 24"/>
+                          <pic:cNvPicPr>
+                            <a:picLocks noChangeAspect="1" noChangeArrowheads="1"/>
+                          </pic:cNvPicPr>
+                        </pic:nvPicPr>
+                        <pic:blipFill>
+                          <a:blip r:embed="rId8"/>
+                          <a:srcRect/>
+                          <a:stretch>
+                            <a:fillRect/>
+                          </a:stretch>
+                        </pic:blipFill>
+                        <pic:spPr bwMode="auto">
+                          <a:xfrm>
+                            <a:off x="0" y="0"/>
+                            <a:ext cx="247650" cy="190500"/>
+                          </a:xfrm>
+                          <a:prstGeom prst="rect">
+                            <a:avLst/>
+                          </a:prstGeom>
+                          <a:noFill/>
+                        </pic:spPr>
+                      </pic:pic>
+                    </a:graphicData>
+                  </a:graphic>
+                </wp:anchor>
+              </w:drawing>
+            </w:r>
+          </w:p>
+        </w:tc>
+        <w:tc>
+          <w:tcPr>
+            <w:tcW w:w="2694" w:type="dxa"/>
+          </w:tcPr>
+          <w:p>
+            <w:pPr>
+              <w:bidi/>
+              <w:ind w:right="-706"/>
+              <w:rPr>
+                <w:rFonts w:ascii="Simplified Arabic" w:hAnsi="Simplified Arabic" w:cs="Simplified Arabic"/>
+                <w:sz w:val="26"/>
+                <w:szCs w:val="26"/>
+                <w:rtl/>
+                <w:lang w:bidi="ar-EG"/>
+              </w:rPr>
+            </w:pPr>
+            <w:r>
+              <w:rPr>
+                <w:rFonts w:hint="cs"/>
+                <w:b/>
+                <w:bCs/>
+                <w:noProof/>
+                <w:sz w:val="26"/>
+                <w:szCs w:val="26"/>
+                <w:rtl/>
+              </w:rPr>
+              <w:drawing>
+                <wp:anchor distT="0" distB="0" distL="114300" distR="114300" simplePos="0" relativeHeight="251659776" behindDoc="0" locked="0" layoutInCell="1" allowOverlap="1" wp14:anchorId="142C5ACB" wp14:editId="04A3CBC2">
+                  <wp:simplePos x="0" y="0"/>
+                  <wp:positionH relativeFrom="column">
+                    <wp:posOffset>440690</wp:posOffset>
+                  </wp:positionH>
+                  <wp:positionV relativeFrom="paragraph">
+                    <wp:posOffset>47625</wp:posOffset>
+                  </wp:positionV>
+                  <wp:extent cx="247650" cy="190500"/>
+                  <wp:effectExtent l="19050" t="0" r="0" b="0"/>
+                  <wp:wrapNone/>
+                  <wp:docPr id="25" name="Picture 25"/>
+                  <wp:cNvGraphicFramePr>
+                    <a:graphicFrameLocks xmlns:a="http://schemas.openxmlformats.org/drawingml/2006/main" noChangeAspect="1"/>
+                  </wp:cNvGraphicFramePr>
+                  <a:graphic xmlns:a="http://schemas.openxmlformats.org/drawingml/2006/main">
+                    <a:graphicData uri="http://schemas.openxmlformats.org/drawingml/2006/picture">
+                      <pic:pic xmlns:pic="http://schemas.openxmlformats.org/drawingml/2006/picture">
+                        <pic:nvPicPr>
+                          <pic:cNvPr id="0" name="Picture 25"/>
+                          <pic:cNvPicPr>
+                            <a:picLocks noChangeAspect="1" noChangeArrowheads="1"/>
+                          </pic:cNvPicPr>
+                        </pic:nvPicPr>
+                        <pic:blipFill>
+                          <a:blip r:embed="rId8"/>
+                          <a:srcRect/>
+                          <a:stretch>
+                            <a:fillRect/>
+                          </a:stretch>
+                        </pic:blipFill>
+                        <pic:spPr bwMode="auto">
+                          <a:xfrm>
+                            <a:off x="0" y="0"/>
+                            <a:ext cx="247650" cy="190500"/>
+                          </a:xfrm>
+                          <a:prstGeom prst="rect">
+                            <a:avLst/>
+                          </a:prstGeom>
+                          <a:noFill/>
+                        </pic:spPr>
+                      </pic:pic>
+                    </a:graphicData>
+                  </a:graphic>
+                </wp:anchor>
+              </w:drawing>
+            </w:r>
+            <w:r>
+              <w:rPr>
+                <w:rFonts w:ascii="Simplified Arabic" w:hAnsi="Simplified Arabic" w:cs="Simplified Arabic"/>
+                <w:noProof/>
+                <w:sz w:val="26"/>
+                <w:szCs w:val="26"/>
+                <w:rtl/>
+              </w:rPr>
+              <w:pict w14:anchorId="1ACC72D2">
+                <v:roundrect id="_x0000_s2061" style="position:absolute;left:0;text-align:left;margin-left:-200.65pt;margin-top:21.15pt;width:16.15pt;height:13.3pt;z-index:251656704;mso-position-horizontal-relative:text;mso-position-vertical-relative:text" arcsize="10923f" wrapcoords="-982 -1200 -982 21600 21600 21600 22582 18000 22582 1200 21600 -1200 -982 -1200">
+                  <w10:wrap anchorx="page"/>
+                </v:roundrect>
+              </w:pict>
+            </w:r>
+            <w:r>
+              <w:rPr>
+                <w:rFonts w:ascii="Simplified Arabic" w:hAnsi="Simplified Arabic" w:cs="Simplified Arabic"/>
+                <w:noProof/>
+                <w:sz w:val="26"/>
+                <w:szCs w:val="26"/>
+                <w:rtl/>
+              </w:rPr>
+              <w:pict w14:anchorId="305DB59C">
+                <v:roundrect id="_x0000_s2051" style="position:absolute;left:0;text-align:left;margin-left:-134.15pt;margin-top:3.75pt;width:11.25pt;height:9.75pt;z-index:251654656;mso-position-horizontal-relative:text;mso-position-vertical-relative:text" arcsize="10923f">
+                  <w10:wrap anchorx="page"/>
+                </v:roundrect>
+              </w:pict>
+            </w:r>
+            <w:r>
+              <w:rPr>
+                <w:rFonts w:ascii="Simplified Arabic" w:hAnsi="Simplified Arabic" w:cs="Simplified Arabic" w:hint="cs"/>
+                <w:sz w:val="26"/>
+                <w:szCs w:val="26"/>
+                <w:rtl/>
+                <w:lang w:bidi="ar-EG"/>
+              </w:rPr>
+              <w:t xml:space="preserve"> </w:t>
+            </w:r>
+            <w:r>
+              <w:rPr>
+                <w:rFonts w:ascii="Simplified Arabic" w:hAnsi="Simplified Arabic" w:cs="Simplified Arabic" w:hint="cs"/>
+                <w:sz w:val="26"/>
+                <w:szCs w:val="26"/>
+                <w:rtl/>
+                <w:lang w:bidi="ar-EG"/>
+              </w:rPr>
+              <w:t xml:space="preserve">    </w:t>
+            </w:r>
+            <w:r>
+              <w:rPr>
+                <w:rFonts w:ascii="Simplified Arabic" w:hAnsi="Simplified Arabic" w:cs="Simplified Arabic" w:hint="cs"/>
+                <w:sz w:val="26"/>
+                <w:szCs w:val="26"/>
+                <w:rtl/>
+                <w:lang w:bidi="ar-EG"/>
+              </w:rPr>
+              <w:t xml:space="preserve"> </w:t>
+            </w:r>
+            <w:r>
+              <w:rPr>
+                <w:rFonts w:ascii="Simplified Arabic" w:hAnsi="Simplified Arabic" w:cs="Simplified Arabic" w:hint="cs"/>
+                <w:sz w:val="26"/>
+                <w:szCs w:val="26"/>
+                <w:rtl/>
+                <w:lang w:bidi="ar-EG"/>
+              </w:rPr>
+              <w:t>إضافة</w:t>
+            </w:r>
+            <w:r>
+              <w:rPr>
+                <w:rFonts w:ascii="Simplified Arabic" w:hAnsi="Simplified Arabic" w:cs="Simplified Arabic" w:hint="cs"/>
+                <w:sz w:val="26"/>
+                <w:szCs w:val="26"/>
+                <w:rtl/>
+                <w:lang w:bidi="ar-EG"/>
+              </w:rPr>
+              <w:t xml:space="preserve">           </w:t>
+            </w:r>
+            <w:r>
+              <w:rPr>
+                <w:rFonts w:ascii="Simplified Arabic" w:hAnsi="Simplified Arabic" w:cs="Simplified Arabic" w:hint="cs"/>
+                <w:sz w:val="26"/>
+                <w:szCs w:val="26"/>
+                <w:rtl/>
+                <w:lang w:bidi="ar-EG"/>
+              </w:rPr>
+              <w:t>حذف</w:t>
+            </w:r>
+          </w:p>
+        </w:tc>
+      </w:tr>
+      <w:tr>
+        <w:trPr>
+          <w:trHeight w:val="283"/>
+        </w:trPr>
+        <w:tc>
+          <w:tcPr>
+            <w:tcW w:w="3969" w:type="dxa"/>
+          </w:tcPr>
+          <w:p>
+            <w:pPr>
+              <w:bidi/>
+              <w:ind w:right="-709"/>
+              <w:rPr>
+                <w:rFonts w:ascii="Simplified Arabic" w:hAnsi="Simplified Arabic" w:cs="Simplified Arabic"/>
+                <w:sz w:val="26"/>
+                <w:szCs w:val="26"/>
+                <w:rtl/>
+                <w:lang w:bidi="ar-EG"/>
+              </w:rPr>
+            </w:pPr>
+          </w:p>
+        </w:tc>
+        <w:tc>
+          <w:tcPr>
+            <w:tcW w:w="3119" w:type="dxa"/>
+          </w:tcPr>
+          <w:p>
+            <w:pPr>
+              <w:bidi/>
+              <w:ind w:right="-709"/>
+              <w:rPr>
+                <w:rFonts w:ascii="Simplified Arabic" w:hAnsi="Simplified Arabic" w:cs="Simplified Arabic"/>
+                <w:sz w:val="26"/>
+                <w:szCs w:val="26"/>
+                <w:rtl/>
+                <w:lang w:bidi="ar-EG"/>
+              </w:rPr>
+            </w:pPr>
+          </w:p>
+        </w:tc>
+        <w:tc>
+          <w:tcPr>
+            <w:tcW w:w="2694" w:type="dxa"/>
+            <w:vAlign w:val="center"/>
+          </w:tcPr>
+          <w:p>
+            <w:pPr>
+              <w:bidi/>
+              <w:ind w:right="-709"/>
+              <w:rPr>
+                <w:rFonts w:ascii="Simplified Arabic" w:hAnsi="Simplified Arabic" w:cs="Simplified Arabic"/>
+                <w:sz w:val="26"/>
+                <w:szCs w:val="26"/>
+                <w:rtl/>
+                <w:lang w:bidi="ar-EG"/>
+              </w:rPr>
+            </w:pPr>
+            <w:r>
+              <w:rPr>
+                <w:rFonts w:hint="cs"/>
+                <w:b/>
+                <w:bCs/>
+                <w:noProof/>
+                <w:sz w:val="26"/>
+                <w:szCs w:val="26"/>
+                <w:rtl/>
+              </w:rPr>
+              <w:drawing>
+                <wp:anchor distT="0" distB="0" distL="114300" distR="114300" simplePos="0" relativeHeight="251660800" behindDoc="0" locked="0" layoutInCell="1" allowOverlap="1" wp14:anchorId="160CFAEA" wp14:editId="0B02A34D">
+                  <wp:simplePos x="0" y="0"/>
+                  <wp:positionH relativeFrom="column">
+                    <wp:posOffset>1344295</wp:posOffset>
+                  </wp:positionH>
+                  <wp:positionV relativeFrom="paragraph">
+                    <wp:posOffset>50800</wp:posOffset>
+                  </wp:positionV>
+                  <wp:extent cx="247650" cy="190500"/>
+                  <wp:effectExtent l="19050" t="0" r="0" b="0"/>
+                  <wp:wrapNone/>
+                  <wp:docPr id="27" name="Picture 27"/>
+                  <wp:cNvGraphicFramePr>
+                    <a:graphicFrameLocks xmlns:a="http://schemas.openxmlformats.org/drawingml/2006/main" noChangeAspect="1"/>
+                  </wp:cNvGraphicFramePr>
+                  <a:graphic xmlns:a="http://schemas.openxmlformats.org/drawingml/2006/main">
+                    <a:graphicData uri="http://schemas.openxmlformats.org/drawingml/2006/picture">
+                      <pic:pic xmlns:pic="http://schemas.openxmlformats.org/drawingml/2006/picture">
+                        <pic:nvPicPr>
+                          <pic:cNvPr id="0" name="Picture 27"/>
+                          <pic:cNvPicPr>
+                            <a:picLocks noChangeAspect="1" noChangeArrowheads="1"/>
+                          </pic:cNvPicPr>
+                        </pic:nvPicPr>
+                        <pic:blipFill>
+                          <a:blip r:embed="rId8"/>
+                          <a:srcRect/>
+                          <a:stretch>
+                            <a:fillRect/>
+                          </a:stretch>
+                        </pic:blipFill>
+                        <pic:spPr bwMode="auto">
+                          <a:xfrm>
+                            <a:off x="0" y="0"/>
+                            <a:ext cx="247650" cy="190500"/>
+                          </a:xfrm>
+                          <a:prstGeom prst="rect">
+                            <a:avLst/>
+                          </a:prstGeom>
+                          <a:noFill/>
+                        </pic:spPr>
+                      </pic:pic>
+                    </a:graphicData>
+                  </a:graphic>
+                </wp:anchor>
+              </w:drawing>
+            </w:r>
+            <w:r>
+              <w:rPr>
+                <w:b/>
+                <w:bCs/>
+                <w:noProof/>
+                <w:sz w:val="26"/>
+                <w:szCs w:val="26"/>
+                <w:rtl/>
+              </w:rPr>
+              <w:pict w14:anchorId="7F3F6E9A">
+                <v:rect id="_x0000_s2066" style="position:absolute;left:0;text-align:left;margin-left:35.9pt;margin-top:4.25pt;width:17.3pt;height:13.05pt;z-index:-251658752;mso-position-horizontal-relative:text;mso-position-vertical-relative:text">
+                  <w10:wrap anchorx="page"/>
+                </v:rect>
+              </w:pict>
+            </w:r>
+            <w:r>
+              <w:rPr>
+                <w:rFonts w:ascii="Simplified Arabic" w:hAnsi="Simplified Arabic" w:cs="Simplified Arabic"/>
+                <w:noProof/>
+                <w:sz w:val="26"/>
+                <w:szCs w:val="26"/>
+                <w:rtl/>
+              </w:rPr>
+              <w:pict w14:anchorId="3F82FB89">
+                <v:roundrect id="_x0000_s2058" style="position:absolute;left:0;text-align:left;margin-left:-134.15pt;margin-top:3.75pt;width:11.25pt;height:9.75pt;z-index:251655680;mso-position-horizontal-relative:text;mso-position-vertical-relative:text" arcsize="10923f">
+                  <w10:wrap anchorx="page"/>
+                </v:roundrect>
+              </w:pict>
+            </w:r>
+            <w:r>
+              <w:rPr>
+                <w:rFonts w:ascii="Simplified Arabic" w:hAnsi="Simplified Arabic" w:cs="Simplified Arabic" w:hint="cs"/>
+                <w:sz w:val="26"/>
+                <w:szCs w:val="26"/>
+                <w:rtl/>
+                <w:lang w:bidi="ar-EG"/>
+              </w:rPr>
+              <w:t xml:space="preserve"> </w:t>
+            </w:r>
+            <w:r>
+              <w:rPr>
+                <w:rFonts w:ascii="Simplified Arabic" w:hAnsi="Simplified Arabic" w:cs="Simplified Arabic" w:hint="cs"/>
+                <w:sz w:val="26"/>
+                <w:szCs w:val="26"/>
+                <w:rtl/>
+                <w:lang w:bidi="ar-EG"/>
+              </w:rPr>
+              <w:t xml:space="preserve">   </w:t>
+            </w:r>
+            <w:r>
+              <w:rPr>
+                <w:rFonts w:ascii="Simplified Arabic" w:hAnsi="Simplified Arabic" w:cs="Simplified Arabic" w:hint="cs"/>
+                <w:sz w:val="26"/>
+                <w:szCs w:val="26"/>
+                <w:rtl/>
+                <w:lang w:bidi="ar-EG"/>
+              </w:rPr>
+              <w:t xml:space="preserve"> </w:t>
+            </w:r>
+            <w:r>
+              <w:rPr>
+                <w:rFonts w:ascii="Simplified Arabic" w:hAnsi="Simplified Arabic" w:cs="Simplified Arabic" w:hint="cs"/>
+                <w:sz w:val="26"/>
+                <w:szCs w:val="26"/>
+                <w:rtl/>
+                <w:lang w:bidi="ar-EG"/>
+              </w:rPr>
+              <w:t xml:space="preserve"> </w:t>
+            </w:r>
+            <w:r>
+              <w:rPr>
+                <w:rFonts w:ascii="Simplified Arabic" w:hAnsi="Simplified Arabic" w:cs="Simplified Arabic" w:hint="cs"/>
+                <w:sz w:val="26"/>
+                <w:szCs w:val="26"/>
+                <w:rtl/>
+                <w:lang w:bidi="ar-EG"/>
+              </w:rPr>
+              <w:t>إضافة</w:t>
+            </w:r>
+            <w:r>
+              <w:rPr>
+                <w:rFonts w:ascii="Simplified Arabic" w:hAnsi="Simplified Arabic" w:cs="Simplified Arabic" w:hint="cs"/>
+                <w:sz w:val="26"/>
+                <w:szCs w:val="26"/>
+                <w:rtl/>
+                <w:lang w:bidi="ar-EG"/>
+              </w:rPr>
+              <w:t xml:space="preserve"> </w:t>
+            </w:r>
+            <w:r>
+              <w:rPr>
+                <w:rFonts w:ascii="Simplified Arabic" w:hAnsi="Simplified Arabic" w:cs="Simplified Arabic" w:hint="cs"/>
+                <w:sz w:val="26"/>
+                <w:szCs w:val="26"/>
+                <w:rtl/>
+                <w:lang w:bidi="ar-EG"/>
+              </w:rPr>
+              <w:t xml:space="preserve">  </w:t>
+            </w:r>
+            <w:r>
+              <w:rPr>
+                <w:rFonts w:ascii="Simplified Arabic" w:hAnsi="Simplified Arabic" w:cs="Simplified Arabic" w:hint="cs"/>
+                <w:sz w:val="26"/>
+                <w:szCs w:val="26"/>
+                <w:rtl/>
+                <w:lang w:bidi="ar-EG"/>
+              </w:rPr>
+              <w:t xml:space="preserve"> </w:t>
+            </w:r>
+            <w:r>
+              <w:rPr>
+                <w:rFonts w:ascii="Simplified Arabic" w:hAnsi="Simplified Arabic" w:cs="Simplified Arabic" w:hint="cs"/>
+                <w:sz w:val="26"/>
+                <w:szCs w:val="26"/>
+                <w:rtl/>
+                <w:lang w:bidi="ar-EG"/>
+              </w:rPr>
+              <w:t xml:space="preserve">  </w:t>
+            </w:r>
+            <w:r>
+              <w:rPr>
+                <w:rFonts w:ascii="Simplified Arabic" w:hAnsi="Simplified Arabic" w:cs="Simplified Arabic" w:hint="cs"/>
+                <w:sz w:val="26"/>
+                <w:szCs w:val="26"/>
+                <w:rtl/>
+                <w:lang w:bidi="ar-EG"/>
+              </w:rPr>
+              <w:t xml:space="preserve">    </w:t>
+            </w:r>
+            <w:r>
+              <w:rPr>
+                <w:rFonts w:ascii="Simplified Arabic" w:hAnsi="Simplified Arabic" w:cs="Simplified Arabic" w:hint="cs"/>
+                <w:sz w:val="26"/>
+                <w:szCs w:val="26"/>
+                <w:rtl/>
+                <w:lang w:bidi="ar-EG"/>
+              </w:rPr>
+              <w:t xml:space="preserve"> </w:t>
+            </w:r>
+            <w:r>
+              <w:rPr>
+                <w:rFonts w:ascii="Simplified Arabic" w:hAnsi="Simplified Arabic" w:cs="Simplified Arabic" w:hint="cs"/>
+                <w:sz w:val="26"/>
+                <w:szCs w:val="26"/>
+                <w:rtl/>
+                <w:lang w:bidi="ar-EG"/>
+              </w:rPr>
+              <w:t>حذف</w:t>
+            </w:r>
+          </w:p>
+        </w:tc>
+      </w:tr>
+    </w:tbl>
+    <w:p>
+      <w:pPr>
+        <w:bidi/>
+        <w:ind w:left="-590"/>
+        <w:rPr>
+          <w:rtl/>
+          <w:lang w:bidi="ar-EG"/>
+        </w:rPr>
+      </w:pPr>
+      <w:r>
+        <w:rPr>
+          <w:rFonts w:hint="cs"/>
+          <w:rtl/>
+          <w:lang w:bidi="ar-EG"/>
+        </w:rPr>
+        <w:t>*</w:t>
+      </w:r>
+      <w:r>
+        <w:rPr>
+          <w:rFonts w:hint="cs"/>
+          <w:rtl/>
+          <w:lang w:bidi="ar-EG"/>
+        </w:rPr>
+        <w:t>*</w:t>
+      </w:r>
+      <w:r>
+        <w:rPr>
+          <w:rFonts w:hint="cs"/>
+          <w:rtl/>
+          <w:lang w:bidi="ar-EG"/>
+        </w:rPr>
+        <w:t xml:space="preserve"> </w:t>
+      </w:r>
+      <w:r>
+        <w:rPr>
+          <w:rFonts w:hint="cs"/>
+          <w:rtl/>
+          <w:lang w:bidi="ar-EG"/>
+        </w:rPr>
+        <w:t>يتم تحديد الجهة في حالة الإشراف من خارج القسم</w:t>
+      </w:r>
+    </w:p>
+    <w:p>
+      <w:pPr>
+        <w:bidi/>
+        <w:rPr>
+          <w:b/>
+          <w:bCs/>
+          <w:sz w:val="4"/>
+          <w:szCs w:val="4"/>
+          <w:rtl/>
+          <w:lang w:bidi="ar-EG"/>
+        </w:rPr>
+      </w:pPr>
+    </w:p>
+    <w:tbl>
+      <w:tblPr>
+        <w:bidiVisual/>
+        <w:tblW w:w="9897" w:type="dxa"/>
+        <w:tblInd w:w="-597" w:type="dxa"/>
+        <w:tblLook w:val="04A0" w:firstRow="1" w:lastRow="0" w:firstColumn="1" w:lastColumn="0" w:noHBand="0" w:noVBand="1"/>
+      </w:tblPr>
+      <w:tblGrid>
+        <w:gridCol w:w="115"/>
+        <w:gridCol w:w="1230"/>
+        <w:gridCol w:w="3590"/>
+        <w:gridCol w:w="2008"/>
+        <w:gridCol w:w="2636"/>
+        <w:gridCol w:w="318"/>
+      </w:tblGrid>
+      <w:tr>
+        <w:trPr>
+          <w:gridAfter w:val="1"/>
+          <w:wAfter w:w="318" w:type="dxa"/>
+          <w:trHeight w:val="380"/>
+        </w:trPr>
+        <w:tc>
+          <w:tcPr>
+            <w:tcW w:w="1345" w:type="dxa"/>
+            <w:gridSpan w:val="2"/>
+          </w:tcPr>
+          <w:p>
+            <w:pPr>
+              <w:bidi/>
+              <w:ind w:right="-709"/>
+              <w:rPr>
+                <w:rFonts w:ascii="Simplified Arabic" w:hAnsi="Simplified Arabic" w:cs="Simplified Arabic"/>
+                <w:b/>
+                <w:bCs/>
+                <w:sz w:val="26"/>
+                <w:szCs w:val="26"/>
+                <w:rtl/>
+                <w:lang w:bidi="ar-EG"/>
+              </w:rPr>
+            </w:pPr>
+            <w:r>
+              <w:rPr>
+                <w:rFonts w:ascii="Simplified Arabic" w:hAnsi="Simplified Arabic" w:cs="Simplified Arabic" w:hint="cs"/>
+                <w:b/>
+                <w:bCs/>
+                <w:sz w:val="26"/>
+                <w:szCs w:val="26"/>
+                <w:rtl/>
+                <w:lang w:bidi="ar-EG"/>
+              </w:rPr>
+              <w:t>التوقيعات:</w:t>
+            </w:r>
+          </w:p>
+        </w:tc>
+        <w:tc>
+          <w:tcPr>
+            <w:tcW w:w="3590" w:type="dxa"/>
+          </w:tcPr>
+          <w:p>
+            <w:pPr>
+              <w:bidi/>
+              <w:ind w:right="-709"/>
+              <w:rPr>
+                <w:rFonts w:ascii="Simplified Arabic" w:hAnsi="Simplified Arabic" w:cs="Simplified Arabic"/>
+                <w:sz w:val="26"/>
+                <w:szCs w:val="26"/>
+                <w:rtl/>
+                <w:lang w:bidi="ar-EG"/>
+              </w:rPr>
+            </w:pPr>
+          </w:p>
+        </w:tc>
+        <w:tc>
+          <w:tcPr>
+            <w:tcW w:w="2008" w:type="dxa"/>
+          </w:tcPr>
+          <w:p>
+            <w:pPr>
+              <w:bidi/>
+              <w:ind w:right="-709"/>
+              <w:rPr>
+                <w:rFonts w:ascii="Simplified Arabic" w:hAnsi="Simplified Arabic" w:cs="Simplified Arabic"/>
+                <w:sz w:val="26"/>
+                <w:szCs w:val="26"/>
+                <w:rtl/>
+                <w:lang w:bidi="ar-EG"/>
+              </w:rPr>
+            </w:pPr>
+            <w:r>
+              <w:rPr>
+                <w:rFonts w:ascii="Simplified Arabic" w:hAnsi="Simplified Arabic" w:cs="Simplified Arabic"/>
+                <w:sz w:val="26"/>
+                <w:szCs w:val="26"/>
+                <w:rtl/>
+                <w:lang w:bidi="ar-EG"/>
+              </w:rPr>
+              <w:t xml:space="preserve">            </w:t>
+            </w:r>
+          </w:p>
+        </w:tc>
+        <w:tc>
+          <w:tcPr>
+            <w:tcW w:w="2636" w:type="dxa"/>
+          </w:tcPr>
+          <w:p>
+            <w:pPr>
+              <w:bidi/>
+              <w:ind w:right="-709"/>
+              <w:rPr>
+                <w:rFonts w:ascii="Simplified Arabic" w:hAnsi="Simplified Arabic" w:cs="Simplified Arabic"/>
+                <w:sz w:val="26"/>
+                <w:szCs w:val="26"/>
+                <w:rtl/>
+                <w:lang w:bidi="ar-EG"/>
+              </w:rPr>
+            </w:pPr>
+          </w:p>
+        </w:tc>
+      </w:tr>
+      <w:tr>
+        <w:tblPrEx>
+          <w:tblBorders>
+            <w:top w:val="single" w:sz="4" w:space="0" w:color="auto"/>
+            <w:left w:val="single" w:sz="4" w:space="0" w:color="auto"/>
+            <w:bottom w:val="single" w:sz="4" w:space="0" w:color="auto"/>
+            <w:right w:val="single" w:sz="4" w:space="0" w:color="auto"/>
+            <w:insideH w:val="single" w:sz="4" w:space="0" w:color="auto"/>
+            <w:insideV w:val="single" w:sz="4" w:space="0" w:color="auto"/>
+          </w:tblBorders>
+        </w:tblPrEx>
+        <w:trPr>
+          <w:gridBefore w:val="1"/>
+          <w:wBefore w:w="115" w:type="dxa"/>
+          <w:trHeight w:val="380"/>
+        </w:trPr>
+        <w:tc>
+          <w:tcPr>
+            <w:tcW w:w="4820" w:type="dxa"/>
+            <w:gridSpan w:val="2"/>
+            <w:shd w:val="clear" w:color="auto" w:fill="F2F2F2"/>
+          </w:tcPr>
+          <w:p>
+            <w:pPr>
+              <w:bidi/>
+              <w:ind w:right="-709"/>
+              <w:jc w:val="center"/>
+              <w:rPr>
+                <w:rFonts w:ascii="Simplified Arabic" w:hAnsi="Simplified Arabic" w:cs="Simplified Arabic"/>
+                <w:b/>
+                <w:bCs/>
+                <w:sz w:val="26"/>
+                <w:szCs w:val="26"/>
+                <w:rtl/>
+                <w:lang w:bidi="ar-EG"/>
+              </w:rPr>
+            </w:pPr>
+            <w:r>
+              <w:rPr>
+                <w:rFonts w:ascii="Simplified Arabic" w:hAnsi="Simplified Arabic" w:cs="Simplified Arabic"/>
+                <w:b/>
+                <w:bCs/>
+                <w:sz w:val="26"/>
+                <w:szCs w:val="26"/>
+                <w:rtl/>
+                <w:lang w:bidi="ar-EG"/>
+              </w:rPr>
+              <w:t>ال</w:t>
+            </w:r>
+            <w:r>
+              <w:rPr>
+                <w:rFonts w:ascii="Simplified Arabic" w:hAnsi="Simplified Arabic" w:cs="Simplified Arabic" w:hint="cs"/>
+                <w:b/>
+                <w:bCs/>
+                <w:sz w:val="26"/>
+                <w:szCs w:val="26"/>
+                <w:rtl/>
+                <w:lang w:bidi="ar-EG"/>
+              </w:rPr>
+              <w:t>ا</w:t>
+            </w:r>
+            <w:r>
+              <w:rPr>
+                <w:rFonts w:ascii="Simplified Arabic" w:hAnsi="Simplified Arabic" w:cs="Simplified Arabic"/>
+                <w:b/>
+                <w:bCs/>
+                <w:sz w:val="26"/>
+                <w:szCs w:val="26"/>
+                <w:rtl/>
+                <w:lang w:bidi="ar-EG"/>
+              </w:rPr>
+              <w:t>ســـــــــــــــم</w:t>
+            </w:r>
+          </w:p>
+        </w:tc>
+        <w:tc>
+          <w:tcPr>
+            <w:tcW w:w="4962" w:type="dxa"/>
+            <w:gridSpan w:val="3"/>
+            <w:shd w:val="clear" w:color="auto" w:fill="F2F2F2"/>
+          </w:tcPr>
+          <w:p>
+            <w:pPr>
+              <w:bidi/>
+              <w:ind w:right="-709"/>
+              <w:jc w:val="center"/>
+              <w:rPr>
+                <w:rFonts w:ascii="Simplified Arabic" w:hAnsi="Simplified Arabic" w:cs="Simplified Arabic"/>
+                <w:b/>
+                <w:bCs/>
+                <w:sz w:val="26"/>
+                <w:szCs w:val="26"/>
+                <w:rtl/>
+                <w:lang w:bidi="ar-EG"/>
+              </w:rPr>
+            </w:pPr>
+            <w:r>
+              <w:rPr>
+                <w:rFonts w:ascii="Simplified Arabic" w:hAnsi="Simplified Arabic" w:cs="Simplified Arabic" w:hint="cs"/>
+                <w:b/>
+                <w:bCs/>
+                <w:sz w:val="26"/>
+                <w:szCs w:val="26"/>
+                <w:rtl/>
+                <w:lang w:bidi="ar-EG"/>
+              </w:rPr>
+              <w:t>التوقيـــــــــــــــع</w:t>
+            </w:r>
+          </w:p>
+        </w:tc>
+      </w:tr>
+      <w:tr>
+        <w:tblPrEx>
+          <w:tblBorders>
+            <w:top w:val="single" w:sz="4" w:space="0" w:color="auto"/>
+            <w:left w:val="single" w:sz="4" w:space="0" w:color="auto"/>
+            <w:bottom w:val="single" w:sz="4" w:space="0" w:color="auto"/>
+            <w:right w:val="single" w:sz="4" w:space="0" w:color="auto"/>
+            <w:insideH w:val="single" w:sz="4" w:space="0" w:color="auto"/>
+            <w:insideV w:val="single" w:sz="4" w:space="0" w:color="auto"/>
+          </w:tblBorders>
+        </w:tblPrEx>
+        <w:trPr>
+          <w:gridBefore w:val="1"/>
+          <w:wBefore w:w="115" w:type="dxa"/>
+          <w:trHeight w:val="340"/>
+        </w:trPr>
+        <w:tc>
+          <w:tcPr>
+            <w:tcW w:w="4820" w:type="dxa"/>
+            <w:gridSpan w:val="2"/>
+          </w:tcPr>
+          <w:p>
+            <w:pPr>
+              <w:bidi/>
+              <w:spacing w:line="120" w:lineRule="auto"/>
+              <w:ind w:right="-709"/>
+              <w:rPr>
+                <w:rFonts w:ascii="Simplified Arabic" w:hAnsi="Simplified Arabic" w:cs="Simplified Arabic"/>
+                <w:sz w:val="26"/>
+                <w:szCs w:val="26"/>
+                <w:rtl/>
+                <w:lang w:bidi="ar-EG"/>
+              </w:rPr>
+            </w:pPr>
+          </w:p>
+        </w:tc>
+        <w:tc>
+          <w:tcPr>
+            <w:tcW w:w="4962" w:type="dxa"/>
+            <w:gridSpan w:val="3"/>
+          </w:tcPr>
+          <w:p>
+            <w:pPr>
+              <w:bidi/>
+              <w:spacing w:line="120" w:lineRule="auto"/>
+              <w:ind w:right="-709"/>
+              <w:rPr>
+                <w:rFonts w:ascii="Simplified Arabic" w:hAnsi="Simplified Arabic" w:cs="Simplified Arabic"/>
+                <w:sz w:val="26"/>
+                <w:szCs w:val="26"/>
+                <w:rtl/>
+                <w:lang w:bidi="ar-EG"/>
+              </w:rPr>
+            </w:pPr>
+          </w:p>
+        </w:tc>
+      </w:tr>
+      <w:tr>
+        <w:tblPrEx>
+          <w:tblBorders>
+            <w:top w:val="single" w:sz="4" w:space="0" w:color="auto"/>
+            <w:left w:val="single" w:sz="4" w:space="0" w:color="auto"/>
+            <w:bottom w:val="single" w:sz="4" w:space="0" w:color="auto"/>
+            <w:right w:val="single" w:sz="4" w:space="0" w:color="auto"/>
+            <w:insideH w:val="single" w:sz="4" w:space="0" w:color="auto"/>
+            <w:insideV w:val="single" w:sz="4" w:space="0" w:color="auto"/>
+          </w:tblBorders>
+        </w:tblPrEx>
+        <w:trPr>
+          <w:gridBefore w:val="1"/>
+          <w:wBefore w:w="115" w:type="dxa"/>
+          <w:trHeight w:val="340"/>
+        </w:trPr>
+        <w:tc>
+          <w:tcPr>
+            <w:tcW w:w="4820" w:type="dxa"/>
+            <w:gridSpan w:val="2"/>
+          </w:tcPr>
+          <w:p>
+            <w:pPr>
+              <w:bidi/>
+              <w:spacing w:line="120" w:lineRule="auto"/>
+              <w:ind w:right="-709"/>
+              <w:rPr>
+                <w:rFonts w:ascii="Simplified Arabic" w:hAnsi="Simplified Arabic" w:cs="Simplified Arabic"/>
+                <w:sz w:val="26"/>
+                <w:szCs w:val="26"/>
+                <w:rtl/>
+                <w:lang w:bidi="ar-EG"/>
+              </w:rPr>
+            </w:pPr>
+          </w:p>
+        </w:tc>
+        <w:tc>
+          <w:tcPr>
+            <w:tcW w:w="4962" w:type="dxa"/>
+            <w:gridSpan w:val="3"/>
+          </w:tcPr>
+          <w:p>
+            <w:pPr>
+              <w:bidi/>
+              <w:spacing w:line="120" w:lineRule="auto"/>
+              <w:ind w:right="-709"/>
+              <w:rPr>
+                <w:rFonts w:ascii="Simplified Arabic" w:hAnsi="Simplified Arabic" w:cs="Simplified Arabic"/>
+                <w:sz w:val="26"/>
+                <w:szCs w:val="26"/>
+                <w:rtl/>
+                <w:lang w:bidi="ar-EG"/>
+              </w:rPr>
+            </w:pPr>
+          </w:p>
+        </w:tc>
+      </w:tr>
+      <w:tr>
+        <w:tblPrEx>
+          <w:tblBorders>
+            <w:top w:val="single" w:sz="4" w:space="0" w:color="auto"/>
+            <w:left w:val="single" w:sz="4" w:space="0" w:color="auto"/>
+            <w:bottom w:val="single" w:sz="4" w:space="0" w:color="auto"/>
+            <w:right w:val="single" w:sz="4" w:space="0" w:color="auto"/>
+            <w:insideH w:val="single" w:sz="4" w:space="0" w:color="auto"/>
+            <w:insideV w:val="single" w:sz="4" w:space="0" w:color="auto"/>
+          </w:tblBorders>
+        </w:tblPrEx>
+        <w:trPr>
+          <w:gridBefore w:val="1"/>
+          <w:wBefore w:w="115" w:type="dxa"/>
+          <w:trHeight w:val="340"/>
+        </w:trPr>
+        <w:tc>
+          <w:tcPr>
+            <w:tcW w:w="4820" w:type="dxa"/>
+            <w:gridSpan w:val="2"/>
+          </w:tcPr>
+          <w:p>
+            <w:pPr>
+              <w:bidi/>
+              <w:spacing w:line="120" w:lineRule="auto"/>
+              <w:ind w:right="-709"/>
+              <w:rPr>
+                <w:rFonts w:ascii="Simplified Arabic" w:hAnsi="Simplified Arabic" w:cs="Simplified Arabic"/>
+                <w:sz w:val="26"/>
+                <w:szCs w:val="26"/>
+                <w:rtl/>
+                <w:lang w:bidi="ar-EG"/>
+              </w:rPr>
+            </w:pPr>
+          </w:p>
+        </w:tc>
+        <w:tc>
+          <w:tcPr>
+            <w:tcW w:w="4962" w:type="dxa"/>
+            <w:gridSpan w:val="3"/>
+          </w:tcPr>
+          <w:p>
+            <w:pPr>
+              <w:bidi/>
+              <w:spacing w:line="120" w:lineRule="auto"/>
+              <w:ind w:right="-709"/>
+              <w:rPr>
+                <w:rFonts w:ascii="Simplified Arabic" w:hAnsi="Simplified Arabic" w:cs="Simplified Arabic"/>
+                <w:sz w:val="26"/>
+                <w:szCs w:val="26"/>
+                <w:rtl/>
+                <w:lang w:bidi="ar-EG"/>
+              </w:rPr>
+            </w:pPr>
+          </w:p>
+        </w:tc>
+      </w:tr>
+      <w:tr>
+        <w:tblPrEx>
+          <w:tblBorders>
+            <w:top w:val="single" w:sz="4" w:space="0" w:color="auto"/>
+            <w:left w:val="single" w:sz="4" w:space="0" w:color="auto"/>
+            <w:bottom w:val="single" w:sz="4" w:space="0" w:color="auto"/>
+            <w:right w:val="single" w:sz="4" w:space="0" w:color="auto"/>
+            <w:insideH w:val="single" w:sz="4" w:space="0" w:color="auto"/>
+            <w:insideV w:val="single" w:sz="4" w:space="0" w:color="auto"/>
+          </w:tblBorders>
+        </w:tblPrEx>
+        <w:trPr>
+          <w:gridBefore w:val="1"/>
+          <w:wBefore w:w="115" w:type="dxa"/>
+          <w:trHeight w:val="340"/>
+        </w:trPr>
+        <w:tc>
+          <w:tcPr>
+            <w:tcW w:w="4820" w:type="dxa"/>
+            <w:gridSpan w:val="2"/>
+          </w:tcPr>
+          <w:p>
+            <w:pPr>
+              <w:bidi/>
+              <w:spacing w:line="120" w:lineRule="auto"/>
+              <w:ind w:right="-709"/>
+              <w:rPr>
+                <w:rFonts w:ascii="Simplified Arabic" w:hAnsi="Simplified Arabic" w:cs="Simplified Arabic"/>
+                <w:sz w:val="26"/>
+                <w:szCs w:val="26"/>
+                <w:rtl/>
+                <w:lang w:bidi="ar-EG"/>
+              </w:rPr>
+            </w:pPr>
+          </w:p>
+        </w:tc>
+        <w:tc>
+          <w:tcPr>
+            <w:tcW w:w="4962" w:type="dxa"/>
+            <w:gridSpan w:val="3"/>
+          </w:tcPr>
+          <w:p>
+            <w:pPr>
+              <w:bidi/>
+              <w:spacing w:line="120" w:lineRule="auto"/>
+              <w:ind w:right="-709"/>
+              <w:rPr>
+                <w:rFonts w:ascii="Simplified Arabic" w:hAnsi="Simplified Arabic" w:cs="Simplified Arabic"/>
+                <w:sz w:val="26"/>
+                <w:szCs w:val="26"/>
+                <w:rtl/>
+                <w:lang w:bidi="ar-EG"/>
+              </w:rPr>
+            </w:pPr>
+          </w:p>
+        </w:tc>
+      </w:tr>
+    </w:tbl>
+    <w:p>
+      <w:pPr>
+        <w:bidi/>
+        <w:rPr>
+          <w:sz w:val="26"/>
+          <w:szCs w:val="26"/>
+        </w:rPr>
+      </w:pPr>
     </w:p>
     <w:sectPr>
-      <w:headerReference w:type="default" r:id="rId8"/>
+      <w:headerReference w:type="default" r:id="rId9"/>
       <w:pgSz w:w="12240" w:h="15840" w:code="1"/>
-      <w:pgMar w:top="270" w:right="2030" w:bottom="144" w:left="1440" w:header="300" w:footer="0" w:gutter="0"/>
+      <w:pgMar w:top="432" w:right="2030" w:bottom="144" w:left="1440" w:header="576" w:footer="0" w:gutter="0"/>
       <w:cols w:space="720"/>
       <w:docGrid w:linePitch="360"/>
     </w:sectPr>
@@ -717,7 +3635,7 @@
 </file>
 
 <file path=word/endnotes.xml><?xml version="1.0" encoding="utf-8"?>
-<w:endnotes xmlns:wpc="http://schemas.microsoft.com/office/word/2010/wordprocessingCanvas" xmlns:cx="http://schemas.microsoft.com/office/drawing/2014/chartex" xmlns:cx1="http://schemas.microsoft.com/office/drawing/2015/9/8/chartex" xmlns:cx2="http://schemas.microsoft.com/office/drawing/2015/10/21/chartex" xmlns:cx3="http://schemas.microsoft.com/office/drawing/2016/5/9/chartex" xmlns:cx4="http://schemas.microsoft.com/office/drawing/2016/5/10/chartex" xmlns:cx5="http://schemas.microsoft.com/office/drawing/2016/5/11/chartex" xmlns:cx6="http://schemas.microsoft.com/office/drawing/2016/5/12/chartex" xmlns:cx7="http://schemas.microsoft.com/office/drawing/2016/5/13/chartex" xmlns:cx8="http://schemas.microsoft.com/office/drawing/2016/5/14/chartex" xmlns:mc="http://schemas.openxmlformats.org/markup-compatibility/2006" xmlns:aink="http://schemas.microsoft.com/office/drawing/2016/ink" xmlns:am3d="http://schemas.microsoft.com/office/drawing/2017/model3d" xmlns:o="urn:schemas-microsoft-com:office:office" xmlns:oel="http://schemas.microsoft.com/office/2019/extlst" xmlns:r="http://schemas.openxmlformats.org/officeDocument/2006/relationships" xmlns:m="http://schemas.openxmlformats.org/officeDocument/2006/math" xmlns:v="urn:schemas-microsoft-com:vml" xmlns:wp14="http://schemas.microsoft.com/office/word/2010/wordprocessingDrawing" xmlns:wp="http://schemas.openxmlformats.org/drawingml/2006/wordprocessingDrawing" xmlns:w10="urn:schemas-microsoft-com:office:word" xmlns:w="http://schemas.openxmlformats.org/wordprocessingml/2006/main" xmlns:w14="http://schemas.microsoft.com/office/word/2010/wordml" xmlns:w15="http://schemas.microsoft.com/office/word/2012/wordml" xmlns:w16cex="http://schemas.microsoft.com/office/word/2018/wordml/cex" xmlns:w16cid="http://schemas.microsoft.com/office/word/2016/wordml/cid" xmlns:w16="http://schemas.microsoft.com/office/word/2018/wordml" xmlns:w16du="http://schemas.microsoft.com/office/word/2023/wordml/word16du" xmlns:w16sdtdh="http://schemas.microsoft.com/office/word/2020/wordml/sdtdatahash" xmlns:w16sdtfl="http://schemas.microsoft.com/office/word/2024/wordml/sdtformatlock" xmlns:w16se="http://schemas.microsoft.com/office/word/2015/wordml/symex" xmlns:wpg="http://schemas.microsoft.com/office/word/2010/wordprocessingGroup" xmlns:wpi="http://schemas.microsoft.com/office/word/2010/wordprocessingInk" xmlns:wne="http://schemas.microsoft.com/office/word/2006/wordml" xmlns:wps="http://schemas.microsoft.com/office/word/2010/wordprocessingShape" mc:Ignorable="w14 w15 w16se w16cid w16 w16cex w16sdtdh w16sdtfl w16du wp14">
+<w:endnotes xmlns:wpc="http://schemas.microsoft.com/office/word/2010/wordprocessingCanvas" xmlns:cx="http://schemas.microsoft.com/office/drawing/2014/chartex" xmlns:cx1="http://schemas.microsoft.com/office/drawing/2015/9/8/chartex" xmlns:cx2="http://schemas.microsoft.com/office/drawing/2015/10/21/chartex" xmlns:cx3="http://schemas.microsoft.com/office/drawing/2016/5/9/chartex" xmlns:cx4="http://schemas.microsoft.com/office/drawing/2016/5/10/chartex" xmlns:cx5="http://schemas.microsoft.com/office/drawing/2016/5/11/chartex" xmlns:cx6="http://schemas.microsoft.com/office/drawing/2016/5/12/chartex" xmlns:cx7="http://schemas.microsoft.com/office/drawing/2016/5/13/chartex" xmlns:cx8="http://schemas.microsoft.com/office/drawing/2016/5/14/chartex" xmlns:mc="http://schemas.openxmlformats.org/markup-compatibility/2006" xmlns:aink="http://schemas.microsoft.com/office/drawing/2016/ink" xmlns:am3d="http://schemas.microsoft.com/office/drawing/2017/model3d" xmlns:o="urn:schemas-microsoft-com:office:office" xmlns:oel="http://schemas.microsoft.com/office/2019/extlst" xmlns:r="http://schemas.openxmlformats.org/officeDocument/2006/relationships" xmlns:m="http://schemas.openxmlformats.org/officeDocument/2006/math" xmlns:v="urn:schemas-microsoft-com:vml" xmlns:wp14="http://schemas.microsoft.com/office/word/2010/wordprocessingDrawing" xmlns:wp="http://schemas.openxmlformats.org/drawingml/2006/wordprocessingDrawing" xmlns:w10="urn:schemas-microsoft-com:office:word" xmlns:w="http://schemas.openxmlformats.org/wordprocessingml/2006/main" xmlns:w14="http://schemas.microsoft.com/office/word/2010/wordml" xmlns:w15="http://schemas.microsoft.com/office/word/2012/wordml" xmlns:w16cei="http://schemas.microsoft.com/office/word/2026/wordml/cei" xmlns:w16cex="http://schemas.microsoft.com/office/word/2018/wordml/cex" xmlns:w16cid="http://schemas.microsoft.com/office/word/2016/wordml/cid" xmlns:w16="http://schemas.microsoft.com/office/word/2018/wordml" xmlns:w16du="http://schemas.microsoft.com/office/word/2023/wordml/word16du" xmlns:w16sdtdh="http://schemas.microsoft.com/office/word/2020/wordml/sdtdatahash" xmlns:w16sdtfl="http://schemas.microsoft.com/office/word/2024/wordml/sdtformatlock" xmlns:w16se="http://schemas.microsoft.com/office/word/2015/wordml/symex" xmlns:wpg="http://schemas.microsoft.com/office/word/2010/wordprocessingGroup" xmlns:wpi="http://schemas.microsoft.com/office/word/2010/wordprocessingInk" xmlns:wne="http://schemas.microsoft.com/office/word/2006/wordml" xmlns:wps="http://schemas.microsoft.com/office/word/2010/wordprocessingShape" mc:Ignorable="w14 w15 w16se w16cid w16 w16cex w16sdtdh w16sdtfl w16du wp14">
   <w:endnote w:type="separator" w:id="-1">
     <w:p>
       <w:r>
@@ -736,7 +3654,7 @@
 </file>
 
 <file path=word/footnotes.xml><?xml version="1.0" encoding="utf-8"?>
-<w:footnotes xmlns:wpc="http://schemas.microsoft.com/office/word/2010/wordprocessingCanvas" xmlns:cx="http://schemas.microsoft.com/office/drawing/2014/chartex" xmlns:cx1="http://schemas.microsoft.com/office/drawing/2015/9/8/chartex" xmlns:cx2="http://schemas.microsoft.com/office/drawing/2015/10/21/chartex" xmlns:cx3="http://schemas.microsoft.com/office/drawing/2016/5/9/chartex" xmlns:cx4="http://schemas.microsoft.com/office/drawing/2016/5/10/chartex" xmlns:cx5="http://schemas.microsoft.com/office/drawing/2016/5/11/chartex" xmlns:cx6="http://schemas.microsoft.com/office/drawing/2016/5/12/chartex" xmlns:cx7="http://schemas.microsoft.com/office/drawing/2016/5/13/chartex" xmlns:cx8="http://schemas.microsoft.com/office/drawing/2016/5/14/chartex" xmlns:mc="http://schemas.openxmlformats.org/markup-compatibility/2006" xmlns:aink="http://schemas.microsoft.com/office/drawing/2016/ink" xmlns:am3d="http://schemas.microsoft.com/office/drawing/2017/model3d" xmlns:o="urn:schemas-microsoft-com:office:office" xmlns:oel="http://schemas.microsoft.com/office/2019/extlst" xmlns:r="http://schemas.openxmlformats.org/officeDocument/2006/relationships" xmlns:m="http://schemas.openxmlformats.org/officeDocument/2006/math" xmlns:v="urn:schemas-microsoft-com:vml" xmlns:wp14="http://schemas.microsoft.com/office/word/2010/wordprocessingDrawing" xmlns:wp="http://schemas.openxmlformats.org/drawingml/2006/wordprocessingDrawing" xmlns:w10="urn:schemas-microsoft-com:office:word" xmlns:w="http://schemas.openxmlformats.org/wordprocessingml/2006/main" xmlns:w14="http://schemas.microsoft.com/office/word/2010/wordml" xmlns:w15="http://schemas.microsoft.com/office/word/2012/wordml" xmlns:w16cex="http://schemas.microsoft.com/office/word/2018/wordml/cex" xmlns:w16cid="http://schemas.microsoft.com/office/word/2016/wordml/cid" xmlns:w16="http://schemas.microsoft.com/office/word/2018/wordml" xmlns:w16du="http://schemas.microsoft.com/office/word/2023/wordml/word16du" xmlns:w16sdtdh="http://schemas.microsoft.com/office/word/2020/wordml/sdtdatahash" xmlns:w16sdtfl="http://schemas.microsoft.com/office/word/2024/wordml/sdtformatlock" xmlns:w16se="http://schemas.microsoft.com/office/word/2015/wordml/symex" xmlns:wpg="http://schemas.microsoft.com/office/word/2010/wordprocessingGroup" xmlns:wpi="http://schemas.microsoft.com/office/word/2010/wordprocessingInk" xmlns:wne="http://schemas.microsoft.com/office/word/2006/wordml" xmlns:wps="http://schemas.microsoft.com/office/word/2010/wordprocessingShape" mc:Ignorable="w14 w15 w16se w16cid w16 w16cex w16sdtdh w16sdtfl w16du wp14">
+<w:footnotes xmlns:wpc="http://schemas.microsoft.com/office/word/2010/wordprocessingCanvas" xmlns:cx="http://schemas.microsoft.com/office/drawing/2014/chartex" xmlns:cx1="http://schemas.microsoft.com/office/drawing/2015/9/8/chartex" xmlns:cx2="http://schemas.microsoft.com/office/drawing/2015/10/21/chartex" xmlns:cx3="http://schemas.microsoft.com/office/drawing/2016/5/9/chartex" xmlns:cx4="http://schemas.microsoft.com/office/drawing/2016/5/10/chartex" xmlns:cx5="http://schemas.microsoft.com/office/drawing/2016/5/11/chartex" xmlns:cx6="http://schemas.microsoft.com/office/drawing/2016/5/12/chartex" xmlns:cx7="http://schemas.microsoft.com/office/drawing/2016/5/13/chartex" xmlns:cx8="http://schemas.microsoft.com/office/drawing/2016/5/14/chartex" xmlns:mc="http://schemas.openxmlformats.org/markup-compatibility/2006" xmlns:aink="http://schemas.microsoft.com/office/drawing/2016/ink" xmlns:am3d="http://schemas.microsoft.com/office/drawing/2017/model3d" xmlns:o="urn:schemas-microsoft-com:office:office" xmlns:oel="http://schemas.microsoft.com/office/2019/extlst" xmlns:r="http://schemas.openxmlformats.org/officeDocument/2006/relationships" xmlns:m="http://schemas.openxmlformats.org/officeDocument/2006/math" xmlns:v="urn:schemas-microsoft-com:vml" xmlns:wp14="http://schemas.microsoft.com/office/word/2010/wordprocessingDrawing" xmlns:wp="http://schemas.openxmlformats.org/drawingml/2006/wordprocessingDrawing" xmlns:w10="urn:schemas-microsoft-com:office:word" xmlns:w="http://schemas.openxmlformats.org/wordprocessingml/2006/main" xmlns:w14="http://schemas.microsoft.com/office/word/2010/wordml" xmlns:w15="http://schemas.microsoft.com/office/word/2012/wordml" xmlns:w16cei="http://schemas.microsoft.com/office/word/2026/wordml/cei" xmlns:w16cex="http://schemas.microsoft.com/office/word/2018/wordml/cex" xmlns:w16cid="http://schemas.microsoft.com/office/word/2016/wordml/cid" xmlns:w16="http://schemas.microsoft.com/office/word/2018/wordml" xmlns:w16du="http://schemas.microsoft.com/office/word/2023/wordml/word16du" xmlns:w16sdtdh="http://schemas.microsoft.com/office/word/2020/wordml/sdtdatahash" xmlns:w16sdtfl="http://schemas.microsoft.com/office/word/2024/wordml/sdtformatlock" xmlns:w16se="http://schemas.microsoft.com/office/word/2015/wordml/symex" xmlns:wpg="http://schemas.microsoft.com/office/word/2010/wordprocessingGroup" xmlns:wpi="http://schemas.microsoft.com/office/word/2010/wordprocessingInk" xmlns:wne="http://schemas.microsoft.com/office/word/2006/wordml" xmlns:wps="http://schemas.microsoft.com/office/word/2010/wordprocessingShape" mc:Ignorable="w14 w15 w16se w16cid w16 w16cex w16sdtdh w16sdtfl w16du wp14">
   <w:footnote w:type="separator" w:id="-1">
     <w:p>
       <w:r>
@@ -755,7 +3673,7 @@
 </file>
 
 <file path=word/header1.xml><?xml version="1.0" encoding="utf-8"?>
-<w:hdr xmlns:wpc="http://schemas.microsoft.com/office/word/2010/wordprocessingCanvas" xmlns:cx="http://schemas.microsoft.com/office/drawing/2014/chartex" xmlns:cx1="http://schemas.microsoft.com/office/drawing/2015/9/8/chartex" xmlns:cx2="http://schemas.microsoft.com/office/drawing/2015/10/21/chartex" xmlns:cx3="http://schemas.microsoft.com/office/drawing/2016/5/9/chartex" xmlns:cx4="http://schemas.microsoft.com/office/drawing/2016/5/10/chartex" xmlns:cx5="http://schemas.microsoft.com/office/drawing/2016/5/11/chartex" xmlns:cx6="http://schemas.microsoft.com/office/drawing/2016/5/12/chartex" xmlns:cx7="http://schemas.microsoft.com/office/drawing/2016/5/13/chartex" xmlns:cx8="http://schemas.microsoft.com/office/drawing/2016/5/14/chartex" xmlns:mc="http://schemas.openxmlformats.org/markup-compatibility/2006" xmlns:aink="http://schemas.microsoft.com/office/drawing/2016/ink" xmlns:am3d="http://schemas.microsoft.com/office/drawing/2017/model3d" xmlns:o="urn:schemas-microsoft-com:office:office" xmlns:oel="http://schemas.microsoft.com/office/2019/extlst" xmlns:r="http://schemas.openxmlformats.org/officeDocument/2006/relationships" xmlns:m="http://schemas.openxmlformats.org/officeDocument/2006/math" xmlns:v="urn:schemas-microsoft-com:vml" xmlns:wp14="http://schemas.microsoft.com/office/word/2010/wordprocessingDrawing" xmlns:wp="http://schemas.openxmlformats.org/drawingml/2006/wordprocessingDrawing" xmlns:w10="urn:schemas-microsoft-com:office:word" xmlns:w="http://schemas.openxmlformats.org/wordprocessingml/2006/main" xmlns:w14="http://schemas.microsoft.com/office/word/2010/wordml" xmlns:w15="http://schemas.microsoft.com/office/word/2012/wordml" xmlns:w16cex="http://schemas.microsoft.com/office/word/2018/wordml/cex" xmlns:w16cid="http://schemas.microsoft.com/office/word/2016/wordml/cid" xmlns:w16="http://schemas.microsoft.com/office/word/2018/wordml" xmlns:w16du="http://schemas.microsoft.com/office/word/2023/wordml/word16du" xmlns:w16sdtdh="http://schemas.microsoft.com/office/word/2020/wordml/sdtdatahash" xmlns:w16sdtfl="http://schemas.microsoft.com/office/word/2024/wordml/sdtformatlock" xmlns:w16se="http://schemas.microsoft.com/office/word/2015/wordml/symex" xmlns:wpg="http://schemas.microsoft.com/office/word/2010/wordprocessingGroup" xmlns:wpi="http://schemas.microsoft.com/office/word/2010/wordprocessingInk" xmlns:wne="http://schemas.microsoft.com/office/word/2006/wordml" xmlns:wps="http://schemas.microsoft.com/office/word/2010/wordprocessingShape" mc:Ignorable="w14 w15 w16se w16cid w16 w16cex w16sdtdh w16sdtfl w16du wp14">
+<w:hdr xmlns:wpc="http://schemas.microsoft.com/office/word/2010/wordprocessingCanvas" xmlns:cx="http://schemas.microsoft.com/office/drawing/2014/chartex" xmlns:cx1="http://schemas.microsoft.com/office/drawing/2015/9/8/chartex" xmlns:cx2="http://schemas.microsoft.com/office/drawing/2015/10/21/chartex" xmlns:cx3="http://schemas.microsoft.com/office/drawing/2016/5/9/chartex" xmlns:cx4="http://schemas.microsoft.com/office/drawing/2016/5/10/chartex" xmlns:cx5="http://schemas.microsoft.com/office/drawing/2016/5/11/chartex" xmlns:cx6="http://schemas.microsoft.com/office/drawing/2016/5/12/chartex" xmlns:cx7="http://schemas.microsoft.com/office/drawing/2016/5/13/chartex" xmlns:cx8="http://schemas.microsoft.com/office/drawing/2016/5/14/chartex" xmlns:mc="http://schemas.openxmlformats.org/markup-compatibility/2006" xmlns:aink="http://schemas.microsoft.com/office/drawing/2016/ink" xmlns:am3d="http://schemas.microsoft.com/office/drawing/2017/model3d" xmlns:o="urn:schemas-microsoft-com:office:office" xmlns:oel="http://schemas.microsoft.com/office/2019/extlst" xmlns:r="http://schemas.openxmlformats.org/officeDocument/2006/relationships" xmlns:m="http://schemas.openxmlformats.org/officeDocument/2006/math" xmlns:v="urn:schemas-microsoft-com:vml" xmlns:wp14="http://schemas.microsoft.com/office/word/2010/wordprocessingDrawing" xmlns:wp="http://schemas.openxmlformats.org/drawingml/2006/wordprocessingDrawing" xmlns:w10="urn:schemas-microsoft-com:office:word" xmlns:w="http://schemas.openxmlformats.org/wordprocessingml/2006/main" xmlns:w14="http://schemas.microsoft.com/office/word/2010/wordml" xmlns:w15="http://schemas.microsoft.com/office/word/2012/wordml" xmlns:w16cei="http://schemas.microsoft.com/office/word/2026/wordml/cei" xmlns:w16cex="http://schemas.microsoft.com/office/word/2018/wordml/cex" xmlns:w16cid="http://schemas.microsoft.com/office/word/2016/wordml/cid" xmlns:w16="http://schemas.microsoft.com/office/word/2018/wordml" xmlns:w16du="http://schemas.microsoft.com/office/word/2023/wordml/word16du" xmlns:w16sdtdh="http://schemas.microsoft.com/office/word/2020/wordml/sdtdatahash" xmlns:w16sdtfl="http://schemas.microsoft.com/office/word/2024/wordml/sdtformatlock" xmlns:w16se="http://schemas.microsoft.com/office/word/2015/wordml/symex" xmlns:wpg="http://schemas.microsoft.com/office/word/2010/wordprocessingGroup" xmlns:wpi="http://schemas.microsoft.com/office/word/2010/wordprocessingInk" xmlns:wne="http://schemas.microsoft.com/office/word/2006/wordml" xmlns:wps="http://schemas.microsoft.com/office/word/2010/wordprocessingShape" mc:Ignorable="w14 w15 w16se w16cid w16 w16cex w16sdtdh w16sdtfl w16du wp14">
   <w:tbl>
     <w:tblPr>
       <w:bidiVisual/>
@@ -783,38 +3701,56 @@
             <w:pStyle w:val="Header"/>
             <w:spacing w:before="160"/>
             <w:jc w:val="center"/>
-            <w:rPr>
-              <w:lang w:val="en-US" w:eastAsia="en-US"/>
-            </w:rPr>
           </w:pPr>
           <w:r>
             <w:rPr>
-              <w:lang w:val="en-US" w:eastAsia="en-US"/>
+              <w:noProof/>
             </w:rPr>
-            <w:pict w14:anchorId="17FC8DBC">
-              <v:shapetype id="_x0000_t75" coordsize="21600,21600" o:spt="75" o:preferrelative="t" path="m@4@5l@4@11@9@11@9@5xe" filled="f" stroked="f">
-                <v:stroke joinstyle="miter"/>
-                <v:formulas>
-                  <v:f eqn="if lineDrawn pixelLineWidth 0"/>
-                  <v:f eqn="sum @0 1 0"/>
-                  <v:f eqn="sum 0 0 @1"/>
-                  <v:f eqn="prod @2 1 2"/>
-                  <v:f eqn="prod @3 21600 pixelWidth"/>
-                  <v:f eqn="prod @3 21600 pixelHeight"/>
-                  <v:f eqn="sum @0 0 1"/>
-                  <v:f eqn="prod @6 1 2"/>
-                  <v:f eqn="prod @7 21600 pixelWidth"/>
-                  <v:f eqn="sum @8 21600 0"/>
-                  <v:f eqn="prod @7 21600 pixelHeight"/>
-                  <v:f eqn="sum @10 21600 0"/>
-                </v:formulas>
-                <v:path o:extrusionok="f" gradientshapeok="t" o:connecttype="rect"/>
-                <o:lock v:ext="edit" aspectratio="t"/>
-              </v:shapetype>
-              <v:shape id="_x0000_i1025" type="#_x0000_t75" style="width:43.2pt;height:48.6pt">
-                <v:imagedata r:id="rId1" o:title="gama_logo_color1"/>
-              </v:shape>
-            </w:pict>
+            <w:drawing>
+              <wp:inline distT="0" distB="0" distL="0" distR="0" wp14:anchorId="488E89BD" wp14:editId="1F46F3C0">
+                <wp:extent cx="552450" cy="619125"/>
+                <wp:effectExtent l="19050" t="0" r="0" b="0"/>
+                <wp:docPr id="1" name="Picture 1" descr="gama_logo_color1"/>
+                <wp:cNvGraphicFramePr>
+                  <a:graphicFrameLocks xmlns:a="http://schemas.openxmlformats.org/drawingml/2006/main" noChangeAspect="1"/>
+                </wp:cNvGraphicFramePr>
+                <a:graphic xmlns:a="http://schemas.openxmlformats.org/drawingml/2006/main">
+                  <a:graphicData uri="http://schemas.openxmlformats.org/drawingml/2006/picture">
+                    <pic:pic xmlns:pic="http://schemas.openxmlformats.org/drawingml/2006/picture">
+                      <pic:nvPicPr>
+                        <pic:cNvPr id="0" name="Picture 1" descr="gama_logo_color1"/>
+                        <pic:cNvPicPr>
+                          <a:picLocks noChangeAspect="1" noChangeArrowheads="1"/>
+                        </pic:cNvPicPr>
+                      </pic:nvPicPr>
+                      <pic:blipFill>
+                        <a:blip r:embed="rId1"/>
+                        <a:srcRect/>
+                        <a:stretch>
+                          <a:fillRect/>
+                        </a:stretch>
+                      </pic:blipFill>
+                      <pic:spPr bwMode="auto">
+                        <a:xfrm>
+                          <a:off x="0" y="0"/>
+                          <a:ext cx="552450" cy="619125"/>
+                        </a:xfrm>
+                        <a:prstGeom prst="rect">
+                          <a:avLst/>
+                        </a:prstGeom>
+                        <a:noFill/>
+                        <a:ln w="9525">
+                          <a:noFill/>
+                          <a:miter lim="800000"/>
+                          <a:headEnd/>
+                          <a:tailEnd/>
+                        </a:ln>
+                      </pic:spPr>
+                    </pic:pic>
+                  </a:graphicData>
+                </a:graphic>
+              </wp:inline>
+            </w:drawing>
           </w:r>
         </w:p>
         <w:p>
@@ -825,7 +3761,7 @@
               <w:rFonts w:cs="PT Bold Heading"/>
               <w:sz w:val="16"/>
               <w:szCs w:val="16"/>
-              <w:lang w:val="en-US" w:eastAsia="en-US" w:bidi="ar-EG"/>
+              <w:lang w:bidi="ar-EG"/>
             </w:rPr>
           </w:pPr>
         </w:p>
@@ -907,7 +3843,6 @@
               <w:rFonts w:cs="Simplified Arabic"/>
               <w:b/>
               <w:bCs/>
-              <w:lang w:val="en-US" w:eastAsia="en-US"/>
             </w:rPr>
           </w:pPr>
           <w:r>
@@ -1096,20 +4031,59 @@
               <w:rFonts w:cs="Monotype Koufi"/>
               <w:szCs w:val="36"/>
               <w:rtl/>
-              <w:lang w:val="en-US" w:eastAsia="en-US"/>
             </w:rPr>
           </w:pPr>
           <w:r>
             <w:rPr>
               <w:rFonts w:cs="Monotype Koufi"/>
+              <w:noProof/>
               <w:szCs w:val="36"/>
-              <w:lang w:val="en-US" w:eastAsia="en-US"/>
             </w:rPr>
-            <w:pict w14:anchorId="4ED6256F">
-              <v:shape id="_x0000_i1026" type="#_x0000_t75" style="width:54pt;height:52.2pt">
-                <v:imagedata r:id="rId2" o:title="old_logo_color"/>
-              </v:shape>
-            </w:pict>
+            <w:drawing>
+              <wp:inline distT="0" distB="0" distL="0" distR="0" wp14:anchorId="0001C94C" wp14:editId="5F941318">
+                <wp:extent cx="685800" cy="666750"/>
+                <wp:effectExtent l="19050" t="0" r="0" b="0"/>
+                <wp:docPr id="2" name="Picture 2" descr="old_logo_color"/>
+                <wp:cNvGraphicFramePr>
+                  <a:graphicFrameLocks xmlns:a="http://schemas.openxmlformats.org/drawingml/2006/main" noChangeAspect="1"/>
+                </wp:cNvGraphicFramePr>
+                <a:graphic xmlns:a="http://schemas.openxmlformats.org/drawingml/2006/main">
+                  <a:graphicData uri="http://schemas.openxmlformats.org/drawingml/2006/picture">
+                    <pic:pic xmlns:pic="http://schemas.openxmlformats.org/drawingml/2006/picture">
+                      <pic:nvPicPr>
+                        <pic:cNvPr id="0" name="Picture 2" descr="old_logo_color"/>
+                        <pic:cNvPicPr>
+                          <a:picLocks noChangeAspect="1" noChangeArrowheads="1"/>
+                        </pic:cNvPicPr>
+                      </pic:nvPicPr>
+                      <pic:blipFill>
+                        <a:blip r:embed="rId2"/>
+                        <a:srcRect/>
+                        <a:stretch>
+                          <a:fillRect/>
+                        </a:stretch>
+                      </pic:blipFill>
+                      <pic:spPr bwMode="auto">
+                        <a:xfrm>
+                          <a:off x="0" y="0"/>
+                          <a:ext cx="685800" cy="666750"/>
+                        </a:xfrm>
+                        <a:prstGeom prst="rect">
+                          <a:avLst/>
+                        </a:prstGeom>
+                        <a:noFill/>
+                        <a:ln w="9525">
+                          <a:noFill/>
+                          <a:miter lim="800000"/>
+                          <a:headEnd/>
+                          <a:tailEnd/>
+                        </a:ln>
+                      </pic:spPr>
+                    </pic:pic>
+                  </a:graphicData>
+                </a:graphic>
+              </wp:inline>
+            </w:drawing>
           </w:r>
         </w:p>
       </w:tc>
@@ -1118,16 +4092,13 @@
   <w:p>
     <w:pPr>
       <w:pStyle w:val="Header"/>
-      <w:rPr>
-        <w:lang w:val="en-US"/>
-      </w:rPr>
     </w:pPr>
   </w:p>
 </w:hdr>
 </file>
 
 <file path=word/numbering.xml><?xml version="1.0" encoding="utf-8"?>
-<w:numbering xmlns:wpc="http://schemas.microsoft.com/office/word/2010/wordprocessingCanvas" xmlns:cx="http://schemas.microsoft.com/office/drawing/2014/chartex" xmlns:cx1="http://schemas.microsoft.com/office/drawing/2015/9/8/chartex" xmlns:cx2="http://schemas.microsoft.com/office/drawing/2015/10/21/chartex" xmlns:cx3="http://schemas.microsoft.com/office/drawing/2016/5/9/chartex" xmlns:cx4="http://schemas.microsoft.com/office/drawing/2016/5/10/chartex" xmlns:cx5="http://schemas.microsoft.com/office/drawing/2016/5/11/chartex" xmlns:cx6="http://schemas.microsoft.com/office/drawing/2016/5/12/chartex" xmlns:cx7="http://schemas.microsoft.com/office/drawing/2016/5/13/chartex" xmlns:cx8="http://schemas.microsoft.com/office/drawing/2016/5/14/chartex" xmlns:mc="http://schemas.openxmlformats.org/markup-compatibility/2006" xmlns:aink="http://schemas.microsoft.com/office/drawing/2016/ink" xmlns:am3d="http://schemas.microsoft.com/office/drawing/2017/model3d" xmlns:o="urn:schemas-microsoft-com:office:office" xmlns:oel="http://schemas.microsoft.com/office/2019/extlst" xmlns:r="http://schemas.openxmlformats.org/officeDocument/2006/relationships" xmlns:m="http://schemas.openxmlformats.org/officeDocument/2006/math" xmlns:v="urn:schemas-microsoft-com:vml" xmlns:wp14="http://schemas.microsoft.com/office/word/2010/wordprocessingDrawing" xmlns:wp="http://schemas.openxmlformats.org/drawingml/2006/wordprocessingDrawing" xmlns:w10="urn:schemas-microsoft-com:office:word" xmlns:w="http://schemas.openxmlformats.org/wordprocessingml/2006/main" xmlns:w14="http://schemas.microsoft.com/office/word/2010/wordml" xmlns:w15="http://schemas.microsoft.com/office/word/2012/wordml" xmlns:w16cex="http://schemas.microsoft.com/office/word/2018/wordml/cex" xmlns:w16cid="http://schemas.microsoft.com/office/word/2016/wordml/cid" xmlns:w16="http://schemas.microsoft.com/office/word/2018/wordml" xmlns:w16du="http://schemas.microsoft.com/office/word/2023/wordml/word16du" xmlns:w16sdtdh="http://schemas.microsoft.com/office/word/2020/wordml/sdtdatahash" xmlns:w16sdtfl="http://schemas.microsoft.com/office/word/2024/wordml/sdtformatlock" xmlns:w16se="http://schemas.microsoft.com/office/word/2015/wordml/symex" xmlns:wpg="http://schemas.microsoft.com/office/word/2010/wordprocessingGroup" xmlns:wpi="http://schemas.microsoft.com/office/word/2010/wordprocessingInk" xmlns:wne="http://schemas.microsoft.com/office/word/2006/wordml" xmlns:wps="http://schemas.microsoft.com/office/word/2010/wordprocessingShape" mc:Ignorable="w14 w15 w16se w16cid w16 w16cex w16sdtdh w16sdtfl w16du wp14">
+<w:numbering xmlns:wpc="http://schemas.microsoft.com/office/word/2010/wordprocessingCanvas" xmlns:cx="http://schemas.microsoft.com/office/drawing/2014/chartex" xmlns:cx1="http://schemas.microsoft.com/office/drawing/2015/9/8/chartex" xmlns:cx2="http://schemas.microsoft.com/office/drawing/2015/10/21/chartex" xmlns:cx3="http://schemas.microsoft.com/office/drawing/2016/5/9/chartex" xmlns:cx4="http://schemas.microsoft.com/office/drawing/2016/5/10/chartex" xmlns:cx5="http://schemas.microsoft.com/office/drawing/2016/5/11/chartex" xmlns:cx6="http://schemas.microsoft.com/office/drawing/2016/5/12/chartex" xmlns:cx7="http://schemas.microsoft.com/office/drawing/2016/5/13/chartex" xmlns:cx8="http://schemas.microsoft.com/office/drawing/2016/5/14/chartex" xmlns:mc="http://schemas.openxmlformats.org/markup-compatibility/2006" xmlns:aink="http://schemas.microsoft.com/office/drawing/2016/ink" xmlns:am3d="http://schemas.microsoft.com/office/drawing/2017/model3d" xmlns:o="urn:schemas-microsoft-com:office:office" xmlns:oel="http://schemas.microsoft.com/office/2019/extlst" xmlns:r="http://schemas.openxmlformats.org/officeDocument/2006/relationships" xmlns:m="http://schemas.openxmlformats.org/officeDocument/2006/math" xmlns:v="urn:schemas-microsoft-com:vml" xmlns:wp14="http://schemas.microsoft.com/office/word/2010/wordprocessingDrawing" xmlns:wp="http://schemas.openxmlformats.org/drawingml/2006/wordprocessingDrawing" xmlns:w10="urn:schemas-microsoft-com:office:word" xmlns:w="http://schemas.openxmlformats.org/wordprocessingml/2006/main" xmlns:w14="http://schemas.microsoft.com/office/word/2010/wordml" xmlns:w15="http://schemas.microsoft.com/office/word/2012/wordml" xmlns:w16cei="http://schemas.microsoft.com/office/word/2026/wordml/cei" xmlns:w16cex="http://schemas.microsoft.com/office/word/2018/wordml/cex" xmlns:w16cid="http://schemas.microsoft.com/office/word/2016/wordml/cid" xmlns:w16="http://schemas.microsoft.com/office/word/2018/wordml" xmlns:w16du="http://schemas.microsoft.com/office/word/2023/wordml/word16du" xmlns:w16sdtdh="http://schemas.microsoft.com/office/word/2020/wordml/sdtdatahash" xmlns:w16sdtfl="http://schemas.microsoft.com/office/word/2024/wordml/sdtformatlock" xmlns:w16se="http://schemas.microsoft.com/office/word/2015/wordml/symex" xmlns:wpg="http://schemas.microsoft.com/office/word/2010/wordprocessingGroup" xmlns:wpi="http://schemas.microsoft.com/office/word/2010/wordprocessingInk" xmlns:wne="http://schemas.microsoft.com/office/word/2006/wordml" xmlns:wps="http://schemas.microsoft.com/office/word/2010/wordprocessingShape" mc:Ignorable="w14 w15 w16se w16cid w16 w16cex w16sdtdh w16sdtfl w16du wp14">
   <w:abstractNum w:abstractNumId="0" w15:restartNumberingAfterBreak="0">
     <w:nsid w:val="02645427"/>
     <w:multiLevelType w:val="hybridMultilevel"/>
@@ -5596,136 +8567,136 @@
       </w:pPr>
     </w:lvl>
   </w:abstractNum>
-  <w:num w:numId="1" w16cid:durableId="216017692">
+  <w:num w:numId="1" w16cid:durableId="1120956944">
     <w:abstractNumId w:val="30"/>
   </w:num>
-  <w:num w:numId="2" w16cid:durableId="267082072">
+  <w:num w:numId="2" w16cid:durableId="1230504829">
     <w:abstractNumId w:val="5"/>
   </w:num>
-  <w:num w:numId="3" w16cid:durableId="1387488123">
+  <w:num w:numId="3" w16cid:durableId="956526125">
     <w:abstractNumId w:val="13"/>
   </w:num>
-  <w:num w:numId="4" w16cid:durableId="718171692">
+  <w:num w:numId="4" w16cid:durableId="761725982">
     <w:abstractNumId w:val="32"/>
   </w:num>
-  <w:num w:numId="5" w16cid:durableId="1737968332">
+  <w:num w:numId="5" w16cid:durableId="1758286729">
     <w:abstractNumId w:val="4"/>
   </w:num>
-  <w:num w:numId="6" w16cid:durableId="839544530">
+  <w:num w:numId="6" w16cid:durableId="1681274923">
     <w:abstractNumId w:val="24"/>
   </w:num>
-  <w:num w:numId="7" w16cid:durableId="1076826035">
+  <w:num w:numId="7" w16cid:durableId="670567003">
     <w:abstractNumId w:val="20"/>
   </w:num>
-  <w:num w:numId="8" w16cid:durableId="2042514335">
+  <w:num w:numId="8" w16cid:durableId="204416778">
     <w:abstractNumId w:val="25"/>
   </w:num>
-  <w:num w:numId="9" w16cid:durableId="1611234429">
+  <w:num w:numId="9" w16cid:durableId="1395277017">
     <w:abstractNumId w:val="26"/>
   </w:num>
-  <w:num w:numId="10" w16cid:durableId="748888238">
+  <w:num w:numId="10" w16cid:durableId="2037268011">
     <w:abstractNumId w:val="0"/>
   </w:num>
-  <w:num w:numId="11" w16cid:durableId="1576627880">
+  <w:num w:numId="11" w16cid:durableId="1200122562">
     <w:abstractNumId w:val="38"/>
   </w:num>
-  <w:num w:numId="12" w16cid:durableId="1793479949">
+  <w:num w:numId="12" w16cid:durableId="2137482283">
     <w:abstractNumId w:val="29"/>
   </w:num>
-  <w:num w:numId="13" w16cid:durableId="511576322">
+  <w:num w:numId="13" w16cid:durableId="465272617">
     <w:abstractNumId w:val="10"/>
   </w:num>
-  <w:num w:numId="14" w16cid:durableId="1160581666">
+  <w:num w:numId="14" w16cid:durableId="326598546">
     <w:abstractNumId w:val="19"/>
   </w:num>
-  <w:num w:numId="15" w16cid:durableId="1357342495">
+  <w:num w:numId="15" w16cid:durableId="1959220630">
     <w:abstractNumId w:val="17"/>
   </w:num>
-  <w:num w:numId="16" w16cid:durableId="1426538090">
+  <w:num w:numId="16" w16cid:durableId="231083586">
     <w:abstractNumId w:val="3"/>
   </w:num>
-  <w:num w:numId="17" w16cid:durableId="727336805">
+  <w:num w:numId="17" w16cid:durableId="1371340992">
     <w:abstractNumId w:val="8"/>
   </w:num>
-  <w:num w:numId="18" w16cid:durableId="564680033">
+  <w:num w:numId="18" w16cid:durableId="7146405">
     <w:abstractNumId w:val="14"/>
   </w:num>
-  <w:num w:numId="19" w16cid:durableId="559512752">
+  <w:num w:numId="19" w16cid:durableId="1125080467">
     <w:abstractNumId w:val="6"/>
   </w:num>
-  <w:num w:numId="20" w16cid:durableId="854031503">
+  <w:num w:numId="20" w16cid:durableId="1212763033">
     <w:abstractNumId w:val="31"/>
   </w:num>
-  <w:num w:numId="21" w16cid:durableId="1364210016">
+  <w:num w:numId="21" w16cid:durableId="286548016">
     <w:abstractNumId w:val="21"/>
   </w:num>
-  <w:num w:numId="22" w16cid:durableId="1983386511">
+  <w:num w:numId="22" w16cid:durableId="1270508897">
     <w:abstractNumId w:val="16"/>
   </w:num>
-  <w:num w:numId="23" w16cid:durableId="114373957">
+  <w:num w:numId="23" w16cid:durableId="148863847">
     <w:abstractNumId w:val="1"/>
   </w:num>
-  <w:num w:numId="24" w16cid:durableId="1592003648">
+  <w:num w:numId="24" w16cid:durableId="124197312">
     <w:abstractNumId w:val="33"/>
   </w:num>
-  <w:num w:numId="25" w16cid:durableId="660083774">
+  <w:num w:numId="25" w16cid:durableId="2068994505">
     <w:abstractNumId w:val="40"/>
   </w:num>
-  <w:num w:numId="26" w16cid:durableId="1113937962">
+  <w:num w:numId="26" w16cid:durableId="1020814726">
     <w:abstractNumId w:val="35"/>
   </w:num>
-  <w:num w:numId="27" w16cid:durableId="515777386">
+  <w:num w:numId="27" w16cid:durableId="1109011912">
     <w:abstractNumId w:val="42"/>
   </w:num>
-  <w:num w:numId="28" w16cid:durableId="1338771606">
+  <w:num w:numId="28" w16cid:durableId="525675037">
     <w:abstractNumId w:val="28"/>
   </w:num>
-  <w:num w:numId="29" w16cid:durableId="234701971">
+  <w:num w:numId="29" w16cid:durableId="1559827424">
     <w:abstractNumId w:val="23"/>
   </w:num>
-  <w:num w:numId="30" w16cid:durableId="1852573006">
+  <w:num w:numId="30" w16cid:durableId="1916741027">
     <w:abstractNumId w:val="22"/>
   </w:num>
-  <w:num w:numId="31" w16cid:durableId="669524400">
+  <w:num w:numId="31" w16cid:durableId="983244291">
     <w:abstractNumId w:val="2"/>
   </w:num>
-  <w:num w:numId="32" w16cid:durableId="252934425">
+  <w:num w:numId="32" w16cid:durableId="1849904141">
     <w:abstractNumId w:val="12"/>
   </w:num>
-  <w:num w:numId="33" w16cid:durableId="411970399">
+  <w:num w:numId="33" w16cid:durableId="50623147">
     <w:abstractNumId w:val="36"/>
   </w:num>
-  <w:num w:numId="34" w16cid:durableId="197086324">
+  <w:num w:numId="34" w16cid:durableId="158884220">
     <w:abstractNumId w:val="39"/>
   </w:num>
-  <w:num w:numId="35" w16cid:durableId="1265456224">
+  <w:num w:numId="35" w16cid:durableId="940143594">
     <w:abstractNumId w:val="37"/>
   </w:num>
-  <w:num w:numId="36" w16cid:durableId="698817170">
+  <w:num w:numId="36" w16cid:durableId="2121099642">
     <w:abstractNumId w:val="11"/>
   </w:num>
-  <w:num w:numId="37" w16cid:durableId="3481856">
+  <w:num w:numId="37" w16cid:durableId="1139804992">
     <w:abstractNumId w:val="43"/>
   </w:num>
-  <w:num w:numId="38" w16cid:durableId="654797366">
+  <w:num w:numId="38" w16cid:durableId="274143168">
     <w:abstractNumId w:val="15"/>
   </w:num>
-  <w:num w:numId="39" w16cid:durableId="2019690250">
+  <w:num w:numId="39" w16cid:durableId="559360972">
     <w:abstractNumId w:val="9"/>
   </w:num>
-  <w:num w:numId="40" w16cid:durableId="775059656">
+  <w:num w:numId="40" w16cid:durableId="920481016">
     <w:abstractNumId w:val="27"/>
   </w:num>
-  <w:num w:numId="41" w16cid:durableId="1890847271">
+  <w:num w:numId="41" w16cid:durableId="297999259">
     <w:abstractNumId w:val="34"/>
   </w:num>
-  <w:num w:numId="42" w16cid:durableId="981157104">
+  <w:num w:numId="42" w16cid:durableId="1144397644">
     <w:abstractNumId w:val="41"/>
   </w:num>
-  <w:num w:numId="43" w16cid:durableId="1976175028">
+  <w:num w:numId="43" w16cid:durableId="1381050161">
     <w:abstractNumId w:val="7"/>
   </w:num>
-  <w:num w:numId="44" w16cid:durableId="1989700617">
+  <w:num w:numId="44" w16cid:durableId="24797977">
     <w:abstractNumId w:val="18"/>
   </w:num>
   <w:numIdMacAtCleanup w:val="39"/>
@@ -6082,6 +9053,7 @@
   <w:style w:type="character" w:default="1" w:styleId="DefaultParagraphFont">
     <w:name w:val="Default Paragraph Font"/>
     <w:uiPriority w:val="1"/>
+    <w:semiHidden/>
     <w:unhideWhenUsed/>
   </w:style>
   <w:style w:type="table" w:default="1" w:styleId="TableNormal">
@@ -6141,9 +9113,6 @@
         <w:tab w:val="right" w:pos="8640"/>
       </w:tabs>
     </w:pPr>
-    <w:rPr>
-      <w:lang w:val="x-none" w:eastAsia="x-none"/>
-    </w:rPr>
   </w:style>
   <w:style w:type="character" w:customStyle="1" w:styleId="HeaderChar">
     <w:name w:val="Header Char"/>
@@ -6167,9 +9136,6 @@
         <w:tab w:val="right" w:pos="8640"/>
       </w:tabs>
     </w:pPr>
-    <w:rPr>
-      <w:lang w:val="x-none" w:eastAsia="x-none"/>
-    </w:rPr>
   </w:style>
   <w:style w:type="character" w:customStyle="1" w:styleId="FooterChar">
     <w:name w:val="Footer Char"/>
@@ -6417,44 +9383,44 @@
         <a:sysClr val="window" lastClr="FFFFFF"/>
       </a:lt1>
       <a:dk2>
-        <a:srgbClr val="0E2841"/>
+        <a:srgbClr val="1F497D"/>
       </a:dk2>
       <a:lt2>
-        <a:srgbClr val="E8E8E8"/>
+        <a:srgbClr val="EEECE1"/>
       </a:lt2>
       <a:accent1>
-        <a:srgbClr val="156082"/>
+        <a:srgbClr val="4F81BD"/>
       </a:accent1>
       <a:accent2>
-        <a:srgbClr val="E97132"/>
+        <a:srgbClr val="C0504D"/>
       </a:accent2>
       <a:accent3>
-        <a:srgbClr val="196B24"/>
+        <a:srgbClr val="9BBB59"/>
       </a:accent3>
       <a:accent4>
-        <a:srgbClr val="0F9ED5"/>
+        <a:srgbClr val="8064A2"/>
       </a:accent4>
       <a:accent5>
-        <a:srgbClr val="A02B93"/>
+        <a:srgbClr val="4BACC6"/>
       </a:accent5>
       <a:accent6>
-        <a:srgbClr val="4EA72E"/>
+        <a:srgbClr val="F79646"/>
       </a:accent6>
       <a:hlink>
-        <a:srgbClr val="467886"/>
+        <a:srgbClr val="0000FF"/>
       </a:hlink>
       <a:folHlink>
-        <a:srgbClr val="96607D"/>
+        <a:srgbClr val="800080"/>
       </a:folHlink>
     </a:clrScheme>
     <a:fontScheme name="Office">
       <a:majorFont>
-        <a:latin typeface="Aptos Display" panose="02110004020202020204"/>
+        <a:latin typeface="Cambria"/>
         <a:ea typeface=""/>
         <a:cs typeface=""/>
-        <a:font script="Jpan" typeface="游ゴシック Light"/>
+        <a:font script="Jpan" typeface="ＭＳ ゴシック"/>
         <a:font script="Hang" typeface="맑은 고딕"/>
-        <a:font script="Hans" typeface="等线 Light"/>
+        <a:font script="Hans" typeface="宋体"/>
         <a:font script="Hant" typeface="新細明體"/>
         <a:font script="Arab" typeface="Times New Roman"/>
         <a:font script="Hebr" typeface="Times New Roman"/>
@@ -6481,32 +9447,14 @@
         <a:font script="Mong" typeface="Mongolian Baiti"/>
         <a:font script="Viet" typeface="Times New Roman"/>
         <a:font script="Uigh" typeface="Microsoft Uighur"/>
-        <a:font script="Geor" typeface="Sylfaen"/>
-        <a:font script="Armn" typeface="Arial"/>
-        <a:font script="Bugi" typeface="Leelawadee UI"/>
-        <a:font script="Bopo" typeface="Microsoft JhengHei"/>
-        <a:font script="Java" typeface="Javanese Text"/>
-        <a:font script="Lisu" typeface="Segoe UI"/>
-        <a:font script="Mymr" typeface="Myanmar Text"/>
-        <a:font script="Nkoo" typeface="Ebrima"/>
-        <a:font script="Olck" typeface="Nirmala UI"/>
-        <a:font script="Osma" typeface="Ebrima"/>
-        <a:font script="Phag" typeface="Phagspa"/>
-        <a:font script="Syrn" typeface="Estrangelo Edessa"/>
-        <a:font script="Syrj" typeface="Estrangelo Edessa"/>
-        <a:font script="Syre" typeface="Estrangelo Edessa"/>
-        <a:font script="Sora" typeface="Nirmala UI"/>
-        <a:font script="Tale" typeface="Microsoft Tai Le"/>
-        <a:font script="Talu" typeface="Microsoft New Tai Lue"/>
-        <a:font script="Tfng" typeface="Ebrima"/>
       </a:majorFont>
       <a:minorFont>
-        <a:latin typeface="Aptos" panose="02110004020202020204"/>
+        <a:latin typeface="Calibri"/>
         <a:ea typeface=""/>
         <a:cs typeface=""/>
-        <a:font script="Jpan" typeface="游明朝"/>
+        <a:font script="Jpan" typeface="ＭＳ 明朝"/>
         <a:font script="Hang" typeface="맑은 고딕"/>
-        <a:font script="Hans" typeface="等线"/>
+        <a:font script="Hans" typeface="宋体"/>
         <a:font script="Hant" typeface="新細明體"/>
         <a:font script="Arab" typeface="Arial"/>
         <a:font script="Hebr" typeface="Arial"/>
@@ -6533,24 +9481,6 @@
         <a:font script="Mong" typeface="Mongolian Baiti"/>
         <a:font script="Viet" typeface="Arial"/>
         <a:font script="Uigh" typeface="Microsoft Uighur"/>
-        <a:font script="Geor" typeface="Sylfaen"/>
-        <a:font script="Armn" typeface="Arial"/>
-        <a:font script="Bugi" typeface="Leelawadee UI"/>
-        <a:font script="Bopo" typeface="Microsoft JhengHei"/>
-        <a:font script="Java" typeface="Javanese Text"/>
-        <a:font script="Lisu" typeface="Segoe UI"/>
-        <a:font script="Mymr" typeface="Myanmar Text"/>
-        <a:font script="Nkoo" typeface="Ebrima"/>
-        <a:font script="Olck" typeface="Nirmala UI"/>
-        <a:font script="Osma" typeface="Ebrima"/>
-        <a:font script="Phag" typeface="Phagspa"/>
-        <a:font script="Syrn" typeface="Estrangelo Edessa"/>
-        <a:font script="Syrj" typeface="Estrangelo Edessa"/>
-        <a:font script="Syre" typeface="Estrangelo Edessa"/>
-        <a:font script="Sora" typeface="Nirmala UI"/>
-        <a:font script="Tale" typeface="Microsoft Tai Le"/>
-        <a:font script="Talu" typeface="Microsoft New Tai Lue"/>
-        <a:font script="Tfng" typeface="Ebrima"/>
       </a:minorFont>
     </a:fontScheme>
     <a:fmtScheme name="Office">
@@ -6562,162 +9492,166 @@
           <a:gsLst>
             <a:gs pos="0">
               <a:schemeClr val="phClr">
-                <a:lumMod val="110000"/>
-                <a:satMod val="105000"/>
-                <a:tint val="67000"/>
+                <a:tint val="50000"/>
+                <a:satMod val="300000"/>
               </a:schemeClr>
             </a:gs>
-            <a:gs pos="50000">
+            <a:gs pos="35000">
               <a:schemeClr val="phClr">
-                <a:lumMod val="105000"/>
-                <a:satMod val="103000"/>
-                <a:tint val="73000"/>
+                <a:tint val="37000"/>
+                <a:satMod val="300000"/>
               </a:schemeClr>
             </a:gs>
             <a:gs pos="100000">
               <a:schemeClr val="phClr">
-                <a:lumMod val="105000"/>
-                <a:satMod val="109000"/>
-                <a:tint val="81000"/>
+                <a:tint val="15000"/>
+                <a:satMod val="350000"/>
               </a:schemeClr>
             </a:gs>
           </a:gsLst>
-          <a:lin ang="5400000" scaled="0"/>
+          <a:lin ang="16200000" scaled="1"/>
         </a:gradFill>
         <a:gradFill rotWithShape="1">
           <a:gsLst>
             <a:gs pos="0">
               <a:schemeClr val="phClr">
-                <a:satMod val="103000"/>
-                <a:lumMod val="102000"/>
-                <a:tint val="94000"/>
+                <a:shade val="51000"/>
+                <a:satMod val="130000"/>
               </a:schemeClr>
             </a:gs>
-            <a:gs pos="50000">
+            <a:gs pos="80000">
               <a:schemeClr val="phClr">
-                <a:satMod val="110000"/>
-                <a:lumMod val="100000"/>
-                <a:shade val="100000"/>
+                <a:shade val="93000"/>
+                <a:satMod val="130000"/>
               </a:schemeClr>
             </a:gs>
             <a:gs pos="100000">
               <a:schemeClr val="phClr">
-                <a:lumMod val="99000"/>
-                <a:satMod val="120000"/>
-                <a:shade val="78000"/>
+                <a:shade val="94000"/>
+                <a:satMod val="135000"/>
               </a:schemeClr>
             </a:gs>
           </a:gsLst>
-          <a:lin ang="5400000" scaled="0"/>
+          <a:lin ang="16200000" scaled="0"/>
         </a:gradFill>
       </a:fillStyleLst>
       <a:lnStyleLst>
-        <a:ln w="12700" cap="flat" cmpd="sng" algn="ctr">
+        <a:ln w="9525" cap="flat" cmpd="sng" algn="ctr">
           <a:solidFill>
-            <a:schemeClr val="phClr"/>
+            <a:schemeClr val="phClr">
+              <a:shade val="95000"/>
+              <a:satMod val="105000"/>
+            </a:schemeClr>
           </a:solidFill>
           <a:prstDash val="solid"/>
-          <a:miter lim="800000"/>
-        </a:ln>
-        <a:ln w="19050" cap="flat" cmpd="sng" algn="ctr">
-          <a:solidFill>
-            <a:schemeClr val="phClr"/>
-          </a:solidFill>
-          <a:prstDash val="solid"/>
-          <a:miter lim="800000"/>
         </a:ln>
         <a:ln w="25400" cap="flat" cmpd="sng" algn="ctr">
           <a:solidFill>
             <a:schemeClr val="phClr"/>
           </a:solidFill>
           <a:prstDash val="solid"/>
-          <a:miter lim="800000"/>
+        </a:ln>
+        <a:ln w="38100" cap="flat" cmpd="sng" algn="ctr">
+          <a:solidFill>
+            <a:schemeClr val="phClr"/>
+          </a:solidFill>
+          <a:prstDash val="solid"/>
         </a:ln>
       </a:lnStyleLst>
       <a:effectStyleLst>
         <a:effectStyle>
-          <a:effectLst/>
-        </a:effectStyle>
-        <a:effectStyle>
-          <a:effectLst/>
+          <a:effectLst>
+            <a:outerShdw blurRad="40000" dist="20000" dir="5400000" rotWithShape="0">
+              <a:srgbClr val="000000">
+                <a:alpha val="38000"/>
+              </a:srgbClr>
+            </a:outerShdw>
+          </a:effectLst>
         </a:effectStyle>
         <a:effectStyle>
           <a:effectLst>
-            <a:outerShdw blurRad="57150" dist="19050" dir="5400000" algn="ctr" rotWithShape="0">
+            <a:outerShdw blurRad="40000" dist="23000" dir="5400000" rotWithShape="0">
               <a:srgbClr val="000000">
-                <a:alpha val="63000"/>
+                <a:alpha val="35000"/>
               </a:srgbClr>
             </a:outerShdw>
           </a:effectLst>
+        </a:effectStyle>
+        <a:effectStyle>
+          <a:effectLst>
+            <a:outerShdw blurRad="40000" dist="23000" dir="5400000" rotWithShape="0">
+              <a:srgbClr val="000000">
+                <a:alpha val="35000"/>
+              </a:srgbClr>
+            </a:outerShdw>
+          </a:effectLst>
+          <a:scene3d>
+            <a:camera prst="orthographicFront">
+              <a:rot lat="0" lon="0" rev="0"/>
+            </a:camera>
+            <a:lightRig rig="threePt" dir="t">
+              <a:rot lat="0" lon="0" rev="1200000"/>
+            </a:lightRig>
+          </a:scene3d>
+          <a:sp3d>
+            <a:bevelT w="63500" h="25400"/>
+          </a:sp3d>
         </a:effectStyle>
       </a:effectStyleLst>
       <a:bgFillStyleLst>
         <a:solidFill>
           <a:schemeClr val="phClr"/>
         </a:solidFill>
-        <a:solidFill>
-          <a:schemeClr val="phClr">
-            <a:tint val="95000"/>
-            <a:satMod val="170000"/>
-          </a:schemeClr>
-        </a:solidFill>
         <a:gradFill rotWithShape="1">
           <a:gsLst>
             <a:gs pos="0">
               <a:schemeClr val="phClr">
-                <a:tint val="93000"/>
-                <a:satMod val="150000"/>
-                <a:shade val="98000"/>
-                <a:lumMod val="102000"/>
+                <a:tint val="40000"/>
+                <a:satMod val="350000"/>
               </a:schemeClr>
             </a:gs>
-            <a:gs pos="50000">
+            <a:gs pos="40000">
               <a:schemeClr val="phClr">
-                <a:tint val="98000"/>
-                <a:satMod val="130000"/>
-                <a:shade val="90000"/>
-                <a:lumMod val="103000"/>
+                <a:tint val="45000"/>
+                <a:shade val="99000"/>
+                <a:satMod val="350000"/>
               </a:schemeClr>
             </a:gs>
             <a:gs pos="100000">
               <a:schemeClr val="phClr">
-                <a:shade val="63000"/>
-                <a:satMod val="120000"/>
+                <a:shade val="20000"/>
+                <a:satMod val="255000"/>
               </a:schemeClr>
             </a:gs>
           </a:gsLst>
-          <a:lin ang="5400000" scaled="0"/>
+          <a:path path="circle">
+            <a:fillToRect l="50000" t="-80000" r="50000" b="180000"/>
+          </a:path>
+        </a:gradFill>
+        <a:gradFill rotWithShape="1">
+          <a:gsLst>
+            <a:gs pos="0">
+              <a:schemeClr val="phClr">
+                <a:tint val="80000"/>
+                <a:satMod val="300000"/>
+              </a:schemeClr>
+            </a:gs>
+            <a:gs pos="100000">
+              <a:schemeClr val="phClr">
+                <a:shade val="30000"/>
+                <a:satMod val="200000"/>
+              </a:schemeClr>
+            </a:gs>
+          </a:gsLst>
+          <a:path path="circle">
+            <a:fillToRect l="50000" t="50000" r="50000" b="50000"/>
+          </a:path>
         </a:gradFill>
       </a:bgFillStyleLst>
     </a:fmtScheme>
   </a:themeElements>
-  <a:objectDefaults>
-    <a:lnDef>
-      <a:spPr/>
-      <a:bodyPr/>
-      <a:lstStyle/>
-      <a:style>
-        <a:lnRef idx="2">
-          <a:schemeClr val="accent1"/>
-        </a:lnRef>
-        <a:fillRef idx="0">
-          <a:schemeClr val="accent1"/>
-        </a:fillRef>
-        <a:effectRef idx="1">
-          <a:schemeClr val="accent1"/>
-        </a:effectRef>
-        <a:fontRef idx="minor">
-          <a:schemeClr val="tx1"/>
-        </a:fontRef>
-      </a:style>
-    </a:lnDef>
-  </a:objectDefaults>
+  <a:objectDefaults/>
   <a:extraClrSchemeLst/>
-  <a:extLst>
-    <a:ext uri="{05A4C25C-085E-4340-85A3-A5531E510DB2}">
-      <thm15:themeFamily xmlns:thm15="http://schemas.microsoft.com/office/thememl/2012/main" name="Office Theme" id="{2E142A2C-CD16-42D6-873A-C26D2A0506FA}" vid="{1BDDFF52-6CD6-40A5-AB3C-68EB2F1E4D0A}"/>
-    </a:ext>
-  </a:extLst>
 </a:theme>
 </file>
 
@@ -6726,15 +9660,9 @@
 </file>
 
 <file path=customXml/itemProps1.xml><?xml version="1.0" encoding="utf-8"?>
-<ds:datastoreItem xmlns:ds="http://schemas.openxmlformats.org/officeDocument/2006/customXml" ds:itemID="{1099F79A-C93B-4A78-ADE6-64F03CB49415}">
+<ds:datastoreItem xmlns:ds="http://schemas.openxmlformats.org/officeDocument/2006/customXml" ds:itemID="{BB4F1A25-D1CC-4618-B726-2910E5D7E0BB}">
   <ds:schemaRefs>
     <ds:schemaRef ds:uri="http://schemas.openxmlformats.org/officeDocument/2006/bibliography"/>
   </ds:schemaRefs>
 </ds:datastoreItem>
-</file>
-
-<file path=docMetadata/LabelInfo.xml><?xml version="1.0" encoding="utf-8"?>
-<clbl:labelList xmlns:clbl="http://schemas.microsoft.com/office/2020/mipLabelMetadata">
-  <clbl:label id="{9d258917-277f-42cd-a3cd-14c4e9ee58bc}" enabled="1" method="Standard" siteId="{38ae3bcd-9579-4fd4-adda-b42e1495d55a}" contentBits="0" removed="0"/>
-</clbl:labelList>
 </file>
</xml_diff>